<commit_message>
chore(release): bump to v1.0.44
</commit_message>
<xml_diff>
--- a/public/templates/contact-order.docx
+++ b/public/templates/contact-order.docx
@@ -6,7 +6,7 @@
       <w:tblPr>
         <w:tblW w:w="10080" w:type="dxa"/>
         <w:tblLayout w:type="fixed"/>
-        <w:jc w:val="center"/>
+        <w:jc w:val="right"/>
         <w:tblCellMar>
           <w:top w:w="0" w:type="dxa"/>
           <w:right w:w="0" w:type="dxa"/>
@@ -97,7 +97,7 @@
       <w:tblPr>
         <w:tblW w:w="10080" w:type="dxa"/>
         <w:tblLayout w:type="fixed"/>
-        <w:jc w:val="center"/>
+        <w:jc w:val="right"/>
         <w:tblCellMar>
           <w:top w:w="0" w:type="dxa"/>
           <w:right w:w="0" w:type="dxa"/>
@@ -682,7 +682,7 @@
       <w:tblPr>
         <w:tblW w:w="10080" w:type="dxa"/>
         <w:tblLayout w:type="fixed"/>
-        <w:jc w:val="center"/>
+        <w:jc w:val="right"/>
         <w:tblCellMar>
           <w:top w:w="0" w:type="dxa"/>
           <w:right w:w="0" w:type="dxa"/>
@@ -738,7 +738,7 @@
       <w:tblPr>
         <w:tblW w:w="10080" w:type="dxa"/>
         <w:tblLayout w:type="fixed"/>
-        <w:jc w:val="center"/>
+        <w:jc w:val="right"/>
         <w:tblCellMar>
           <w:top w:w="0" w:type="dxa"/>
           <w:right w:w="0" w:type="dxa"/>
@@ -1183,7 +1183,7 @@
       <w:tblPr>
         <w:tblW w:w="10080" w:type="dxa"/>
         <w:tblLayout w:type="fixed"/>
-        <w:jc w:val="center"/>
+        <w:jc w:val="right"/>
         <w:tblCellMar>
           <w:top w:w="0" w:type="dxa"/>
           <w:right w:w="0" w:type="dxa"/>
@@ -1239,7 +1239,7 @@
       <w:tblPr>
         <w:tblW w:w="10080" w:type="dxa"/>
         <w:tblLayout w:type="fixed"/>
-        <w:jc w:val="center"/>
+        <w:jc w:val="right"/>
         <w:tblCellMar>
           <w:top w:w="0" w:type="dxa"/>
           <w:right w:w="0" w:type="dxa"/>
@@ -1475,7 +1475,7 @@
       <w:tblPr>
         <w:tblW w:w="10080" w:type="dxa"/>
         <w:tblLayout w:type="fixed"/>
-        <w:jc w:val="center"/>
+        <w:jc w:val="right"/>
         <w:tblCellMar>
           <w:top w:w="0" w:type="dxa"/>
           <w:right w:w="0" w:type="dxa"/>
@@ -1531,7 +1531,7 @@
       <w:tblPr>
         <w:tblW w:w="10080" w:type="dxa"/>
         <w:tblLayout w:type="fixed"/>
-        <w:jc w:val="center"/>
+        <w:jc w:val="right"/>
         <w:tblCellMar>
           <w:top w:w="0" w:type="dxa"/>
           <w:right w:w="0" w:type="dxa"/>
@@ -1822,7 +1822,7 @@
           </w:tcPr>
           <w:p>
             <w:pPr>
-              <w:jc w:val="center"/>
+              <w:jc w:val="right"/>
               <w:bidi/>
               <w:spacing w:before="0" w:after="0"/>
             </w:pPr>
@@ -1855,7 +1855,7 @@
           </w:tcPr>
           <w:p>
             <w:pPr>
-              <w:jc w:val="center"/>
+              <w:jc w:val="right"/>
               <w:bidi/>
               <w:spacing w:before="0" w:after="0"/>
             </w:pPr>
@@ -1888,7 +1888,7 @@
           </w:tcPr>
           <w:p>
             <w:pPr>
-              <w:jc w:val="center"/>
+              <w:jc w:val="right"/>
               <w:bidi/>
               <w:spacing w:before="0" w:after="0"/>
             </w:pPr>
@@ -1921,7 +1921,7 @@
           </w:tcPr>
           <w:p>
             <w:pPr>
-              <w:jc w:val="center"/>
+              <w:jc w:val="right"/>
               <w:bidi/>
               <w:spacing w:before="0" w:after="0"/>
             </w:pPr>
@@ -1954,7 +1954,7 @@
           </w:tcPr>
           <w:p>
             <w:pPr>
-              <w:jc w:val="center"/>
+              <w:jc w:val="right"/>
               <w:bidi/>
               <w:spacing w:before="0" w:after="0"/>
             </w:pPr>
@@ -1987,7 +1987,7 @@
           </w:tcPr>
           <w:p>
             <w:pPr>
-              <w:jc w:val="center"/>
+              <w:jc w:val="right"/>
               <w:bidi/>
               <w:spacing w:before="0" w:after="0"/>
             </w:pPr>
@@ -2058,7 +2058,7 @@
           </w:tcPr>
           <w:p>
             <w:pPr>
-              <w:jc w:val="center"/>
+              <w:jc w:val="right"/>
               <w:bidi/>
               <w:spacing w:before="0" w:after="0"/>
             </w:pPr>
@@ -2091,7 +2091,7 @@
           </w:tcPr>
           <w:p>
             <w:pPr>
-              <w:jc w:val="center"/>
+              <w:jc w:val="right"/>
               <w:bidi/>
               <w:spacing w:before="0" w:after="0"/>
             </w:pPr>
@@ -2124,7 +2124,7 @@
           </w:tcPr>
           <w:p>
             <w:pPr>
-              <w:jc w:val="center"/>
+              <w:jc w:val="right"/>
               <w:bidi/>
               <w:spacing w:before="0" w:after="0"/>
             </w:pPr>
@@ -2157,7 +2157,7 @@
           </w:tcPr>
           <w:p>
             <w:pPr>
-              <w:jc w:val="center"/>
+              <w:jc w:val="right"/>
               <w:bidi/>
               <w:spacing w:before="0" w:after="0"/>
             </w:pPr>
@@ -2190,7 +2190,7 @@
           </w:tcPr>
           <w:p>
             <w:pPr>
-              <w:jc w:val="center"/>
+              <w:jc w:val="right"/>
               <w:bidi/>
               <w:spacing w:before="0" w:after="0"/>
             </w:pPr>
@@ -2223,7 +2223,7 @@
           </w:tcPr>
           <w:p>
             <w:pPr>
-              <w:jc w:val="center"/>
+              <w:jc w:val="right"/>
               <w:bidi/>
               <w:spacing w:before="0" w:after="0"/>
             </w:pPr>
@@ -2285,7 +2285,7 @@
       <w:tblPr>
         <w:tblW w:w="10080" w:type="dxa"/>
         <w:tblLayout w:type="fixed"/>
-        <w:jc w:val="center"/>
+        <w:jc w:val="right"/>
         <w:tblCellMar>
           <w:top w:w="0" w:type="dxa"/>
           <w:right w:w="0" w:type="dxa"/>
@@ -2341,7 +2341,7 @@
       <w:tblPr>
         <w:tblW w:w="10080" w:type="dxa"/>
         <w:tblLayout w:type="fixed"/>
-        <w:jc w:val="center"/>
+        <w:jc w:val="right"/>
         <w:tblCellMar>
           <w:top w:w="0" w:type="dxa"/>
           <w:right w:w="0" w:type="dxa"/>
@@ -2706,7 +2706,7 @@
           </w:tcPr>
           <w:p>
             <w:pPr>
-              <w:jc w:val="center"/>
+              <w:jc w:val="right"/>
               <w:bidi/>
               <w:spacing w:before="0" w:after="0"/>
             </w:pPr>
@@ -2739,7 +2739,7 @@
           </w:tcPr>
           <w:p>
             <w:pPr>
-              <w:jc w:val="center"/>
+              <w:jc w:val="right"/>
               <w:bidi/>
               <w:spacing w:before="0" w:after="0"/>
             </w:pPr>
@@ -2772,7 +2772,7 @@
           </w:tcPr>
           <w:p>
             <w:pPr>
-              <w:jc w:val="center"/>
+              <w:jc w:val="right"/>
               <w:bidi/>
               <w:spacing w:before="0" w:after="0"/>
             </w:pPr>
@@ -2805,7 +2805,7 @@
           </w:tcPr>
           <w:p>
             <w:pPr>
-              <w:jc w:val="center"/>
+              <w:jc w:val="right"/>
               <w:bidi/>
               <w:spacing w:before="0" w:after="0"/>
             </w:pPr>
@@ -2838,7 +2838,7 @@
           </w:tcPr>
           <w:p>
             <w:pPr>
-              <w:jc w:val="center"/>
+              <w:jc w:val="right"/>
               <w:bidi/>
               <w:spacing w:before="0" w:after="0"/>
             </w:pPr>
@@ -2871,7 +2871,7 @@
           </w:tcPr>
           <w:p>
             <w:pPr>
-              <w:jc w:val="center"/>
+              <w:jc w:val="right"/>
               <w:bidi/>
               <w:spacing w:before="0" w:after="0"/>
             </w:pPr>
@@ -2904,7 +2904,7 @@
           </w:tcPr>
           <w:p>
             <w:pPr>
-              <w:jc w:val="center"/>
+              <w:jc w:val="right"/>
               <w:bidi/>
               <w:spacing w:before="0" w:after="0"/>
             </w:pPr>
@@ -2937,7 +2937,7 @@
           </w:tcPr>
           <w:p>
             <w:pPr>
-              <w:jc w:val="center"/>
+              <w:jc w:val="right"/>
               <w:bidi/>
               <w:spacing w:before="0" w:after="0"/>
             </w:pPr>
@@ -3008,7 +3008,7 @@
           </w:tcPr>
           <w:p>
             <w:pPr>
-              <w:jc w:val="center"/>
+              <w:jc w:val="right"/>
               <w:bidi/>
               <w:spacing w:before="0" w:after="0"/>
             </w:pPr>
@@ -3041,7 +3041,7 @@
           </w:tcPr>
           <w:p>
             <w:pPr>
-              <w:jc w:val="center"/>
+              <w:jc w:val="right"/>
               <w:bidi/>
               <w:spacing w:before="0" w:after="0"/>
             </w:pPr>
@@ -3074,7 +3074,7 @@
           </w:tcPr>
           <w:p>
             <w:pPr>
-              <w:jc w:val="center"/>
+              <w:jc w:val="right"/>
               <w:bidi/>
               <w:spacing w:before="0" w:after="0"/>
             </w:pPr>
@@ -3107,7 +3107,7 @@
           </w:tcPr>
           <w:p>
             <w:pPr>
-              <w:jc w:val="center"/>
+              <w:jc w:val="right"/>
               <w:bidi/>
               <w:spacing w:before="0" w:after="0"/>
             </w:pPr>
@@ -3140,7 +3140,7 @@
           </w:tcPr>
           <w:p>
             <w:pPr>
-              <w:jc w:val="center"/>
+              <w:jc w:val="right"/>
               <w:bidi/>
               <w:spacing w:before="0" w:after="0"/>
             </w:pPr>
@@ -3173,7 +3173,7 @@
           </w:tcPr>
           <w:p>
             <w:pPr>
-              <w:jc w:val="center"/>
+              <w:jc w:val="right"/>
               <w:bidi/>
               <w:spacing w:before="0" w:after="0"/>
             </w:pPr>
@@ -3206,7 +3206,7 @@
           </w:tcPr>
           <w:p>
             <w:pPr>
-              <w:jc w:val="center"/>
+              <w:jc w:val="right"/>
               <w:bidi/>
               <w:spacing w:before="0" w:after="0"/>
             </w:pPr>
@@ -3239,7 +3239,7 @@
           </w:tcPr>
           <w:p>
             <w:pPr>
-              <w:jc w:val="center"/>
+              <w:jc w:val="right"/>
               <w:bidi/>
               <w:spacing w:before="0" w:after="0"/>
             </w:pPr>
@@ -3301,7 +3301,7 @@
       <w:tblPr>
         <w:tblW w:w="10080" w:type="dxa"/>
         <w:tblLayout w:type="fixed"/>
-        <w:jc w:val="center"/>
+        <w:jc w:val="right"/>
         <w:tblCellMar>
           <w:top w:w="0" w:type="dxa"/>
           <w:right w:w="0" w:type="dxa"/>
@@ -3357,7 +3357,7 @@
       <w:tblPr>
         <w:tblW w:w="10080" w:type="dxa"/>
         <w:tblLayout w:type="fixed"/>
-        <w:jc w:val="center"/>
+        <w:jc w:val="right"/>
         <w:tblCellMar>
           <w:top w:w="0" w:type="dxa"/>
           <w:right w:w="0" w:type="dxa"/>
@@ -3593,7 +3593,7 @@
       <w:tblPr>
         <w:tblW w:w="10080" w:type="dxa"/>
         <w:tblLayout w:type="fixed"/>
-        <w:jc w:val="center"/>
+        <w:jc w:val="right"/>
         <w:tblCellMar>
           <w:top w:w="0" w:type="dxa"/>
           <w:right w:w="0" w:type="dxa"/>
@@ -3649,7 +3649,7 @@
       <w:tblPr>
         <w:tblW w:w="10080" w:type="dxa"/>
         <w:tblLayout w:type="fixed"/>
-        <w:jc w:val="center"/>
+        <w:jc w:val="right"/>
         <w:tblCellMar>
           <w:top w:w="0" w:type="dxa"/>
           <w:right w:w="0" w:type="dxa"/>
@@ -3938,7 +3938,7 @@
       <w:tblPr>
         <w:tblW w:w="10080" w:type="dxa"/>
         <w:tblLayout w:type="fixed"/>
-        <w:jc w:val="center"/>
+        <w:jc w:val="right"/>
         <w:tblCellMar>
           <w:top w:w="0" w:type="dxa"/>
           <w:right w:w="0" w:type="dxa"/>
@@ -3994,7 +3994,7 @@
       <w:tblPr>
         <w:tblW w:w="10080" w:type="dxa"/>
         <w:tblLayout w:type="fixed"/>
-        <w:jc w:val="center"/>
+        <w:jc w:val="right"/>
         <w:tblCellMar>
           <w:top w:w="0" w:type="dxa"/>
           <w:right w:w="0" w:type="dxa"/>

</xml_diff>

<commit_message>
Ship backend to production
</commit_message>
<xml_diff>
--- a/public/templates/contact-order.docx
+++ b/public/templates/contact-order.docx
@@ -1,6 +1,6 @@
 
 <file path=word/document.xml><?xml version="1.0" encoding="utf-8"?>
-<w:document xmlns:w="http://schemas.openxmlformats.org/wordprocessingml/2006/main">
+<w:document xmlns:w="http://schemas.openxmlformats.org/wordprocessingml/2006/main" xmlns:wp="http://schemas.openxmlformats.org/drawingml/2006/wordprocessingDrawing" xmlns:r="http://schemas.openxmlformats.org/officeDocument/2006/relationships" xmlns:a="http://schemas.openxmlformats.org/drawingml/2006/main" xmlns:pic="http://schemas.openxmlformats.org/drawingml/2006/picture">
   <w:body>
     <w:tbl>
       <w:tblPr>
@@ -15,27 +15,73 @@
         </w:tblCellMar>
       </w:tblPr>
       <w:tblGrid>
-        <w:gridCol w:w="10080"/>
+        <w:gridCol w:w="3360"/>
+        <w:gridCol w:w="6720"/>
       </w:tblGrid>
       <w:tr>
-        <w:trPr>
-          <w:trHeight w:val="720"/>
-        </w:trPr>
-        <w:tc>
-          <w:tcPr>
-            <w:tcW w:w="10080" w:type="dxa"/>
-            <w:shd w:val="clear" w:color="auto" w:fill="244550"/>
-            <w:tcBorders>
-              <w:top w:val="single" w:sz="6" w:space="0" w:color="D3DCE3"/>
-              <w:right w:val="single" w:sz="6" w:space="0" w:color="D3DCE3"/>
-              <w:bottom w:val="single" w:sz="6" w:space="0" w:color="D3DCE3"/>
-              <w:left w:val="single" w:sz="6" w:space="0" w:color="D3DCE3"/>
-            </w:tcBorders>
-            <w:tcMar>
-              <w:top w:w="120" w:type="dxa"/>
-              <w:right w:w="120" w:type="dxa"/>
-              <w:bottom w:w="120" w:type="dxa"/>
-              <w:left w:w="120" w:type="dxa"/>
+        <w:tc>
+          <w:tcPr>
+            <w:tcW w:w="3360" w:type="dxa"/>
+            <w:tcMar>
+              <w:top w:w="0" w:type="dxa"/>
+              <w:right w:w="0" w:type="dxa"/>
+              <w:bottom w:w="0" w:type="dxa"/>
+              <w:left w:w="0" w:type="dxa"/>
+            </w:tcMar>
+            <w:vAlign w:val="center"/>
+          </w:tcPr>
+          <w:p>
+            <w:pPr>
+              <w:jc w:val="left"/>
+              <w:bidi/>
+              <w:spacing w:before="0" w:after="0"/>
+            </w:pPr>
+            <w:r>
+              <w:drawing>
+                <wp:inline distT="0" distB="0" distL="0" distR="0">
+                  <wp:extent cx="1000000" cy="1000000"/>
+                  <wp:docPr id="1" name="Picture 1"/>
+                  <wp:cNvGraphicFramePr>
+                    <a:graphicFrameLocks xmlns:a="http://schemas.openxmlformats.org/drawingml/2006/main" noChangeAspect="1"/>
+                  </wp:cNvGraphicFramePr>
+                  <a:graphic xmlns:a="http://schemas.openxmlformats.org/drawingml/2006/main">
+                    <a:graphicData uri="http://schemas.openxmlformats.org/drawingml/2006/picture">
+                      <pic:pic xmlns:pic="http://schemas.openxmlformats.org/drawingml/2006/picture">
+                        <pic:nvPicPr>
+                          <pic:cNvPr id="1" name="logo.png"/>
+                          <pic:cNvPicPr/>
+                        </pic:nvPicPr>
+                        <pic:blipFill>
+                          <a:blip xmlns:r="http://schemas.openxmlformats.org/officeDocument/2006/relationships" r:embed="rIdLogo"/>
+                          <a:stretch>
+                            <a:fillRect/>
+                          </a:stretch>
+                        </pic:blipFill>
+                        <pic:spPr>
+                          <a:xfrm>
+                            <a:off x="0" y="0"/>
+                            <a:ext cx="1000000" cy="1000000"/>
+                          </a:xfrm>
+                          <a:prstGeom prst="rect">
+                            <a:avLst/>
+                          </a:prstGeom>
+                        </pic:spPr>
+                      </pic:pic>
+                    </a:graphicData>
+                  </a:graphic>
+                </wp:inline>
+              </w:drawing>
+            </w:r>
+          </w:p>
+        </w:tc>
+        <w:tc>
+          <w:tcPr>
+            <w:tcW w:w="6720" w:type="dxa"/>
+            <w:tcMar>
+              <w:top w:w="0" w:type="dxa"/>
+              <w:right w:w="0" w:type="dxa"/>
+              <w:bottom w:w="0" w:type="dxa"/>
+              <w:left w:w="0" w:type="dxa"/>
             </w:tcMar>
             <w:vAlign w:val="center"/>
           </w:tcPr>
@@ -47,12 +93,13 @@
             </w:pPr>
             <w:r>
               <w:rPr>
-                <w:sz w:val="30"/>
-                <w:szCs w:val="30"/>
+                <w:rFonts w:ascii="Assistant" w:hAnsi="Assistant" w:cs="Assistant" w:eastAsia="Assistant"/>
+                <w:sz w:val="40"/>
+                <w:szCs w:val="40"/>
                 <w:rtl/>
                 <w:b/>
                 <w:bCs/>
-                <w:color w:val="FFFFFF"/>
+                <w:color w:val="18181B"/>
               </w:rPr>
               <w:t xml:space="preserve">הזמנת עדשות מגע</w:t>
             </w:r>
@@ -65,21 +112,23 @@
             </w:pPr>
             <w:r>
               <w:rPr>
-                <w:sz w:val="20"/>
-                <w:szCs w:val="20"/>
+                <w:rFonts w:ascii="Assistant" w:hAnsi="Assistant" w:cs="Assistant" w:eastAsia="Assistant"/>
+                <w:sz w:val="24"/>
+                <w:szCs w:val="24"/>
                 <w:rtl/>
                 <w:b/>
                 <w:bCs/>
-                <w:color w:val="FFFFFF"/>
+                <w:color w:val="71717A"/>
               </w:rPr>
               <w:t xml:space="preserve">סניף: </w:t>
             </w:r>
             <w:r>
               <w:rPr>
-                <w:sz w:val="20"/>
-                <w:szCs w:val="20"/>
-                <w:rtl/>
-                <w:color w:val="FFFFFF"/>
+                <w:rFonts w:ascii="Assistant" w:hAnsi="Assistant" w:cs="Assistant" w:eastAsia="Assistant"/>
+                <w:sz w:val="24"/>
+                <w:szCs w:val="24"/>
+                <w:rtl/>
+                <w:color w:val="71717A"/>
               </w:rPr>
               <w:t>{clinic_name}</w:t>
             </w:r>
@@ -90,7 +139,7 @@
     <w:p>
       <w:pPr>
         <w:bidi/>
-        <w:spacing w:after="80"/>
+        <w:spacing w:after="240"/>
       </w:pPr>
     </w:p>
     <w:tbl>
@@ -98,6 +147,14 @@
         <w:tblW w:w="10080" w:type="dxa"/>
         <w:tblLayout w:type="fixed"/>
         <w:jc w:val="right"/>
+        <w:tblBorders>
+          <w:top w:val="single" w:sz="4" w:space="0" w:color="E4E4E7"/>
+          <w:left w:val="single" w:sz="4" w:space="0" w:color="E4E4E7"/>
+          <w:bottom w:val="single" w:sz="4" w:space="0" w:color="E4E4E7"/>
+          <w:right w:val="single" w:sz="4" w:space="0" w:color="E4E4E7"/>
+          <w:insideH w:val="single" w:sz="4" w:space="0" w:color="E4E4E7"/>
+          <w:insideV w:val="single" w:sz="4" w:space="0" w:color="E4E4E7"/>
+        </w:tblBorders>
         <w:tblCellMar>
           <w:top w:w="0" w:type="dxa"/>
           <w:right w:w="0" w:type="dxa"/>
@@ -119,17 +176,12 @@
         <w:tc>
           <w:tcPr>
             <w:tcW w:w="1320" w:type="dxa"/>
-            <w:tcBorders>
-              <w:top w:val="single" w:sz="6" w:space="0" w:color="D3DCE3"/>
-              <w:right w:val="single" w:sz="6" w:space="0" w:color="D3DCE3"/>
-              <w:bottom w:val="single" w:sz="6" w:space="0" w:color="D3DCE3"/>
-              <w:left w:val="single" w:sz="6" w:space="0" w:color="D3DCE3"/>
-            </w:tcBorders>
-            <w:tcMar>
-              <w:top w:w="90" w:type="dxa"/>
-              <w:right w:w="80" w:type="dxa"/>
-              <w:bottom w:w="90" w:type="dxa"/>
-              <w:left w:w="80" w:type="dxa"/>
+            <w:shd w:val="clear" w:color="auto" w:fill="FAFAFA"/>
+            <w:tcMar>
+              <w:top w:w="90" w:type="dxa"/>
+              <w:right w:w="120" w:type="dxa"/>
+              <w:bottom w:w="90" w:type="dxa"/>
+              <w:left w:w="120" w:type="dxa"/>
             </w:tcMar>
             <w:vAlign w:val="center"/>
           </w:tcPr>
@@ -141,6 +193,7 @@
             </w:pPr>
             <w:r>
               <w:rPr>
+                <w:rFonts w:ascii="Assistant" w:hAnsi="Assistant" w:cs="Assistant" w:eastAsia="Assistant"/>
                 <w:sz w:val="20"/>
                 <w:szCs w:val="20"/>
                 <w:rtl/>
@@ -152,18 +205,12 @@
         <w:tc>
           <w:tcPr>
             <w:tcW w:w="1200" w:type="dxa"/>
-            <w:shd w:val="clear" w:color="auto" w:fill="EAF1F5"/>
-            <w:tcBorders>
-              <w:top w:val="single" w:sz="6" w:space="0" w:color="D3DCE3"/>
-              <w:right w:val="single" w:sz="6" w:space="0" w:color="D3DCE3"/>
-              <w:bottom w:val="single" w:sz="6" w:space="0" w:color="D3DCE3"/>
-              <w:left w:val="single" w:sz="6" w:space="0" w:color="D3DCE3"/>
-            </w:tcBorders>
-            <w:tcMar>
-              <w:top w:w="90" w:type="dxa"/>
-              <w:right w:w="80" w:type="dxa"/>
-              <w:bottom w:w="90" w:type="dxa"/>
-              <w:left w:w="80" w:type="dxa"/>
+            <w:shd w:val="clear" w:color="auto" w:fill="F4F4F5"/>
+            <w:tcMar>
+              <w:top w:w="90" w:type="dxa"/>
+              <w:right w:w="120" w:type="dxa"/>
+              <w:bottom w:w="90" w:type="dxa"/>
+              <w:left w:w="120" w:type="dxa"/>
             </w:tcMar>
             <w:vAlign w:val="center"/>
           </w:tcPr>
@@ -175,11 +222,13 @@
             </w:pPr>
             <w:r>
               <w:rPr>
-                <w:sz w:val="20"/>
-                <w:szCs w:val="20"/>
+                <w:rFonts w:ascii="Assistant" w:hAnsi="Assistant" w:cs="Assistant" w:eastAsia="Assistant"/>
+                <w:sz w:val="18"/>
+                <w:szCs w:val="18"/>
                 <w:rtl/>
                 <w:b/>
                 <w:bCs/>
+                <w:color w:val="52525B"/>
               </w:rPr>
               <w:t xml:space="preserve">עדיפות</w:t>
             </w:r>
@@ -188,17 +237,12 @@
         <w:tc>
           <w:tcPr>
             <w:tcW w:w="1320" w:type="dxa"/>
-            <w:tcBorders>
-              <w:top w:val="single" w:sz="6" w:space="0" w:color="D3DCE3"/>
-              <w:right w:val="single" w:sz="6" w:space="0" w:color="D3DCE3"/>
-              <w:bottom w:val="single" w:sz="6" w:space="0" w:color="D3DCE3"/>
-              <w:left w:val="single" w:sz="6" w:space="0" w:color="D3DCE3"/>
-            </w:tcBorders>
-            <w:tcMar>
-              <w:top w:w="90" w:type="dxa"/>
-              <w:right w:w="80" w:type="dxa"/>
-              <w:bottom w:w="90" w:type="dxa"/>
-              <w:left w:w="80" w:type="dxa"/>
+            <w:shd w:val="clear" w:color="auto" w:fill="FAFAFA"/>
+            <w:tcMar>
+              <w:top w:w="90" w:type="dxa"/>
+              <w:right w:w="120" w:type="dxa"/>
+              <w:bottom w:w="90" w:type="dxa"/>
+              <w:left w:w="120" w:type="dxa"/>
             </w:tcMar>
             <w:vAlign w:val="center"/>
           </w:tcPr>
@@ -210,6 +254,7 @@
             </w:pPr>
             <w:r>
               <w:rPr>
+                <w:rFonts w:ascii="Assistant" w:hAnsi="Assistant" w:cs="Assistant" w:eastAsia="Assistant"/>
                 <w:sz w:val="20"/>
                 <w:szCs w:val="20"/>
                 <w:rtl/>
@@ -221,18 +266,12 @@
         <w:tc>
           <w:tcPr>
             <w:tcW w:w="1200" w:type="dxa"/>
-            <w:shd w:val="clear" w:color="auto" w:fill="EAF1F5"/>
-            <w:tcBorders>
-              <w:top w:val="single" w:sz="6" w:space="0" w:color="D3DCE3"/>
-              <w:right w:val="single" w:sz="6" w:space="0" w:color="D3DCE3"/>
-              <w:bottom w:val="single" w:sz="6" w:space="0" w:color="D3DCE3"/>
-              <w:left w:val="single" w:sz="6" w:space="0" w:color="D3DCE3"/>
-            </w:tcBorders>
-            <w:tcMar>
-              <w:top w:w="90" w:type="dxa"/>
-              <w:right w:w="80" w:type="dxa"/>
-              <w:bottom w:w="90" w:type="dxa"/>
-              <w:left w:w="80" w:type="dxa"/>
+            <w:shd w:val="clear" w:color="auto" w:fill="F4F4F5"/>
+            <w:tcMar>
+              <w:top w:w="90" w:type="dxa"/>
+              <w:right w:w="120" w:type="dxa"/>
+              <w:bottom w:w="90" w:type="dxa"/>
+              <w:left w:w="120" w:type="dxa"/>
             </w:tcMar>
             <w:vAlign w:val="center"/>
           </w:tcPr>
@@ -244,11 +283,13 @@
             </w:pPr>
             <w:r>
               <w:rPr>
-                <w:sz w:val="20"/>
-                <w:szCs w:val="20"/>
+                <w:rFonts w:ascii="Assistant" w:hAnsi="Assistant" w:cs="Assistant" w:eastAsia="Assistant"/>
+                <w:sz w:val="18"/>
+                <w:szCs w:val="18"/>
                 <w:rtl/>
                 <w:b/>
                 <w:bCs/>
+                <w:color w:val="52525B"/>
               </w:rPr>
               <w:t xml:space="preserve">סטטוס</w:t>
             </w:r>
@@ -257,17 +298,12 @@
         <w:tc>
           <w:tcPr>
             <w:tcW w:w="1320" w:type="dxa"/>
-            <w:tcBorders>
-              <w:top w:val="single" w:sz="6" w:space="0" w:color="D3DCE3"/>
-              <w:right w:val="single" w:sz="6" w:space="0" w:color="D3DCE3"/>
-              <w:bottom w:val="single" w:sz="6" w:space="0" w:color="D3DCE3"/>
-              <w:left w:val="single" w:sz="6" w:space="0" w:color="D3DCE3"/>
-            </w:tcBorders>
-            <w:tcMar>
-              <w:top w:w="90" w:type="dxa"/>
-              <w:right w:w="80" w:type="dxa"/>
-              <w:bottom w:w="90" w:type="dxa"/>
-              <w:left w:w="80" w:type="dxa"/>
+            <w:shd w:val="clear" w:color="auto" w:fill="FAFAFA"/>
+            <w:tcMar>
+              <w:top w:w="90" w:type="dxa"/>
+              <w:right w:w="120" w:type="dxa"/>
+              <w:bottom w:w="90" w:type="dxa"/>
+              <w:left w:w="120" w:type="dxa"/>
             </w:tcMar>
             <w:vAlign w:val="center"/>
           </w:tcPr>
@@ -279,6 +315,7 @@
             </w:pPr>
             <w:r>
               <w:rPr>
+                <w:rFonts w:ascii="Assistant" w:hAnsi="Assistant" w:cs="Assistant" w:eastAsia="Assistant"/>
                 <w:sz w:val="20"/>
                 <w:szCs w:val="20"/>
                 <w:rtl/>
@@ -290,18 +327,12 @@
         <w:tc>
           <w:tcPr>
             <w:tcW w:w="1200" w:type="dxa"/>
-            <w:shd w:val="clear" w:color="auto" w:fill="EAF1F5"/>
-            <w:tcBorders>
-              <w:top w:val="single" w:sz="6" w:space="0" w:color="D3DCE3"/>
-              <w:right w:val="single" w:sz="6" w:space="0" w:color="D3DCE3"/>
-              <w:bottom w:val="single" w:sz="6" w:space="0" w:color="D3DCE3"/>
-              <w:left w:val="single" w:sz="6" w:space="0" w:color="D3DCE3"/>
-            </w:tcBorders>
-            <w:tcMar>
-              <w:top w:w="90" w:type="dxa"/>
-              <w:right w:w="80" w:type="dxa"/>
-              <w:bottom w:w="90" w:type="dxa"/>
-              <w:left w:w="80" w:type="dxa"/>
+            <w:shd w:val="clear" w:color="auto" w:fill="F4F4F5"/>
+            <w:tcMar>
+              <w:top w:w="90" w:type="dxa"/>
+              <w:right w:w="120" w:type="dxa"/>
+              <w:bottom w:w="90" w:type="dxa"/>
+              <w:left w:w="120" w:type="dxa"/>
             </w:tcMar>
             <w:vAlign w:val="center"/>
           </w:tcPr>
@@ -313,11 +344,13 @@
             </w:pPr>
             <w:r>
               <w:rPr>
-                <w:sz w:val="20"/>
-                <w:szCs w:val="20"/>
+                <w:rFonts w:ascii="Assistant" w:hAnsi="Assistant" w:cs="Assistant" w:eastAsia="Assistant"/>
+                <w:sz w:val="18"/>
+                <w:szCs w:val="18"/>
                 <w:rtl/>
                 <w:b/>
                 <w:bCs/>
+                <w:color w:val="52525B"/>
               </w:rPr>
               <w:t xml:space="preserve">תאריך הזמנה</w:t>
             </w:r>
@@ -326,17 +359,12 @@
         <w:tc>
           <w:tcPr>
             <w:tcW w:w="1320" w:type="dxa"/>
-            <w:tcBorders>
-              <w:top w:val="single" w:sz="6" w:space="0" w:color="D3DCE3"/>
-              <w:right w:val="single" w:sz="6" w:space="0" w:color="D3DCE3"/>
-              <w:bottom w:val="single" w:sz="6" w:space="0" w:color="D3DCE3"/>
-              <w:left w:val="single" w:sz="6" w:space="0" w:color="D3DCE3"/>
-            </w:tcBorders>
-            <w:tcMar>
-              <w:top w:w="90" w:type="dxa"/>
-              <w:right w:w="80" w:type="dxa"/>
-              <w:bottom w:w="90" w:type="dxa"/>
-              <w:left w:w="80" w:type="dxa"/>
+            <w:shd w:val="clear" w:color="auto" w:fill="FAFAFA"/>
+            <w:tcMar>
+              <w:top w:w="90" w:type="dxa"/>
+              <w:right w:w="120" w:type="dxa"/>
+              <w:bottom w:w="90" w:type="dxa"/>
+              <w:left w:w="120" w:type="dxa"/>
             </w:tcMar>
             <w:vAlign w:val="center"/>
           </w:tcPr>
@@ -348,6 +376,7 @@
             </w:pPr>
             <w:r>
               <w:rPr>
+                <w:rFonts w:ascii="Assistant" w:hAnsi="Assistant" w:cs="Assistant" w:eastAsia="Assistant"/>
                 <w:sz w:val="20"/>
                 <w:szCs w:val="20"/>
                 <w:rtl/>
@@ -359,18 +388,12 @@
         <w:tc>
           <w:tcPr>
             <w:tcW w:w="1200" w:type="dxa"/>
-            <w:shd w:val="clear" w:color="auto" w:fill="EAF1F5"/>
-            <w:tcBorders>
-              <w:top w:val="single" w:sz="6" w:space="0" w:color="D3DCE3"/>
-              <w:right w:val="single" w:sz="6" w:space="0" w:color="D3DCE3"/>
-              <w:bottom w:val="single" w:sz="6" w:space="0" w:color="D3DCE3"/>
-              <w:left w:val="single" w:sz="6" w:space="0" w:color="D3DCE3"/>
-            </w:tcBorders>
-            <w:tcMar>
-              <w:top w:w="90" w:type="dxa"/>
-              <w:right w:w="80" w:type="dxa"/>
-              <w:bottom w:w="90" w:type="dxa"/>
-              <w:left w:w="80" w:type="dxa"/>
+            <w:shd w:val="clear" w:color="auto" w:fill="F4F4F5"/>
+            <w:tcMar>
+              <w:top w:w="90" w:type="dxa"/>
+              <w:right w:w="120" w:type="dxa"/>
+              <w:bottom w:w="90" w:type="dxa"/>
+              <w:left w:w="120" w:type="dxa"/>
             </w:tcMar>
             <w:vAlign w:val="center"/>
           </w:tcPr>
@@ -382,11 +405,13 @@
             </w:pPr>
             <w:r>
               <w:rPr>
-                <w:sz w:val="20"/>
-                <w:szCs w:val="20"/>
+                <w:rFonts w:ascii="Assistant" w:hAnsi="Assistant" w:cs="Assistant" w:eastAsia="Assistant"/>
+                <w:sz w:val="18"/>
+                <w:szCs w:val="18"/>
                 <w:rtl/>
                 <w:b/>
                 <w:bCs/>
+                <w:color w:val="52525B"/>
               </w:rPr>
               <w:t xml:space="preserve">מס' הזמנה</w:t>
             </w:r>
@@ -397,17 +422,12 @@
         <w:tc>
           <w:tcPr>
             <w:tcW w:w="1320" w:type="dxa"/>
-            <w:tcBorders>
-              <w:top w:val="single" w:sz="6" w:space="0" w:color="D3DCE3"/>
-              <w:right w:val="single" w:sz="6" w:space="0" w:color="D3DCE3"/>
-              <w:bottom w:val="single" w:sz="6" w:space="0" w:color="D3DCE3"/>
-              <w:left w:val="single" w:sz="6" w:space="0" w:color="D3DCE3"/>
-            </w:tcBorders>
-            <w:tcMar>
-              <w:top w:w="90" w:type="dxa"/>
-              <w:right w:w="80" w:type="dxa"/>
-              <w:bottom w:w="90" w:type="dxa"/>
-              <w:left w:w="80" w:type="dxa"/>
+            <w:shd w:val="clear" w:color="auto" w:fill="FAFAFA"/>
+            <w:tcMar>
+              <w:top w:w="90" w:type="dxa"/>
+              <w:right w:w="120" w:type="dxa"/>
+              <w:bottom w:w="90" w:type="dxa"/>
+              <w:left w:w="120" w:type="dxa"/>
             </w:tcMar>
             <w:vAlign w:val="center"/>
           </w:tcPr>
@@ -419,6 +439,7 @@
             </w:pPr>
             <w:r>
               <w:rPr>
+                <w:rFonts w:ascii="Assistant" w:hAnsi="Assistant" w:cs="Assistant" w:eastAsia="Assistant"/>
                 <w:sz w:val="20"/>
                 <w:szCs w:val="20"/>
                 <w:rtl/>
@@ -430,18 +451,12 @@
         <w:tc>
           <w:tcPr>
             <w:tcW w:w="1200" w:type="dxa"/>
-            <w:shd w:val="clear" w:color="auto" w:fill="EAF1F5"/>
-            <w:tcBorders>
-              <w:top w:val="single" w:sz="6" w:space="0" w:color="D3DCE3"/>
-              <w:right w:val="single" w:sz="6" w:space="0" w:color="D3DCE3"/>
-              <w:bottom w:val="single" w:sz="6" w:space="0" w:color="D3DCE3"/>
-              <w:left w:val="single" w:sz="6" w:space="0" w:color="D3DCE3"/>
-            </w:tcBorders>
-            <w:tcMar>
-              <w:top w:w="90" w:type="dxa"/>
-              <w:right w:w="80" w:type="dxa"/>
-              <w:bottom w:w="90" w:type="dxa"/>
-              <w:left w:w="80" w:type="dxa"/>
+            <w:shd w:val="clear" w:color="auto" w:fill="F4F4F5"/>
+            <w:tcMar>
+              <w:top w:w="90" w:type="dxa"/>
+              <w:right w:w="120" w:type="dxa"/>
+              <w:bottom w:w="90" w:type="dxa"/>
+              <w:left w:w="120" w:type="dxa"/>
             </w:tcMar>
             <w:vAlign w:val="center"/>
           </w:tcPr>
@@ -453,11 +468,13 @@
             </w:pPr>
             <w:r>
               <w:rPr>
-                <w:sz w:val="20"/>
-                <w:szCs w:val="20"/>
+                <w:rFonts w:ascii="Assistant" w:hAnsi="Assistant" w:cs="Assistant" w:eastAsia="Assistant"/>
+                <w:sz w:val="18"/>
+                <w:szCs w:val="18"/>
                 <w:rtl/>
                 <w:b/>
                 <w:bCs/>
+                <w:color w:val="52525B"/>
               </w:rPr>
               <w:t xml:space="preserve">נמסר</w:t>
             </w:r>
@@ -466,17 +483,12 @@
         <w:tc>
           <w:tcPr>
             <w:tcW w:w="1320" w:type="dxa"/>
-            <w:tcBorders>
-              <w:top w:val="single" w:sz="6" w:space="0" w:color="D3DCE3"/>
-              <w:right w:val="single" w:sz="6" w:space="0" w:color="D3DCE3"/>
-              <w:bottom w:val="single" w:sz="6" w:space="0" w:color="D3DCE3"/>
-              <w:left w:val="single" w:sz="6" w:space="0" w:color="D3DCE3"/>
-            </w:tcBorders>
-            <w:tcMar>
-              <w:top w:w="90" w:type="dxa"/>
-              <w:right w:w="80" w:type="dxa"/>
-              <w:bottom w:w="90" w:type="dxa"/>
-              <w:left w:w="80" w:type="dxa"/>
+            <w:shd w:val="clear" w:color="auto" w:fill="FAFAFA"/>
+            <w:tcMar>
+              <w:top w:w="90" w:type="dxa"/>
+              <w:right w:w="120" w:type="dxa"/>
+              <w:bottom w:w="90" w:type="dxa"/>
+              <w:left w:w="120" w:type="dxa"/>
             </w:tcMar>
             <w:vAlign w:val="center"/>
           </w:tcPr>
@@ -488,6 +500,7 @@
             </w:pPr>
             <w:r>
               <w:rPr>
+                <w:rFonts w:ascii="Assistant" w:hAnsi="Assistant" w:cs="Assistant" w:eastAsia="Assistant"/>
                 <w:sz w:val="20"/>
                 <w:szCs w:val="20"/>
                 <w:rtl/>
@@ -499,18 +512,12 @@
         <w:tc>
           <w:tcPr>
             <w:tcW w:w="1200" w:type="dxa"/>
-            <w:shd w:val="clear" w:color="auto" w:fill="EAF1F5"/>
-            <w:tcBorders>
-              <w:top w:val="single" w:sz="6" w:space="0" w:color="D3DCE3"/>
-              <w:right w:val="single" w:sz="6" w:space="0" w:color="D3DCE3"/>
-              <w:bottom w:val="single" w:sz="6" w:space="0" w:color="D3DCE3"/>
-              <w:left w:val="single" w:sz="6" w:space="0" w:color="D3DCE3"/>
-            </w:tcBorders>
-            <w:tcMar>
-              <w:top w:w="90" w:type="dxa"/>
-              <w:right w:w="80" w:type="dxa"/>
-              <w:bottom w:w="90" w:type="dxa"/>
-              <w:left w:w="80" w:type="dxa"/>
+            <w:shd w:val="clear" w:color="auto" w:fill="F4F4F5"/>
+            <w:tcMar>
+              <w:top w:w="90" w:type="dxa"/>
+              <w:right w:w="120" w:type="dxa"/>
+              <w:bottom w:w="90" w:type="dxa"/>
+              <w:left w:w="120" w:type="dxa"/>
             </w:tcMar>
             <w:vAlign w:val="center"/>
           </w:tcPr>
@@ -522,11 +529,13 @@
             </w:pPr>
             <w:r>
               <w:rPr>
-                <w:sz w:val="20"/>
-                <w:szCs w:val="20"/>
+                <w:rFonts w:ascii="Assistant" w:hAnsi="Assistant" w:cs="Assistant" w:eastAsia="Assistant"/>
+                <w:sz w:val="18"/>
+                <w:szCs w:val="18"/>
                 <w:rtl/>
                 <w:b/>
                 <w:bCs/>
+                <w:color w:val="52525B"/>
               </w:rPr>
               <w:t xml:space="preserve">אושר</w:t>
             </w:r>
@@ -535,17 +544,12 @@
         <w:tc>
           <w:tcPr>
             <w:tcW w:w="1320" w:type="dxa"/>
-            <w:tcBorders>
-              <w:top w:val="single" w:sz="6" w:space="0" w:color="D3DCE3"/>
-              <w:right w:val="single" w:sz="6" w:space="0" w:color="D3DCE3"/>
-              <w:bottom w:val="single" w:sz="6" w:space="0" w:color="D3DCE3"/>
-              <w:left w:val="single" w:sz="6" w:space="0" w:color="D3DCE3"/>
-            </w:tcBorders>
-            <w:tcMar>
-              <w:top w:w="90" w:type="dxa"/>
-              <w:right w:w="80" w:type="dxa"/>
-              <w:bottom w:w="90" w:type="dxa"/>
-              <w:left w:w="80" w:type="dxa"/>
+            <w:shd w:val="clear" w:color="auto" w:fill="FAFAFA"/>
+            <w:tcMar>
+              <w:top w:w="90" w:type="dxa"/>
+              <w:right w:w="120" w:type="dxa"/>
+              <w:bottom w:w="90" w:type="dxa"/>
+              <w:left w:w="120" w:type="dxa"/>
             </w:tcMar>
             <w:vAlign w:val="center"/>
           </w:tcPr>
@@ -557,6 +561,7 @@
             </w:pPr>
             <w:r>
               <w:rPr>
+                <w:rFonts w:ascii="Assistant" w:hAnsi="Assistant" w:cs="Assistant" w:eastAsia="Assistant"/>
                 <w:sz w:val="20"/>
                 <w:szCs w:val="20"/>
                 <w:rtl/>
@@ -568,18 +573,12 @@
         <w:tc>
           <w:tcPr>
             <w:tcW w:w="1200" w:type="dxa"/>
-            <w:shd w:val="clear" w:color="auto" w:fill="EAF1F5"/>
-            <w:tcBorders>
-              <w:top w:val="single" w:sz="6" w:space="0" w:color="D3DCE3"/>
-              <w:right w:val="single" w:sz="6" w:space="0" w:color="D3DCE3"/>
-              <w:bottom w:val="single" w:sz="6" w:space="0" w:color="D3DCE3"/>
-              <w:left w:val="single" w:sz="6" w:space="0" w:color="D3DCE3"/>
-            </w:tcBorders>
-            <w:tcMar>
-              <w:top w:w="90" w:type="dxa"/>
-              <w:right w:w="80" w:type="dxa"/>
-              <w:bottom w:w="90" w:type="dxa"/>
-              <w:left w:w="80" w:type="dxa"/>
+            <w:shd w:val="clear" w:color="auto" w:fill="F4F4F5"/>
+            <w:tcMar>
+              <w:top w:w="90" w:type="dxa"/>
+              <w:right w:w="120" w:type="dxa"/>
+              <w:bottom w:w="90" w:type="dxa"/>
+              <w:left w:w="120" w:type="dxa"/>
             </w:tcMar>
             <w:vAlign w:val="center"/>
           </w:tcPr>
@@ -591,11 +590,13 @@
             </w:pPr>
             <w:r>
               <w:rPr>
-                <w:sz w:val="20"/>
-                <w:szCs w:val="20"/>
+                <w:rFonts w:ascii="Assistant" w:hAnsi="Assistant" w:cs="Assistant" w:eastAsia="Assistant"/>
+                <w:sz w:val="18"/>
+                <w:szCs w:val="18"/>
                 <w:rtl/>
                 <w:b/>
                 <w:bCs/>
+                <w:color w:val="52525B"/>
               </w:rPr>
               <w:t xml:space="preserve">הובטח</w:t>
             </w:r>
@@ -604,17 +605,12 @@
         <w:tc>
           <w:tcPr>
             <w:tcW w:w="1320" w:type="dxa"/>
-            <w:tcBorders>
-              <w:top w:val="single" w:sz="6" w:space="0" w:color="D3DCE3"/>
-              <w:right w:val="single" w:sz="6" w:space="0" w:color="D3DCE3"/>
-              <w:bottom w:val="single" w:sz="6" w:space="0" w:color="D3DCE3"/>
-              <w:left w:val="single" w:sz="6" w:space="0" w:color="D3DCE3"/>
-            </w:tcBorders>
-            <w:tcMar>
-              <w:top w:w="90" w:type="dxa"/>
-              <w:right w:w="80" w:type="dxa"/>
-              <w:bottom w:w="90" w:type="dxa"/>
-              <w:left w:w="80" w:type="dxa"/>
+            <w:shd w:val="clear" w:color="auto" w:fill="FAFAFA"/>
+            <w:tcMar>
+              <w:top w:w="90" w:type="dxa"/>
+              <w:right w:w="120" w:type="dxa"/>
+              <w:bottom w:w="90" w:type="dxa"/>
+              <w:left w:w="120" w:type="dxa"/>
             </w:tcMar>
             <w:vAlign w:val="center"/>
           </w:tcPr>
@@ -626,6 +622,7 @@
             </w:pPr>
             <w:r>
               <w:rPr>
+                <w:rFonts w:ascii="Assistant" w:hAnsi="Assistant" w:cs="Assistant" w:eastAsia="Assistant"/>
                 <w:sz w:val="20"/>
                 <w:szCs w:val="20"/>
                 <w:rtl/>
@@ -637,18 +634,12 @@
         <w:tc>
           <w:tcPr>
             <w:tcW w:w="1200" w:type="dxa"/>
-            <w:shd w:val="clear" w:color="auto" w:fill="EAF1F5"/>
-            <w:tcBorders>
-              <w:top w:val="single" w:sz="6" w:space="0" w:color="D3DCE3"/>
-              <w:right w:val="single" w:sz="6" w:space="0" w:color="D3DCE3"/>
-              <w:bottom w:val="single" w:sz="6" w:space="0" w:color="D3DCE3"/>
-              <w:left w:val="single" w:sz="6" w:space="0" w:color="D3DCE3"/>
-            </w:tcBorders>
-            <w:tcMar>
-              <w:top w:w="90" w:type="dxa"/>
-              <w:right w:w="80" w:type="dxa"/>
-              <w:bottom w:w="90" w:type="dxa"/>
-              <w:left w:w="80" w:type="dxa"/>
+            <w:shd w:val="clear" w:color="auto" w:fill="F4F4F5"/>
+            <w:tcMar>
+              <w:top w:w="90" w:type="dxa"/>
+              <w:right w:w="120" w:type="dxa"/>
+              <w:bottom w:w="90" w:type="dxa"/>
+              <w:left w:w="120" w:type="dxa"/>
             </w:tcMar>
             <w:vAlign w:val="center"/>
           </w:tcPr>
@@ -660,11 +651,13 @@
             </w:pPr>
             <w:r>
               <w:rPr>
-                <w:sz w:val="20"/>
-                <w:szCs w:val="20"/>
+                <w:rFonts w:ascii="Assistant" w:hAnsi="Assistant" w:cs="Assistant" w:eastAsia="Assistant"/>
+                <w:sz w:val="18"/>
+                <w:szCs w:val="18"/>
                 <w:rtl/>
                 <w:b/>
                 <w:bCs/>
+                <w:color w:val="52525B"/>
               </w:rPr>
               <w:t xml:space="preserve">אספקה</w:t>
             </w:r>
@@ -675,70 +668,42 @@
     <w:p>
       <w:pPr>
         <w:bidi/>
-        <w:spacing w:after="80"/>
+        <w:spacing w:after="180"/>
       </w:pPr>
+    </w:p>
+    <w:p>
+      <w:pPr>
+        <w:jc w:val="center"/>
+        <w:bidi/>
+        <w:spacing w:before="240" w:after="80"/>
+        <w:keepNext/>
+      </w:pPr>
+      <w:r>
+        <w:rPr>
+          <w:rFonts w:ascii="Assistant" w:hAnsi="Assistant" w:cs="Assistant" w:eastAsia="Assistant"/>
+          <w:sz w:val="28"/>
+          <w:szCs w:val="28"/>
+          <w:rtl/>
+          <w:b/>
+          <w:bCs/>
+          <w:color w:val="18181B"/>
+        </w:rPr>
+        <w:t xml:space="preserve">פרטי לקוח</w:t>
+      </w:r>
     </w:p>
     <w:tbl>
       <w:tblPr>
         <w:tblW w:w="10080" w:type="dxa"/>
         <w:tblLayout w:type="fixed"/>
         <w:jc w:val="right"/>
-        <w:tblCellMar>
-          <w:top w:w="0" w:type="dxa"/>
-          <w:right w:w="0" w:type="dxa"/>
-          <w:bottom w:w="0" w:type="dxa"/>
-          <w:left w:w="0" w:type="dxa"/>
-        </w:tblCellMar>
-      </w:tblPr>
-      <w:tblGrid>
-        <w:gridCol w:w="10080"/>
-      </w:tblGrid>
-      <w:tr>
-        <w:tc>
-          <w:tcPr>
-            <w:tcW w:w="10080" w:type="dxa"/>
-            <w:shd w:val="clear" w:color="auto" w:fill="D7E4EA"/>
-            <w:tcBorders>
-              <w:top w:val="single" w:sz="6" w:space="0" w:color="D3DCE3"/>
-              <w:right w:val="single" w:sz="6" w:space="0" w:color="D3DCE3"/>
-              <w:bottom w:val="single" w:sz="6" w:space="0" w:color="D3DCE3"/>
-              <w:left w:val="single" w:sz="6" w:space="0" w:color="D3DCE3"/>
-            </w:tcBorders>
-            <w:tcMar>
-              <w:top w:w="110" w:type="dxa"/>
-              <w:right w:w="180" w:type="dxa"/>
-              <w:bottom w:w="110" w:type="dxa"/>
-              <w:left w:w="180" w:type="dxa"/>
-            </w:tcMar>
-            <w:vAlign w:val="center"/>
-          </w:tcPr>
-          <w:p>
-            <w:pPr>
-              <w:jc w:val="right"/>
-              <w:bidi/>
-              <w:spacing w:before="0" w:after="0"/>
-              <w:keepNext/>
-            </w:pPr>
-            <w:r>
-              <w:rPr>
-                <w:sz w:val="24"/>
-                <w:szCs w:val="24"/>
-                <w:rtl/>
-                <w:b/>
-                <w:bCs/>
-                <w:color w:val="244550"/>
-              </w:rPr>
-              <w:t xml:space="preserve">פרטי לקוח</w:t>
-            </w:r>
-          </w:p>
-        </w:tc>
-      </w:tr>
-    </w:tbl>
-    <w:tbl>
-      <w:tblPr>
-        <w:tblW w:w="10080" w:type="dxa"/>
-        <w:tblLayout w:type="fixed"/>
-        <w:jc w:val="right"/>
+        <w:tblBorders>
+          <w:top w:val="single" w:sz="4" w:space="0" w:color="E4E4E7"/>
+          <w:left w:val="single" w:sz="4" w:space="0" w:color="E4E4E7"/>
+          <w:bottom w:val="single" w:sz="4" w:space="0" w:color="E4E4E7"/>
+          <w:right w:val="single" w:sz="4" w:space="0" w:color="E4E4E7"/>
+          <w:insideH w:val="single" w:sz="4" w:space="0" w:color="E4E4E7"/>
+          <w:insideV w:val="single" w:sz="4" w:space="0" w:color="E4E4E7"/>
+        </w:tblBorders>
         <w:tblCellMar>
           <w:top w:w="0" w:type="dxa"/>
           <w:right w:w="0" w:type="dxa"/>
@@ -758,17 +723,12 @@
         <w:tc>
           <w:tcPr>
             <w:tcW w:w="2160" w:type="dxa"/>
-            <w:tcBorders>
-              <w:top w:val="single" w:sz="6" w:space="0" w:color="D3DCE3"/>
-              <w:right w:val="single" w:sz="6" w:space="0" w:color="D3DCE3"/>
-              <w:bottom w:val="single" w:sz="6" w:space="0" w:color="D3DCE3"/>
-              <w:left w:val="single" w:sz="6" w:space="0" w:color="D3DCE3"/>
-            </w:tcBorders>
-            <w:tcMar>
-              <w:top w:w="90" w:type="dxa"/>
-              <w:right w:w="80" w:type="dxa"/>
-              <w:bottom w:w="90" w:type="dxa"/>
-              <w:left w:w="80" w:type="dxa"/>
+            <w:shd w:val="clear" w:color="auto" w:fill="FAFAFA"/>
+            <w:tcMar>
+              <w:top w:w="90" w:type="dxa"/>
+              <w:right w:w="120" w:type="dxa"/>
+              <w:bottom w:w="90" w:type="dxa"/>
+              <w:left w:w="120" w:type="dxa"/>
             </w:tcMar>
             <w:vAlign w:val="center"/>
           </w:tcPr>
@@ -780,6 +740,7 @@
             </w:pPr>
             <w:r>
               <w:rPr>
+                <w:rFonts w:ascii="Assistant" w:hAnsi="Assistant" w:cs="Assistant" w:eastAsia="Assistant"/>
                 <w:sz w:val="20"/>
                 <w:szCs w:val="20"/>
                 <w:rtl/>
@@ -791,18 +752,12 @@
         <w:tc>
           <w:tcPr>
             <w:tcW w:w="1200" w:type="dxa"/>
-            <w:shd w:val="clear" w:color="auto" w:fill="EAF1F5"/>
-            <w:tcBorders>
-              <w:top w:val="single" w:sz="6" w:space="0" w:color="D3DCE3"/>
-              <w:right w:val="single" w:sz="6" w:space="0" w:color="D3DCE3"/>
-              <w:bottom w:val="single" w:sz="6" w:space="0" w:color="D3DCE3"/>
-              <w:left w:val="single" w:sz="6" w:space="0" w:color="D3DCE3"/>
-            </w:tcBorders>
-            <w:tcMar>
-              <w:top w:w="90" w:type="dxa"/>
-              <w:right w:w="80" w:type="dxa"/>
-              <w:bottom w:w="90" w:type="dxa"/>
-              <w:left w:w="80" w:type="dxa"/>
+            <w:shd w:val="clear" w:color="auto" w:fill="F4F4F5"/>
+            <w:tcMar>
+              <w:top w:w="90" w:type="dxa"/>
+              <w:right w:w="120" w:type="dxa"/>
+              <w:bottom w:w="90" w:type="dxa"/>
+              <w:left w:w="120" w:type="dxa"/>
             </w:tcMar>
             <w:vAlign w:val="center"/>
           </w:tcPr>
@@ -814,11 +769,13 @@
             </w:pPr>
             <w:r>
               <w:rPr>
-                <w:sz w:val="20"/>
-                <w:szCs w:val="20"/>
+                <w:rFonts w:ascii="Assistant" w:hAnsi="Assistant" w:cs="Assistant" w:eastAsia="Assistant"/>
+                <w:sz w:val="18"/>
+                <w:szCs w:val="18"/>
                 <w:rtl/>
                 <w:b/>
                 <w:bCs/>
+                <w:color w:val="52525B"/>
               </w:rPr>
               <w:t xml:space="preserve">נייד</w:t>
             </w:r>
@@ -827,17 +784,12 @@
         <w:tc>
           <w:tcPr>
             <w:tcW w:w="2160" w:type="dxa"/>
-            <w:tcBorders>
-              <w:top w:val="single" w:sz="6" w:space="0" w:color="D3DCE3"/>
-              <w:right w:val="single" w:sz="6" w:space="0" w:color="D3DCE3"/>
-              <w:bottom w:val="single" w:sz="6" w:space="0" w:color="D3DCE3"/>
-              <w:left w:val="single" w:sz="6" w:space="0" w:color="D3DCE3"/>
-            </w:tcBorders>
-            <w:tcMar>
-              <w:top w:w="90" w:type="dxa"/>
-              <w:right w:w="80" w:type="dxa"/>
-              <w:bottom w:w="90" w:type="dxa"/>
-              <w:left w:w="80" w:type="dxa"/>
+            <w:shd w:val="clear" w:color="auto" w:fill="FAFAFA"/>
+            <w:tcMar>
+              <w:top w:w="90" w:type="dxa"/>
+              <w:right w:w="120" w:type="dxa"/>
+              <w:bottom w:w="90" w:type="dxa"/>
+              <w:left w:w="120" w:type="dxa"/>
             </w:tcMar>
             <w:vAlign w:val="center"/>
           </w:tcPr>
@@ -849,6 +801,7 @@
             </w:pPr>
             <w:r>
               <w:rPr>
+                <w:rFonts w:ascii="Assistant" w:hAnsi="Assistant" w:cs="Assistant" w:eastAsia="Assistant"/>
                 <w:sz w:val="20"/>
                 <w:szCs w:val="20"/>
                 <w:rtl/>
@@ -860,18 +813,12 @@
         <w:tc>
           <w:tcPr>
             <w:tcW w:w="1200" w:type="dxa"/>
-            <w:shd w:val="clear" w:color="auto" w:fill="EAF1F5"/>
-            <w:tcBorders>
-              <w:top w:val="single" w:sz="6" w:space="0" w:color="D3DCE3"/>
-              <w:right w:val="single" w:sz="6" w:space="0" w:color="D3DCE3"/>
-              <w:bottom w:val="single" w:sz="6" w:space="0" w:color="D3DCE3"/>
-              <w:left w:val="single" w:sz="6" w:space="0" w:color="D3DCE3"/>
-            </w:tcBorders>
-            <w:tcMar>
-              <w:top w:w="90" w:type="dxa"/>
-              <w:right w:w="80" w:type="dxa"/>
-              <w:bottom w:w="90" w:type="dxa"/>
-              <w:left w:w="80" w:type="dxa"/>
+            <w:shd w:val="clear" w:color="auto" w:fill="F4F4F5"/>
+            <w:tcMar>
+              <w:top w:w="90" w:type="dxa"/>
+              <w:right w:w="120" w:type="dxa"/>
+              <w:bottom w:w="90" w:type="dxa"/>
+              <w:left w:w="120" w:type="dxa"/>
             </w:tcMar>
             <w:vAlign w:val="center"/>
           </w:tcPr>
@@ -883,11 +830,13 @@
             </w:pPr>
             <w:r>
               <w:rPr>
-                <w:sz w:val="20"/>
-                <w:szCs w:val="20"/>
+                <w:rFonts w:ascii="Assistant" w:hAnsi="Assistant" w:cs="Assistant" w:eastAsia="Assistant"/>
+                <w:sz w:val="18"/>
+                <w:szCs w:val="18"/>
                 <w:rtl/>
                 <w:b/>
                 <w:bCs/>
+                <w:color w:val="52525B"/>
               </w:rPr>
               <w:t xml:space="preserve">מספר לקוח</w:t>
             </w:r>
@@ -896,17 +845,12 @@
         <w:tc>
           <w:tcPr>
             <w:tcW w:w="2160" w:type="dxa"/>
-            <w:tcBorders>
-              <w:top w:val="single" w:sz="6" w:space="0" w:color="D3DCE3"/>
-              <w:right w:val="single" w:sz="6" w:space="0" w:color="D3DCE3"/>
-              <w:bottom w:val="single" w:sz="6" w:space="0" w:color="D3DCE3"/>
-              <w:left w:val="single" w:sz="6" w:space="0" w:color="D3DCE3"/>
-            </w:tcBorders>
-            <w:tcMar>
-              <w:top w:w="90" w:type="dxa"/>
-              <w:right w:w="80" w:type="dxa"/>
-              <w:bottom w:w="90" w:type="dxa"/>
-              <w:left w:w="80" w:type="dxa"/>
+            <w:shd w:val="clear" w:color="auto" w:fill="FAFAFA"/>
+            <w:tcMar>
+              <w:top w:w="90" w:type="dxa"/>
+              <w:right w:w="120" w:type="dxa"/>
+              <w:bottom w:w="90" w:type="dxa"/>
+              <w:left w:w="120" w:type="dxa"/>
             </w:tcMar>
             <w:vAlign w:val="center"/>
           </w:tcPr>
@@ -918,6 +862,7 @@
             </w:pPr>
             <w:r>
               <w:rPr>
+                <w:rFonts w:ascii="Assistant" w:hAnsi="Assistant" w:cs="Assistant" w:eastAsia="Assistant"/>
                 <w:sz w:val="20"/>
                 <w:szCs w:val="20"/>
                 <w:rtl/>
@@ -929,18 +874,12 @@
         <w:tc>
           <w:tcPr>
             <w:tcW w:w="1200" w:type="dxa"/>
-            <w:shd w:val="clear" w:color="auto" w:fill="EAF1F5"/>
-            <w:tcBorders>
-              <w:top w:val="single" w:sz="6" w:space="0" w:color="D3DCE3"/>
-              <w:right w:val="single" w:sz="6" w:space="0" w:color="D3DCE3"/>
-              <w:bottom w:val="single" w:sz="6" w:space="0" w:color="D3DCE3"/>
-              <w:left w:val="single" w:sz="6" w:space="0" w:color="D3DCE3"/>
-            </w:tcBorders>
-            <w:tcMar>
-              <w:top w:w="90" w:type="dxa"/>
-              <w:right w:w="80" w:type="dxa"/>
-              <w:bottom w:w="90" w:type="dxa"/>
-              <w:left w:w="80" w:type="dxa"/>
+            <w:shd w:val="clear" w:color="auto" w:fill="F4F4F5"/>
+            <w:tcMar>
+              <w:top w:w="90" w:type="dxa"/>
+              <w:right w:w="120" w:type="dxa"/>
+              <w:bottom w:w="90" w:type="dxa"/>
+              <w:left w:w="120" w:type="dxa"/>
             </w:tcMar>
             <w:vAlign w:val="center"/>
           </w:tcPr>
@@ -952,11 +891,13 @@
             </w:pPr>
             <w:r>
               <w:rPr>
-                <w:sz w:val="20"/>
-                <w:szCs w:val="20"/>
+                <w:rFonts w:ascii="Assistant" w:hAnsi="Assistant" w:cs="Assistant" w:eastAsia="Assistant"/>
+                <w:sz w:val="18"/>
+                <w:szCs w:val="18"/>
                 <w:rtl/>
                 <w:b/>
                 <w:bCs/>
+                <w:color w:val="52525B"/>
               </w:rPr>
               <w:t xml:space="preserve">שם לקוח</w:t>
             </w:r>
@@ -967,17 +908,12 @@
         <w:tc>
           <w:tcPr>
             <w:tcW w:w="2160" w:type="dxa"/>
-            <w:tcBorders>
-              <w:top w:val="single" w:sz="6" w:space="0" w:color="D3DCE3"/>
-              <w:right w:val="single" w:sz="6" w:space="0" w:color="D3DCE3"/>
-              <w:bottom w:val="single" w:sz="6" w:space="0" w:color="D3DCE3"/>
-              <w:left w:val="single" w:sz="6" w:space="0" w:color="D3DCE3"/>
-            </w:tcBorders>
-            <w:tcMar>
-              <w:top w:w="90" w:type="dxa"/>
-              <w:right w:w="80" w:type="dxa"/>
-              <w:bottom w:w="90" w:type="dxa"/>
-              <w:left w:w="80" w:type="dxa"/>
+            <w:shd w:val="clear" w:color="auto" w:fill="FAFAFA"/>
+            <w:tcMar>
+              <w:top w:w="90" w:type="dxa"/>
+              <w:right w:w="120" w:type="dxa"/>
+              <w:bottom w:w="90" w:type="dxa"/>
+              <w:left w:w="120" w:type="dxa"/>
             </w:tcMar>
             <w:vAlign w:val="center"/>
           </w:tcPr>
@@ -989,6 +925,7 @@
             </w:pPr>
             <w:r>
               <w:rPr>
+                <w:rFonts w:ascii="Assistant" w:hAnsi="Assistant" w:cs="Assistant" w:eastAsia="Assistant"/>
                 <w:sz w:val="20"/>
                 <w:szCs w:val="20"/>
                 <w:rtl/>
@@ -1000,18 +937,12 @@
         <w:tc>
           <w:tcPr>
             <w:tcW w:w="1200" w:type="dxa"/>
-            <w:shd w:val="clear" w:color="auto" w:fill="EAF1F5"/>
-            <w:tcBorders>
-              <w:top w:val="single" w:sz="6" w:space="0" w:color="D3DCE3"/>
-              <w:right w:val="single" w:sz="6" w:space="0" w:color="D3DCE3"/>
-              <w:bottom w:val="single" w:sz="6" w:space="0" w:color="D3DCE3"/>
-              <w:left w:val="single" w:sz="6" w:space="0" w:color="D3DCE3"/>
-            </w:tcBorders>
-            <w:tcMar>
-              <w:top w:w="90" w:type="dxa"/>
-              <w:right w:w="80" w:type="dxa"/>
-              <w:bottom w:w="90" w:type="dxa"/>
-              <w:left w:w="80" w:type="dxa"/>
+            <w:shd w:val="clear" w:color="auto" w:fill="F4F4F5"/>
+            <w:tcMar>
+              <w:top w:w="90" w:type="dxa"/>
+              <w:right w:w="120" w:type="dxa"/>
+              <w:bottom w:w="90" w:type="dxa"/>
+              <w:left w:w="120" w:type="dxa"/>
             </w:tcMar>
             <w:vAlign w:val="center"/>
           </w:tcPr>
@@ -1023,11 +954,13 @@
             </w:pPr>
             <w:r>
               <w:rPr>
-                <w:sz w:val="20"/>
-                <w:szCs w:val="20"/>
+                <w:rFonts w:ascii="Assistant" w:hAnsi="Assistant" w:cs="Assistant" w:eastAsia="Assistant"/>
+                <w:sz w:val="18"/>
+                <w:szCs w:val="18"/>
                 <w:rtl/>
                 <w:b/>
                 <w:bCs/>
+                <w:color w:val="52525B"/>
               </w:rPr>
               <w:t xml:space="preserve">כתובת</w:t>
             </w:r>
@@ -1036,17 +969,12 @@
         <w:tc>
           <w:tcPr>
             <w:tcW w:w="2160" w:type="dxa"/>
-            <w:tcBorders>
-              <w:top w:val="single" w:sz="6" w:space="0" w:color="D3DCE3"/>
-              <w:right w:val="single" w:sz="6" w:space="0" w:color="D3DCE3"/>
-              <w:bottom w:val="single" w:sz="6" w:space="0" w:color="D3DCE3"/>
-              <w:left w:val="single" w:sz="6" w:space="0" w:color="D3DCE3"/>
-            </w:tcBorders>
-            <w:tcMar>
-              <w:top w:w="90" w:type="dxa"/>
-              <w:right w:w="80" w:type="dxa"/>
-              <w:bottom w:w="90" w:type="dxa"/>
-              <w:left w:w="80" w:type="dxa"/>
+            <w:shd w:val="clear" w:color="auto" w:fill="FAFAFA"/>
+            <w:tcMar>
+              <w:top w:w="90" w:type="dxa"/>
+              <w:right w:w="120" w:type="dxa"/>
+              <w:bottom w:w="90" w:type="dxa"/>
+              <w:left w:w="120" w:type="dxa"/>
             </w:tcMar>
             <w:vAlign w:val="center"/>
           </w:tcPr>
@@ -1058,6 +986,7 @@
             </w:pPr>
             <w:r>
               <w:rPr>
+                <w:rFonts w:ascii="Assistant" w:hAnsi="Assistant" w:cs="Assistant" w:eastAsia="Assistant"/>
                 <w:sz w:val="20"/>
                 <w:szCs w:val="20"/>
                 <w:rtl/>
@@ -1069,18 +998,12 @@
         <w:tc>
           <w:tcPr>
             <w:tcW w:w="1200" w:type="dxa"/>
-            <w:shd w:val="clear" w:color="auto" w:fill="EAF1F5"/>
-            <w:tcBorders>
-              <w:top w:val="single" w:sz="6" w:space="0" w:color="D3DCE3"/>
-              <w:right w:val="single" w:sz="6" w:space="0" w:color="D3DCE3"/>
-              <w:bottom w:val="single" w:sz="6" w:space="0" w:color="D3DCE3"/>
-              <w:left w:val="single" w:sz="6" w:space="0" w:color="D3DCE3"/>
-            </w:tcBorders>
-            <w:tcMar>
-              <w:top w:w="90" w:type="dxa"/>
-              <w:right w:w="80" w:type="dxa"/>
-              <w:bottom w:w="90" w:type="dxa"/>
-              <w:left w:w="80" w:type="dxa"/>
+            <w:shd w:val="clear" w:color="auto" w:fill="F4F4F5"/>
+            <w:tcMar>
+              <w:top w:w="90" w:type="dxa"/>
+              <w:right w:w="120" w:type="dxa"/>
+              <w:bottom w:w="90" w:type="dxa"/>
+              <w:left w:w="120" w:type="dxa"/>
             </w:tcMar>
             <w:vAlign w:val="center"/>
           </w:tcPr>
@@ -1092,11 +1015,13 @@
             </w:pPr>
             <w:r>
               <w:rPr>
-                <w:sz w:val="20"/>
-                <w:szCs w:val="20"/>
+                <w:rFonts w:ascii="Assistant" w:hAnsi="Assistant" w:cs="Assistant" w:eastAsia="Assistant"/>
+                <w:sz w:val="18"/>
+                <w:szCs w:val="18"/>
                 <w:rtl/>
                 <w:b/>
                 <w:bCs/>
+                <w:color w:val="52525B"/>
               </w:rPr>
               <w:t xml:space="preserve">טלפון עבודה</w:t>
             </w:r>
@@ -1105,17 +1030,12 @@
         <w:tc>
           <w:tcPr>
             <w:tcW w:w="2160" w:type="dxa"/>
-            <w:tcBorders>
-              <w:top w:val="single" w:sz="6" w:space="0" w:color="D3DCE3"/>
-              <w:right w:val="single" w:sz="6" w:space="0" w:color="D3DCE3"/>
-              <w:bottom w:val="single" w:sz="6" w:space="0" w:color="D3DCE3"/>
-              <w:left w:val="single" w:sz="6" w:space="0" w:color="D3DCE3"/>
-            </w:tcBorders>
-            <w:tcMar>
-              <w:top w:w="90" w:type="dxa"/>
-              <w:right w:w="80" w:type="dxa"/>
-              <w:bottom w:w="90" w:type="dxa"/>
-              <w:left w:w="80" w:type="dxa"/>
+            <w:shd w:val="clear" w:color="auto" w:fill="FAFAFA"/>
+            <w:tcMar>
+              <w:top w:w="90" w:type="dxa"/>
+              <w:right w:w="120" w:type="dxa"/>
+              <w:bottom w:w="90" w:type="dxa"/>
+              <w:left w:w="120" w:type="dxa"/>
             </w:tcMar>
             <w:vAlign w:val="center"/>
           </w:tcPr>
@@ -1127,6 +1047,7 @@
             </w:pPr>
             <w:r>
               <w:rPr>
+                <w:rFonts w:ascii="Assistant" w:hAnsi="Assistant" w:cs="Assistant" w:eastAsia="Assistant"/>
                 <w:sz w:val="20"/>
                 <w:szCs w:val="20"/>
                 <w:rtl/>
@@ -1138,18 +1059,12 @@
         <w:tc>
           <w:tcPr>
             <w:tcW w:w="1200" w:type="dxa"/>
-            <w:shd w:val="clear" w:color="auto" w:fill="EAF1F5"/>
-            <w:tcBorders>
-              <w:top w:val="single" w:sz="6" w:space="0" w:color="D3DCE3"/>
-              <w:right w:val="single" w:sz="6" w:space="0" w:color="D3DCE3"/>
-              <w:bottom w:val="single" w:sz="6" w:space="0" w:color="D3DCE3"/>
-              <w:left w:val="single" w:sz="6" w:space="0" w:color="D3DCE3"/>
-            </w:tcBorders>
-            <w:tcMar>
-              <w:top w:w="90" w:type="dxa"/>
-              <w:right w:w="80" w:type="dxa"/>
-              <w:bottom w:w="90" w:type="dxa"/>
-              <w:left w:w="80" w:type="dxa"/>
+            <w:shd w:val="clear" w:color="auto" w:fill="F4F4F5"/>
+            <w:tcMar>
+              <w:top w:w="90" w:type="dxa"/>
+              <w:right w:w="120" w:type="dxa"/>
+              <w:bottom w:w="90" w:type="dxa"/>
+              <w:left w:w="120" w:type="dxa"/>
             </w:tcMar>
             <w:vAlign w:val="center"/>
           </w:tcPr>
@@ -1161,11 +1076,13 @@
             </w:pPr>
             <w:r>
               <w:rPr>
-                <w:sz w:val="20"/>
-                <w:szCs w:val="20"/>
+                <w:rFonts w:ascii="Assistant" w:hAnsi="Assistant" w:cs="Assistant" w:eastAsia="Assistant"/>
+                <w:sz w:val="18"/>
+                <w:szCs w:val="18"/>
                 <w:rtl/>
                 <w:b/>
                 <w:bCs/>
+                <w:color w:val="52525B"/>
               </w:rPr>
               <w:t xml:space="preserve">טלפון בית</w:t>
             </w:r>
@@ -1176,70 +1093,42 @@
     <w:p>
       <w:pPr>
         <w:bidi/>
-        <w:spacing w:after="80"/>
+        <w:spacing w:after="180"/>
       </w:pPr>
+    </w:p>
+    <w:p>
+      <w:pPr>
+        <w:jc w:val="center"/>
+        <w:bidi/>
+        <w:spacing w:before="240" w:after="80"/>
+        <w:keepNext/>
+      </w:pPr>
+      <w:r>
+        <w:rPr>
+          <w:rFonts w:ascii="Assistant" w:hAnsi="Assistant" w:cs="Assistant" w:eastAsia="Assistant"/>
+          <w:sz w:val="28"/>
+          <w:szCs w:val="28"/>
+          <w:rtl/>
+          <w:b/>
+          <w:bCs/>
+          <w:color w:val="18181B"/>
+        </w:rPr>
+        <w:t xml:space="preserve">צוות ותפעול</w:t>
+      </w:r>
     </w:p>
     <w:tbl>
       <w:tblPr>
         <w:tblW w:w="10080" w:type="dxa"/>
         <w:tblLayout w:type="fixed"/>
         <w:jc w:val="right"/>
-        <w:tblCellMar>
-          <w:top w:w="0" w:type="dxa"/>
-          <w:right w:w="0" w:type="dxa"/>
-          <w:bottom w:w="0" w:type="dxa"/>
-          <w:left w:w="0" w:type="dxa"/>
-        </w:tblCellMar>
-      </w:tblPr>
-      <w:tblGrid>
-        <w:gridCol w:w="10080"/>
-      </w:tblGrid>
-      <w:tr>
-        <w:tc>
-          <w:tcPr>
-            <w:tcW w:w="10080" w:type="dxa"/>
-            <w:shd w:val="clear" w:color="auto" w:fill="D7E4EA"/>
-            <w:tcBorders>
-              <w:top w:val="single" w:sz="6" w:space="0" w:color="D3DCE3"/>
-              <w:right w:val="single" w:sz="6" w:space="0" w:color="D3DCE3"/>
-              <w:bottom w:val="single" w:sz="6" w:space="0" w:color="D3DCE3"/>
-              <w:left w:val="single" w:sz="6" w:space="0" w:color="D3DCE3"/>
-            </w:tcBorders>
-            <w:tcMar>
-              <w:top w:w="110" w:type="dxa"/>
-              <w:right w:w="180" w:type="dxa"/>
-              <w:bottom w:w="110" w:type="dxa"/>
-              <w:left w:w="180" w:type="dxa"/>
-            </w:tcMar>
-            <w:vAlign w:val="center"/>
-          </w:tcPr>
-          <w:p>
-            <w:pPr>
-              <w:jc w:val="right"/>
-              <w:bidi/>
-              <w:spacing w:before="0" w:after="0"/>
-              <w:keepNext/>
-            </w:pPr>
-            <w:r>
-              <w:rPr>
-                <w:sz w:val="24"/>
-                <w:szCs w:val="24"/>
-                <w:rtl/>
-                <w:b/>
-                <w:bCs/>
-                <w:color w:val="244550"/>
-              </w:rPr>
-              <w:t xml:space="preserve">צוות ותפעול</w:t>
-            </w:r>
-          </w:p>
-        </w:tc>
-      </w:tr>
-    </w:tbl>
-    <w:tbl>
-      <w:tblPr>
-        <w:tblW w:w="10080" w:type="dxa"/>
-        <w:tblLayout w:type="fixed"/>
-        <w:jc w:val="right"/>
+        <w:tblBorders>
+          <w:top w:val="single" w:sz="4" w:space="0" w:color="E4E4E7"/>
+          <w:left w:val="single" w:sz="4" w:space="0" w:color="E4E4E7"/>
+          <w:bottom w:val="single" w:sz="4" w:space="0" w:color="E4E4E7"/>
+          <w:right w:val="single" w:sz="4" w:space="0" w:color="E4E4E7"/>
+          <w:insideH w:val="single" w:sz="4" w:space="0" w:color="E4E4E7"/>
+          <w:insideV w:val="single" w:sz="4" w:space="0" w:color="E4E4E7"/>
+        </w:tblBorders>
         <w:tblCellMar>
           <w:top w:w="0" w:type="dxa"/>
           <w:right w:w="0" w:type="dxa"/>
@@ -1259,17 +1148,12 @@
         <w:tc>
           <w:tcPr>
             <w:tcW w:w="2160" w:type="dxa"/>
-            <w:tcBorders>
-              <w:top w:val="single" w:sz="6" w:space="0" w:color="D3DCE3"/>
-              <w:right w:val="single" w:sz="6" w:space="0" w:color="D3DCE3"/>
-              <w:bottom w:val="single" w:sz="6" w:space="0" w:color="D3DCE3"/>
-              <w:left w:val="single" w:sz="6" w:space="0" w:color="D3DCE3"/>
-            </w:tcBorders>
-            <w:tcMar>
-              <w:top w:w="90" w:type="dxa"/>
-              <w:right w:w="80" w:type="dxa"/>
-              <w:bottom w:w="90" w:type="dxa"/>
-              <w:left w:w="80" w:type="dxa"/>
+            <w:shd w:val="clear" w:color="auto" w:fill="FAFAFA"/>
+            <w:tcMar>
+              <w:top w:w="90" w:type="dxa"/>
+              <w:right w:w="120" w:type="dxa"/>
+              <w:bottom w:w="90" w:type="dxa"/>
+              <w:left w:w="120" w:type="dxa"/>
             </w:tcMar>
             <w:vAlign w:val="center"/>
           </w:tcPr>
@@ -1281,6 +1165,7 @@
             </w:pPr>
             <w:r>
               <w:rPr>
+                <w:rFonts w:ascii="Assistant" w:hAnsi="Assistant" w:cs="Assistant" w:eastAsia="Assistant"/>
                 <w:sz w:val="20"/>
                 <w:szCs w:val="20"/>
                 <w:rtl/>
@@ -1292,18 +1177,12 @@
         <w:tc>
           <w:tcPr>
             <w:tcW w:w="1200" w:type="dxa"/>
-            <w:shd w:val="clear" w:color="auto" w:fill="EAF1F5"/>
-            <w:tcBorders>
-              <w:top w:val="single" w:sz="6" w:space="0" w:color="D3DCE3"/>
-              <w:right w:val="single" w:sz="6" w:space="0" w:color="D3DCE3"/>
-              <w:bottom w:val="single" w:sz="6" w:space="0" w:color="D3DCE3"/>
-              <w:left w:val="single" w:sz="6" w:space="0" w:color="D3DCE3"/>
-            </w:tcBorders>
-            <w:tcMar>
-              <w:top w:w="90" w:type="dxa"/>
-              <w:right w:w="80" w:type="dxa"/>
-              <w:bottom w:w="90" w:type="dxa"/>
-              <w:left w:w="80" w:type="dxa"/>
+            <w:shd w:val="clear" w:color="auto" w:fill="F4F4F5"/>
+            <w:tcMar>
+              <w:top w:w="90" w:type="dxa"/>
+              <w:right w:w="120" w:type="dxa"/>
+              <w:bottom w:w="90" w:type="dxa"/>
+              <w:left w:w="120" w:type="dxa"/>
             </w:tcMar>
             <w:vAlign w:val="center"/>
           </w:tcPr>
@@ -1315,11 +1194,13 @@
             </w:pPr>
             <w:r>
               <w:rPr>
-                <w:sz w:val="20"/>
-                <w:szCs w:val="20"/>
+                <w:rFonts w:ascii="Assistant" w:hAnsi="Assistant" w:cs="Assistant" w:eastAsia="Assistant"/>
+                <w:sz w:val="18"/>
+                <w:szCs w:val="18"/>
                 <w:rtl/>
                 <w:b/>
                 <w:bCs/>
+                <w:color w:val="52525B"/>
               </w:rPr>
               <w:t xml:space="preserve">מוסר עבודה</w:t>
             </w:r>
@@ -1328,17 +1209,12 @@
         <w:tc>
           <w:tcPr>
             <w:tcW w:w="2160" w:type="dxa"/>
-            <w:tcBorders>
-              <w:top w:val="single" w:sz="6" w:space="0" w:color="D3DCE3"/>
-              <w:right w:val="single" w:sz="6" w:space="0" w:color="D3DCE3"/>
-              <w:bottom w:val="single" w:sz="6" w:space="0" w:color="D3DCE3"/>
-              <w:left w:val="single" w:sz="6" w:space="0" w:color="D3DCE3"/>
-            </w:tcBorders>
-            <w:tcMar>
-              <w:top w:w="90" w:type="dxa"/>
-              <w:right w:w="80" w:type="dxa"/>
-              <w:bottom w:w="90" w:type="dxa"/>
-              <w:left w:w="80" w:type="dxa"/>
+            <w:shd w:val="clear" w:color="auto" w:fill="FAFAFA"/>
+            <w:tcMar>
+              <w:top w:w="90" w:type="dxa"/>
+              <w:right w:w="120" w:type="dxa"/>
+              <w:bottom w:w="90" w:type="dxa"/>
+              <w:left w:w="120" w:type="dxa"/>
             </w:tcMar>
             <w:vAlign w:val="center"/>
           </w:tcPr>
@@ -1350,6 +1226,7 @@
             </w:pPr>
             <w:r>
               <w:rPr>
+                <w:rFonts w:ascii="Assistant" w:hAnsi="Assistant" w:cs="Assistant" w:eastAsia="Assistant"/>
                 <w:sz w:val="20"/>
                 <w:szCs w:val="20"/>
                 <w:rtl/>
@@ -1361,18 +1238,12 @@
         <w:tc>
           <w:tcPr>
             <w:tcW w:w="1200" w:type="dxa"/>
-            <w:shd w:val="clear" w:color="auto" w:fill="EAF1F5"/>
-            <w:tcBorders>
-              <w:top w:val="single" w:sz="6" w:space="0" w:color="D3DCE3"/>
-              <w:right w:val="single" w:sz="6" w:space="0" w:color="D3DCE3"/>
-              <w:bottom w:val="single" w:sz="6" w:space="0" w:color="D3DCE3"/>
-              <w:left w:val="single" w:sz="6" w:space="0" w:color="D3DCE3"/>
-            </w:tcBorders>
-            <w:tcMar>
-              <w:top w:w="90" w:type="dxa"/>
-              <w:right w:w="80" w:type="dxa"/>
-              <w:bottom w:w="90" w:type="dxa"/>
-              <w:left w:w="80" w:type="dxa"/>
+            <w:shd w:val="clear" w:color="auto" w:fill="F4F4F5"/>
+            <w:tcMar>
+              <w:top w:w="90" w:type="dxa"/>
+              <w:right w:w="120" w:type="dxa"/>
+              <w:bottom w:w="90" w:type="dxa"/>
+              <w:left w:w="120" w:type="dxa"/>
             </w:tcMar>
             <w:vAlign w:val="center"/>
           </w:tcPr>
@@ -1384,11 +1255,13 @@
             </w:pPr>
             <w:r>
               <w:rPr>
-                <w:sz w:val="20"/>
-                <w:szCs w:val="20"/>
+                <w:rFonts w:ascii="Assistant" w:hAnsi="Assistant" w:cs="Assistant" w:eastAsia="Assistant"/>
+                <w:sz w:val="18"/>
+                <w:szCs w:val="18"/>
                 <w:rtl/>
                 <w:b/>
                 <w:bCs/>
+                <w:color w:val="52525B"/>
               </w:rPr>
               <w:t xml:space="preserve">יועץ</w:t>
             </w:r>
@@ -1397,17 +1270,12 @@
         <w:tc>
           <w:tcPr>
             <w:tcW w:w="2160" w:type="dxa"/>
-            <w:tcBorders>
-              <w:top w:val="single" w:sz="6" w:space="0" w:color="D3DCE3"/>
-              <w:right w:val="single" w:sz="6" w:space="0" w:color="D3DCE3"/>
-              <w:bottom w:val="single" w:sz="6" w:space="0" w:color="D3DCE3"/>
-              <w:left w:val="single" w:sz="6" w:space="0" w:color="D3DCE3"/>
-            </w:tcBorders>
-            <w:tcMar>
-              <w:top w:w="90" w:type="dxa"/>
-              <w:right w:w="80" w:type="dxa"/>
-              <w:bottom w:w="90" w:type="dxa"/>
-              <w:left w:w="80" w:type="dxa"/>
+            <w:shd w:val="clear" w:color="auto" w:fill="FAFAFA"/>
+            <w:tcMar>
+              <w:top w:w="90" w:type="dxa"/>
+              <w:right w:w="120" w:type="dxa"/>
+              <w:bottom w:w="90" w:type="dxa"/>
+              <w:left w:w="120" w:type="dxa"/>
             </w:tcMar>
             <w:vAlign w:val="center"/>
           </w:tcPr>
@@ -1419,6 +1287,7 @@
             </w:pPr>
             <w:r>
               <w:rPr>
+                <w:rFonts w:ascii="Assistant" w:hAnsi="Assistant" w:cs="Assistant" w:eastAsia="Assistant"/>
                 <w:sz w:val="20"/>
                 <w:szCs w:val="20"/>
                 <w:rtl/>
@@ -1430,18 +1299,12 @@
         <w:tc>
           <w:tcPr>
             <w:tcW w:w="1200" w:type="dxa"/>
-            <w:shd w:val="clear" w:color="auto" w:fill="EAF1F5"/>
-            <w:tcBorders>
-              <w:top w:val="single" w:sz="6" w:space="0" w:color="D3DCE3"/>
-              <w:right w:val="single" w:sz="6" w:space="0" w:color="D3DCE3"/>
-              <w:bottom w:val="single" w:sz="6" w:space="0" w:color="D3DCE3"/>
-              <w:left w:val="single" w:sz="6" w:space="0" w:color="D3DCE3"/>
-            </w:tcBorders>
-            <w:tcMar>
-              <w:top w:w="90" w:type="dxa"/>
-              <w:right w:w="80" w:type="dxa"/>
-              <w:bottom w:w="90" w:type="dxa"/>
-              <w:left w:w="80" w:type="dxa"/>
+            <w:shd w:val="clear" w:color="auto" w:fill="F4F4F5"/>
+            <w:tcMar>
+              <w:top w:w="90" w:type="dxa"/>
+              <w:right w:w="120" w:type="dxa"/>
+              <w:bottom w:w="90" w:type="dxa"/>
+              <w:left w:w="120" w:type="dxa"/>
             </w:tcMar>
             <w:vAlign w:val="center"/>
           </w:tcPr>
@@ -1453,11 +1316,13 @@
             </w:pPr>
             <w:r>
               <w:rPr>
-                <w:sz w:val="20"/>
-                <w:szCs w:val="20"/>
+                <w:rFonts w:ascii="Assistant" w:hAnsi="Assistant" w:cs="Assistant" w:eastAsia="Assistant"/>
+                <w:sz w:val="18"/>
+                <w:szCs w:val="18"/>
                 <w:rtl/>
                 <w:b/>
                 <w:bCs/>
+                <w:color w:val="52525B"/>
               </w:rPr>
               <w:t xml:space="preserve">אופטומטריסט</w:t>
             </w:r>
@@ -1468,70 +1333,42 @@
     <w:p>
       <w:pPr>
         <w:bidi/>
-        <w:spacing w:after="80"/>
+        <w:spacing w:after="180"/>
       </w:pPr>
+    </w:p>
+    <w:p>
+      <w:pPr>
+        <w:jc w:val="center"/>
+        <w:bidi/>
+        <w:spacing w:before="240" w:after="80"/>
+        <w:keepNext/>
+      </w:pPr>
+      <w:r>
+        <w:rPr>
+          <w:rFonts w:ascii="Assistant" w:hAnsi="Assistant" w:cs="Assistant" w:eastAsia="Assistant"/>
+          <w:sz w:val="28"/>
+          <w:szCs w:val="28"/>
+          <w:rtl/>
+          <w:b/>
+          <w:bCs/>
+          <w:color w:val="18181B"/>
+        </w:rPr>
+        <w:t xml:space="preserve">פרטי עדשות</w:t>
+      </w:r>
     </w:p>
     <w:tbl>
       <w:tblPr>
-        <w:tblW w:w="10080" w:type="dxa"/>
+        <w:tblW w:w="10076" w:type="dxa"/>
         <w:tblLayout w:type="fixed"/>
         <w:jc w:val="right"/>
-        <w:tblCellMar>
-          <w:top w:w="0" w:type="dxa"/>
-          <w:right w:w="0" w:type="dxa"/>
-          <w:bottom w:w="0" w:type="dxa"/>
-          <w:left w:w="0" w:type="dxa"/>
-        </w:tblCellMar>
-      </w:tblPr>
-      <w:tblGrid>
-        <w:gridCol w:w="10080"/>
-      </w:tblGrid>
-      <w:tr>
-        <w:tc>
-          <w:tcPr>
-            <w:tcW w:w="10080" w:type="dxa"/>
-            <w:shd w:val="clear" w:color="auto" w:fill="D7E4EA"/>
-            <w:tcBorders>
-              <w:top w:val="single" w:sz="6" w:space="0" w:color="D3DCE3"/>
-              <w:right w:val="single" w:sz="6" w:space="0" w:color="D3DCE3"/>
-              <w:bottom w:val="single" w:sz="6" w:space="0" w:color="D3DCE3"/>
-              <w:left w:val="single" w:sz="6" w:space="0" w:color="D3DCE3"/>
-            </w:tcBorders>
-            <w:tcMar>
-              <w:top w:w="110" w:type="dxa"/>
-              <w:right w:w="180" w:type="dxa"/>
-              <w:bottom w:w="110" w:type="dxa"/>
-              <w:left w:w="180" w:type="dxa"/>
-            </w:tcMar>
-            <w:vAlign w:val="center"/>
-          </w:tcPr>
-          <w:p>
-            <w:pPr>
-              <w:jc w:val="right"/>
-              <w:bidi/>
-              <w:spacing w:before="0" w:after="0"/>
-              <w:keepNext/>
-            </w:pPr>
-            <w:r>
-              <w:rPr>
-                <w:sz w:val="24"/>
-                <w:szCs w:val="24"/>
-                <w:rtl/>
-                <w:b/>
-                <w:bCs/>
-                <w:color w:val="244550"/>
-              </w:rPr>
-              <w:t xml:space="preserve">פרטי עדשות</w:t>
-            </w:r>
-          </w:p>
-        </w:tc>
-      </w:tr>
-    </w:tbl>
-    <w:tbl>
-      <w:tblPr>
-        <w:tblW w:w="10080" w:type="dxa"/>
-        <w:tblLayout w:type="fixed"/>
-        <w:jc w:val="right"/>
+        <w:tblBorders>
+          <w:top w:val="single" w:sz="4" w:space="0" w:color="E4E4E7"/>
+          <w:left w:val="single" w:sz="4" w:space="0" w:color="E4E4E7"/>
+          <w:bottom w:val="single" w:sz="4" w:space="0" w:color="E4E4E7"/>
+          <w:right w:val="single" w:sz="4" w:space="0" w:color="E4E4E7"/>
+          <w:insideH w:val="single" w:sz="4" w:space="0" w:color="E4E4E7"/>
+          <w:insideV w:val="single" w:sz="4" w:space="0" w:color="E4E4E7"/>
+        </w:tblBorders>
         <w:tblCellMar>
           <w:top w:w="0" w:type="dxa"/>
           <w:right w:w="0" w:type="dxa"/>
@@ -1552,18 +1389,12 @@
         <w:tc>
           <w:tcPr>
             <w:tcW w:w="1496" w:type="dxa"/>
-            <w:shd w:val="clear" w:color="auto" w:fill="EAF1F5"/>
-            <w:tcBorders>
-              <w:top w:val="single" w:sz="6" w:space="0" w:color="D3DCE3"/>
-              <w:right w:val="single" w:sz="6" w:space="0" w:color="D3DCE3"/>
-              <w:bottom w:val="single" w:sz="6" w:space="0" w:color="D3DCE3"/>
-              <w:left w:val="single" w:sz="6" w:space="0" w:color="D3DCE3"/>
-            </w:tcBorders>
-            <w:tcMar>
-              <w:top w:w="90" w:type="dxa"/>
-              <w:right w:w="80" w:type="dxa"/>
-              <w:bottom w:w="90" w:type="dxa"/>
-              <w:left w:w="80" w:type="dxa"/>
+            <w:shd w:val="clear" w:color="auto" w:fill="F4F4F5"/>
+            <w:tcMar>
+              <w:top w:w="90" w:type="dxa"/>
+              <w:right w:w="120" w:type="dxa"/>
+              <w:bottom w:w="90" w:type="dxa"/>
+              <w:left w:w="120" w:type="dxa"/>
             </w:tcMar>
             <w:vAlign w:val="center"/>
           </w:tcPr>
@@ -1575,11 +1406,13 @@
             </w:pPr>
             <w:r>
               <w:rPr>
-                <w:sz w:val="20"/>
-                <w:szCs w:val="20"/>
+                <w:rFonts w:ascii="Assistant" w:hAnsi="Assistant" w:cs="Assistant" w:eastAsia="Assistant"/>
+                <w:sz w:val="18"/>
+                <w:szCs w:val="18"/>
                 <w:rtl/>
                 <w:b/>
                 <w:bCs/>
+                <w:color w:val="52525B"/>
               </w:rPr>
               <w:t xml:space="preserve">כמות</w:t>
             </w:r>
@@ -1588,18 +1421,12 @@
         <w:tc>
           <w:tcPr>
             <w:tcW w:w="1496" w:type="dxa"/>
-            <w:shd w:val="clear" w:color="auto" w:fill="EAF1F5"/>
-            <w:tcBorders>
-              <w:top w:val="single" w:sz="6" w:space="0" w:color="D3DCE3"/>
-              <w:right w:val="single" w:sz="6" w:space="0" w:color="D3DCE3"/>
-              <w:bottom w:val="single" w:sz="6" w:space="0" w:color="D3DCE3"/>
-              <w:left w:val="single" w:sz="6" w:space="0" w:color="D3DCE3"/>
-            </w:tcBorders>
-            <w:tcMar>
-              <w:top w:w="90" w:type="dxa"/>
-              <w:right w:w="80" w:type="dxa"/>
-              <w:bottom w:w="90" w:type="dxa"/>
-              <w:left w:w="80" w:type="dxa"/>
+            <w:shd w:val="clear" w:color="auto" w:fill="F4F4F5"/>
+            <w:tcMar>
+              <w:top w:w="90" w:type="dxa"/>
+              <w:right w:w="120" w:type="dxa"/>
+              <w:bottom w:w="90" w:type="dxa"/>
+              <w:left w:w="120" w:type="dxa"/>
             </w:tcMar>
             <w:vAlign w:val="center"/>
           </w:tcPr>
@@ -1611,11 +1438,13 @@
             </w:pPr>
             <w:r>
               <w:rPr>
-                <w:sz w:val="20"/>
-                <w:szCs w:val="20"/>
+                <w:rFonts w:ascii="Assistant" w:hAnsi="Assistant" w:cs="Assistant" w:eastAsia="Assistant"/>
+                <w:sz w:val="18"/>
+                <w:szCs w:val="18"/>
                 <w:rtl/>
                 <w:b/>
                 <w:bCs/>
+                <w:color w:val="52525B"/>
               </w:rPr>
               <w:t xml:space="preserve">צבע</w:t>
             </w:r>
@@ -1624,18 +1453,12 @@
         <w:tc>
           <w:tcPr>
             <w:tcW w:w="1496" w:type="dxa"/>
-            <w:shd w:val="clear" w:color="auto" w:fill="EAF1F5"/>
-            <w:tcBorders>
-              <w:top w:val="single" w:sz="6" w:space="0" w:color="D3DCE3"/>
-              <w:right w:val="single" w:sz="6" w:space="0" w:color="D3DCE3"/>
-              <w:bottom w:val="single" w:sz="6" w:space="0" w:color="D3DCE3"/>
-              <w:left w:val="single" w:sz="6" w:space="0" w:color="D3DCE3"/>
-            </w:tcBorders>
-            <w:tcMar>
-              <w:top w:w="90" w:type="dxa"/>
-              <w:right w:w="80" w:type="dxa"/>
-              <w:bottom w:w="90" w:type="dxa"/>
-              <w:left w:w="80" w:type="dxa"/>
+            <w:shd w:val="clear" w:color="auto" w:fill="F4F4F5"/>
+            <w:tcMar>
+              <w:top w:w="90" w:type="dxa"/>
+              <w:right w:w="120" w:type="dxa"/>
+              <w:bottom w:w="90" w:type="dxa"/>
+              <w:left w:w="120" w:type="dxa"/>
             </w:tcMar>
             <w:vAlign w:val="center"/>
           </w:tcPr>
@@ -1647,11 +1470,13 @@
             </w:pPr>
             <w:r>
               <w:rPr>
-                <w:sz w:val="20"/>
-                <w:szCs w:val="20"/>
+                <w:rFonts w:ascii="Assistant" w:hAnsi="Assistant" w:cs="Assistant" w:eastAsia="Assistant"/>
+                <w:sz w:val="18"/>
+                <w:szCs w:val="18"/>
                 <w:rtl/>
                 <w:b/>
                 <w:bCs/>
+                <w:color w:val="52525B"/>
               </w:rPr>
               <w:t xml:space="preserve">חומר</w:t>
             </w:r>
@@ -1660,18 +1485,12 @@
         <w:tc>
           <w:tcPr>
             <w:tcW w:w="1496" w:type="dxa"/>
-            <w:shd w:val="clear" w:color="auto" w:fill="EAF1F5"/>
-            <w:tcBorders>
-              <w:top w:val="single" w:sz="6" w:space="0" w:color="D3DCE3"/>
-              <w:right w:val="single" w:sz="6" w:space="0" w:color="D3DCE3"/>
-              <w:bottom w:val="single" w:sz="6" w:space="0" w:color="D3DCE3"/>
-              <w:left w:val="single" w:sz="6" w:space="0" w:color="D3DCE3"/>
-            </w:tcBorders>
-            <w:tcMar>
-              <w:top w:w="90" w:type="dxa"/>
-              <w:right w:w="80" w:type="dxa"/>
-              <w:bottom w:w="90" w:type="dxa"/>
-              <w:left w:w="80" w:type="dxa"/>
+            <w:shd w:val="clear" w:color="auto" w:fill="F4F4F5"/>
+            <w:tcMar>
+              <w:top w:w="90" w:type="dxa"/>
+              <w:right w:w="120" w:type="dxa"/>
+              <w:bottom w:w="90" w:type="dxa"/>
+              <w:left w:w="120" w:type="dxa"/>
             </w:tcMar>
             <w:vAlign w:val="center"/>
           </w:tcPr>
@@ -1683,11 +1502,13 @@
             </w:pPr>
             <w:r>
               <w:rPr>
-                <w:sz w:val="20"/>
-                <w:szCs w:val="20"/>
+                <w:rFonts w:ascii="Assistant" w:hAnsi="Assistant" w:cs="Assistant" w:eastAsia="Assistant"/>
+                <w:sz w:val="18"/>
+                <w:szCs w:val="18"/>
                 <w:rtl/>
                 <w:b/>
                 <w:bCs/>
+                <w:color w:val="52525B"/>
               </w:rPr>
               <w:t xml:space="preserve">ספק</w:t>
             </w:r>
@@ -1696,18 +1517,12 @@
         <w:tc>
           <w:tcPr>
             <w:tcW w:w="1496" w:type="dxa"/>
-            <w:shd w:val="clear" w:color="auto" w:fill="EAF1F5"/>
-            <w:tcBorders>
-              <w:top w:val="single" w:sz="6" w:space="0" w:color="D3DCE3"/>
-              <w:right w:val="single" w:sz="6" w:space="0" w:color="D3DCE3"/>
-              <w:bottom w:val="single" w:sz="6" w:space="0" w:color="D3DCE3"/>
-              <w:left w:val="single" w:sz="6" w:space="0" w:color="D3DCE3"/>
-            </w:tcBorders>
-            <w:tcMar>
-              <w:top w:w="90" w:type="dxa"/>
-              <w:right w:w="80" w:type="dxa"/>
-              <w:bottom w:w="90" w:type="dxa"/>
-              <w:left w:w="80" w:type="dxa"/>
+            <w:shd w:val="clear" w:color="auto" w:fill="F4F4F5"/>
+            <w:tcMar>
+              <w:top w:w="90" w:type="dxa"/>
+              <w:right w:w="120" w:type="dxa"/>
+              <w:bottom w:w="90" w:type="dxa"/>
+              <w:left w:w="120" w:type="dxa"/>
             </w:tcMar>
             <w:vAlign w:val="center"/>
           </w:tcPr>
@@ -1719,11 +1534,13 @@
             </w:pPr>
             <w:r>
               <w:rPr>
-                <w:sz w:val="20"/>
-                <w:szCs w:val="20"/>
+                <w:rFonts w:ascii="Assistant" w:hAnsi="Assistant" w:cs="Assistant" w:eastAsia="Assistant"/>
+                <w:sz w:val="18"/>
+                <w:szCs w:val="18"/>
                 <w:rtl/>
                 <w:b/>
                 <w:bCs/>
+                <w:color w:val="52525B"/>
               </w:rPr>
               <w:t xml:space="preserve">דגם</w:t>
             </w:r>
@@ -1732,18 +1549,12 @@
         <w:tc>
           <w:tcPr>
             <w:tcW w:w="1496" w:type="dxa"/>
-            <w:shd w:val="clear" w:color="auto" w:fill="EAF1F5"/>
-            <w:tcBorders>
-              <w:top w:val="single" w:sz="6" w:space="0" w:color="D3DCE3"/>
-              <w:right w:val="single" w:sz="6" w:space="0" w:color="D3DCE3"/>
-              <w:bottom w:val="single" w:sz="6" w:space="0" w:color="D3DCE3"/>
-              <w:left w:val="single" w:sz="6" w:space="0" w:color="D3DCE3"/>
-            </w:tcBorders>
-            <w:tcMar>
-              <w:top w:w="90" w:type="dxa"/>
-              <w:right w:w="80" w:type="dxa"/>
-              <w:bottom w:w="90" w:type="dxa"/>
-              <w:left w:w="80" w:type="dxa"/>
+            <w:shd w:val="clear" w:color="auto" w:fill="F4F4F5"/>
+            <w:tcMar>
+              <w:top w:w="90" w:type="dxa"/>
+              <w:right w:w="120" w:type="dxa"/>
+              <w:bottom w:w="90" w:type="dxa"/>
+              <w:left w:w="120" w:type="dxa"/>
             </w:tcMar>
             <w:vAlign w:val="center"/>
           </w:tcPr>
@@ -1755,11 +1566,13 @@
             </w:pPr>
             <w:r>
               <w:rPr>
-                <w:sz w:val="20"/>
-                <w:szCs w:val="20"/>
+                <w:rFonts w:ascii="Assistant" w:hAnsi="Assistant" w:cs="Assistant" w:eastAsia="Assistant"/>
+                <w:sz w:val="18"/>
+                <w:szCs w:val="18"/>
                 <w:rtl/>
                 <w:b/>
                 <w:bCs/>
+                <w:color w:val="52525B"/>
               </w:rPr>
               <w:t xml:space="preserve">סוג</w:t>
             </w:r>
@@ -1768,18 +1581,12 @@
         <w:tc>
           <w:tcPr>
             <w:tcW w:w="1100" w:type="dxa"/>
-            <w:shd w:val="clear" w:color="auto" w:fill="D7E4EA"/>
-            <w:tcBorders>
-              <w:top w:val="single" w:sz="6" w:space="0" w:color="D3DCE3"/>
-              <w:right w:val="single" w:sz="6" w:space="0" w:color="D3DCE3"/>
-              <w:bottom w:val="single" w:sz="6" w:space="0" w:color="D3DCE3"/>
-              <w:left w:val="single" w:sz="6" w:space="0" w:color="D3DCE3"/>
-            </w:tcBorders>
-            <w:tcMar>
-              <w:top w:w="90" w:type="dxa"/>
-              <w:right w:w="80" w:type="dxa"/>
-              <w:bottom w:w="90" w:type="dxa"/>
-              <w:left w:w="80" w:type="dxa"/>
+            <w:shd w:val="clear" w:color="auto" w:fill="18181B"/>
+            <w:tcMar>
+              <w:top w:w="90" w:type="dxa"/>
+              <w:right w:w="120" w:type="dxa"/>
+              <w:bottom w:w="90" w:type="dxa"/>
+              <w:left w:w="120" w:type="dxa"/>
             </w:tcMar>
             <w:vAlign w:val="center"/>
           </w:tcPr>
@@ -1791,11 +1598,13 @@
             </w:pPr>
             <w:r>
               <w:rPr>
-                <w:sz w:val="20"/>
-                <w:szCs w:val="20"/>
+                <w:rFonts w:ascii="Assistant" w:hAnsi="Assistant" w:cs="Assistant" w:eastAsia="Assistant"/>
+                <w:sz w:val="18"/>
+                <w:szCs w:val="18"/>
                 <w:rtl/>
                 <w:b/>
                 <w:bCs/>
+                <w:color w:val="FFFFFF"/>
               </w:rPr>
               <w:t xml:space="preserve">עין</w:t>
             </w:r>
@@ -1806,28 +1615,24 @@
         <w:tc>
           <w:tcPr>
             <w:tcW w:w="1496" w:type="dxa"/>
-            <w:tcBorders>
-              <w:top w:val="single" w:sz="6" w:space="0" w:color="D3DCE3"/>
-              <w:right w:val="single" w:sz="6" w:space="0" w:color="D3DCE3"/>
-              <w:bottom w:val="single" w:sz="6" w:space="0" w:color="D3DCE3"/>
-              <w:left w:val="single" w:sz="6" w:space="0" w:color="D3DCE3"/>
-            </w:tcBorders>
-            <w:tcMar>
-              <w:top w:w="90" w:type="dxa"/>
-              <w:right w:w="80" w:type="dxa"/>
-              <w:bottom w:w="90" w:type="dxa"/>
-              <w:left w:w="80" w:type="dxa"/>
-            </w:tcMar>
-            <w:vAlign w:val="center"/>
-          </w:tcPr>
-          <w:p>
-            <w:pPr>
-              <w:jc w:val="right"/>
-              <w:bidi/>
-              <w:spacing w:before="0" w:after="0"/>
-            </w:pPr>
-            <w:r>
-              <w:rPr>
+            <w:shd w:val="clear" w:color="auto" w:fill="FAFAFA"/>
+            <w:tcMar>
+              <w:top w:w="90" w:type="dxa"/>
+              <w:right w:w="120" w:type="dxa"/>
+              <w:bottom w:w="90" w:type="dxa"/>
+              <w:left w:w="120" w:type="dxa"/>
+            </w:tcMar>
+            <w:vAlign w:val="center"/>
+          </w:tcPr>
+          <w:p>
+            <w:pPr>
+              <w:jc w:val="center"/>
+              <w:bidi/>
+              <w:spacing w:before="0" w:after="0"/>
+            </w:pPr>
+            <w:r>
+              <w:rPr>
+                <w:rFonts w:ascii="Assistant" w:hAnsi="Assistant" w:cs="Assistant" w:eastAsia="Assistant"/>
                 <w:sz w:val="20"/>
                 <w:szCs w:val="20"/>
                 <w:rtl/>
@@ -1839,28 +1644,24 @@
         <w:tc>
           <w:tcPr>
             <w:tcW w:w="1496" w:type="dxa"/>
-            <w:tcBorders>
-              <w:top w:val="single" w:sz="6" w:space="0" w:color="D3DCE3"/>
-              <w:right w:val="single" w:sz="6" w:space="0" w:color="D3DCE3"/>
-              <w:bottom w:val="single" w:sz="6" w:space="0" w:color="D3DCE3"/>
-              <w:left w:val="single" w:sz="6" w:space="0" w:color="D3DCE3"/>
-            </w:tcBorders>
-            <w:tcMar>
-              <w:top w:w="90" w:type="dxa"/>
-              <w:right w:w="80" w:type="dxa"/>
-              <w:bottom w:w="90" w:type="dxa"/>
-              <w:left w:w="80" w:type="dxa"/>
-            </w:tcMar>
-            <w:vAlign w:val="center"/>
-          </w:tcPr>
-          <w:p>
-            <w:pPr>
-              <w:jc w:val="right"/>
-              <w:bidi/>
-              <w:spacing w:before="0" w:after="0"/>
-            </w:pPr>
-            <w:r>
-              <w:rPr>
+            <w:shd w:val="clear" w:color="auto" w:fill="FAFAFA"/>
+            <w:tcMar>
+              <w:top w:w="90" w:type="dxa"/>
+              <w:right w:w="120" w:type="dxa"/>
+              <w:bottom w:w="90" w:type="dxa"/>
+              <w:left w:w="120" w:type="dxa"/>
+            </w:tcMar>
+            <w:vAlign w:val="center"/>
+          </w:tcPr>
+          <w:p>
+            <w:pPr>
+              <w:jc w:val="center"/>
+              <w:bidi/>
+              <w:spacing w:before="0" w:after="0"/>
+            </w:pPr>
+            <w:r>
+              <w:rPr>
+                <w:rFonts w:ascii="Assistant" w:hAnsi="Assistant" w:cs="Assistant" w:eastAsia="Assistant"/>
                 <w:sz w:val="20"/>
                 <w:szCs w:val="20"/>
                 <w:rtl/>
@@ -1872,28 +1673,24 @@
         <w:tc>
           <w:tcPr>
             <w:tcW w:w="1496" w:type="dxa"/>
-            <w:tcBorders>
-              <w:top w:val="single" w:sz="6" w:space="0" w:color="D3DCE3"/>
-              <w:right w:val="single" w:sz="6" w:space="0" w:color="D3DCE3"/>
-              <w:bottom w:val="single" w:sz="6" w:space="0" w:color="D3DCE3"/>
-              <w:left w:val="single" w:sz="6" w:space="0" w:color="D3DCE3"/>
-            </w:tcBorders>
-            <w:tcMar>
-              <w:top w:w="90" w:type="dxa"/>
-              <w:right w:w="80" w:type="dxa"/>
-              <w:bottom w:w="90" w:type="dxa"/>
-              <w:left w:w="80" w:type="dxa"/>
-            </w:tcMar>
-            <w:vAlign w:val="center"/>
-          </w:tcPr>
-          <w:p>
-            <w:pPr>
-              <w:jc w:val="right"/>
-              <w:bidi/>
-              <w:spacing w:before="0" w:after="0"/>
-            </w:pPr>
-            <w:r>
-              <w:rPr>
+            <w:shd w:val="clear" w:color="auto" w:fill="FAFAFA"/>
+            <w:tcMar>
+              <w:top w:w="90" w:type="dxa"/>
+              <w:right w:w="120" w:type="dxa"/>
+              <w:bottom w:w="90" w:type="dxa"/>
+              <w:left w:w="120" w:type="dxa"/>
+            </w:tcMar>
+            <w:vAlign w:val="center"/>
+          </w:tcPr>
+          <w:p>
+            <w:pPr>
+              <w:jc w:val="center"/>
+              <w:bidi/>
+              <w:spacing w:before="0" w:after="0"/>
+            </w:pPr>
+            <w:r>
+              <w:rPr>
+                <w:rFonts w:ascii="Assistant" w:hAnsi="Assistant" w:cs="Assistant" w:eastAsia="Assistant"/>
                 <w:sz w:val="20"/>
                 <w:szCs w:val="20"/>
                 <w:rtl/>
@@ -1905,28 +1702,24 @@
         <w:tc>
           <w:tcPr>
             <w:tcW w:w="1496" w:type="dxa"/>
-            <w:tcBorders>
-              <w:top w:val="single" w:sz="6" w:space="0" w:color="D3DCE3"/>
-              <w:right w:val="single" w:sz="6" w:space="0" w:color="D3DCE3"/>
-              <w:bottom w:val="single" w:sz="6" w:space="0" w:color="D3DCE3"/>
-              <w:left w:val="single" w:sz="6" w:space="0" w:color="D3DCE3"/>
-            </w:tcBorders>
-            <w:tcMar>
-              <w:top w:w="90" w:type="dxa"/>
-              <w:right w:w="80" w:type="dxa"/>
-              <w:bottom w:w="90" w:type="dxa"/>
-              <w:left w:w="80" w:type="dxa"/>
-            </w:tcMar>
-            <w:vAlign w:val="center"/>
-          </w:tcPr>
-          <w:p>
-            <w:pPr>
-              <w:jc w:val="right"/>
-              <w:bidi/>
-              <w:spacing w:before="0" w:after="0"/>
-            </w:pPr>
-            <w:r>
-              <w:rPr>
+            <w:shd w:val="clear" w:color="auto" w:fill="FAFAFA"/>
+            <w:tcMar>
+              <w:top w:w="90" w:type="dxa"/>
+              <w:right w:w="120" w:type="dxa"/>
+              <w:bottom w:w="90" w:type="dxa"/>
+              <w:left w:w="120" w:type="dxa"/>
+            </w:tcMar>
+            <w:vAlign w:val="center"/>
+          </w:tcPr>
+          <w:p>
+            <w:pPr>
+              <w:jc w:val="center"/>
+              <w:bidi/>
+              <w:spacing w:before="0" w:after="0"/>
+            </w:pPr>
+            <w:r>
+              <w:rPr>
+                <w:rFonts w:ascii="Assistant" w:hAnsi="Assistant" w:cs="Assistant" w:eastAsia="Assistant"/>
                 <w:sz w:val="20"/>
                 <w:szCs w:val="20"/>
                 <w:rtl/>
@@ -1938,28 +1731,24 @@
         <w:tc>
           <w:tcPr>
             <w:tcW w:w="1496" w:type="dxa"/>
-            <w:tcBorders>
-              <w:top w:val="single" w:sz="6" w:space="0" w:color="D3DCE3"/>
-              <w:right w:val="single" w:sz="6" w:space="0" w:color="D3DCE3"/>
-              <w:bottom w:val="single" w:sz="6" w:space="0" w:color="D3DCE3"/>
-              <w:left w:val="single" w:sz="6" w:space="0" w:color="D3DCE3"/>
-            </w:tcBorders>
-            <w:tcMar>
-              <w:top w:w="90" w:type="dxa"/>
-              <w:right w:w="80" w:type="dxa"/>
-              <w:bottom w:w="90" w:type="dxa"/>
-              <w:left w:w="80" w:type="dxa"/>
-            </w:tcMar>
-            <w:vAlign w:val="center"/>
-          </w:tcPr>
-          <w:p>
-            <w:pPr>
-              <w:jc w:val="right"/>
-              <w:bidi/>
-              <w:spacing w:before="0" w:after="0"/>
-            </w:pPr>
-            <w:r>
-              <w:rPr>
+            <w:shd w:val="clear" w:color="auto" w:fill="FAFAFA"/>
+            <w:tcMar>
+              <w:top w:w="90" w:type="dxa"/>
+              <w:right w:w="120" w:type="dxa"/>
+              <w:bottom w:w="90" w:type="dxa"/>
+              <w:left w:w="120" w:type="dxa"/>
+            </w:tcMar>
+            <w:vAlign w:val="center"/>
+          </w:tcPr>
+          <w:p>
+            <w:pPr>
+              <w:jc w:val="center"/>
+              <w:bidi/>
+              <w:spacing w:before="0" w:after="0"/>
+            </w:pPr>
+            <w:r>
+              <w:rPr>
+                <w:rFonts w:ascii="Assistant" w:hAnsi="Assistant" w:cs="Assistant" w:eastAsia="Assistant"/>
                 <w:sz w:val="20"/>
                 <w:szCs w:val="20"/>
                 <w:rtl/>
@@ -1971,28 +1760,24 @@
         <w:tc>
           <w:tcPr>
             <w:tcW w:w="1496" w:type="dxa"/>
-            <w:tcBorders>
-              <w:top w:val="single" w:sz="6" w:space="0" w:color="D3DCE3"/>
-              <w:right w:val="single" w:sz="6" w:space="0" w:color="D3DCE3"/>
-              <w:bottom w:val="single" w:sz="6" w:space="0" w:color="D3DCE3"/>
-              <w:left w:val="single" w:sz="6" w:space="0" w:color="D3DCE3"/>
-            </w:tcBorders>
-            <w:tcMar>
-              <w:top w:w="90" w:type="dxa"/>
-              <w:right w:w="80" w:type="dxa"/>
-              <w:bottom w:w="90" w:type="dxa"/>
-              <w:left w:w="80" w:type="dxa"/>
-            </w:tcMar>
-            <w:vAlign w:val="center"/>
-          </w:tcPr>
-          <w:p>
-            <w:pPr>
-              <w:jc w:val="right"/>
-              <w:bidi/>
-              <w:spacing w:before="0" w:after="0"/>
-            </w:pPr>
-            <w:r>
-              <w:rPr>
+            <w:shd w:val="clear" w:color="auto" w:fill="FAFAFA"/>
+            <w:tcMar>
+              <w:top w:w="90" w:type="dxa"/>
+              <w:right w:w="120" w:type="dxa"/>
+              <w:bottom w:w="90" w:type="dxa"/>
+              <w:left w:w="120" w:type="dxa"/>
+            </w:tcMar>
+            <w:vAlign w:val="center"/>
+          </w:tcPr>
+          <w:p>
+            <w:pPr>
+              <w:jc w:val="center"/>
+              <w:bidi/>
+              <w:spacing w:before="0" w:after="0"/>
+            </w:pPr>
+            <w:r>
+              <w:rPr>
+                <w:rFonts w:ascii="Assistant" w:hAnsi="Assistant" w:cs="Assistant" w:eastAsia="Assistant"/>
                 <w:sz w:val="20"/>
                 <w:szCs w:val="20"/>
                 <w:rtl/>
@@ -2004,18 +1789,12 @@
         <w:tc>
           <w:tcPr>
             <w:tcW w:w="1100" w:type="dxa"/>
-            <w:shd w:val="clear" w:color="auto" w:fill="D7E4EA"/>
-            <w:tcBorders>
-              <w:top w:val="single" w:sz="6" w:space="0" w:color="D3DCE3"/>
-              <w:right w:val="single" w:sz="6" w:space="0" w:color="D3DCE3"/>
-              <w:bottom w:val="single" w:sz="6" w:space="0" w:color="D3DCE3"/>
-              <w:left w:val="single" w:sz="6" w:space="0" w:color="D3DCE3"/>
-            </w:tcBorders>
-            <w:tcMar>
-              <w:top w:w="90" w:type="dxa"/>
-              <w:right w:w="80" w:type="dxa"/>
-              <w:bottom w:w="90" w:type="dxa"/>
-              <w:left w:w="80" w:type="dxa"/>
+            <w:shd w:val="clear" w:color="auto" w:fill="F4F4F5"/>
+            <w:tcMar>
+              <w:top w:w="90" w:type="dxa"/>
+              <w:right w:w="120" w:type="dxa"/>
+              <w:bottom w:w="90" w:type="dxa"/>
+              <w:left w:w="120" w:type="dxa"/>
             </w:tcMar>
             <w:vAlign w:val="center"/>
           </w:tcPr>
@@ -2027,6 +1806,7 @@
             </w:pPr>
             <w:r>
               <w:rPr>
+                <w:rFonts w:ascii="Assistant" w:hAnsi="Assistant" w:cs="Assistant" w:eastAsia="Assistant"/>
                 <w:sz w:val="20"/>
                 <w:szCs w:val="20"/>
                 <w:rtl/>
@@ -2042,28 +1822,24 @@
         <w:tc>
           <w:tcPr>
             <w:tcW w:w="1496" w:type="dxa"/>
-            <w:tcBorders>
-              <w:top w:val="single" w:sz="6" w:space="0" w:color="D3DCE3"/>
-              <w:right w:val="single" w:sz="6" w:space="0" w:color="D3DCE3"/>
-              <w:bottom w:val="single" w:sz="6" w:space="0" w:color="D3DCE3"/>
-              <w:left w:val="single" w:sz="6" w:space="0" w:color="D3DCE3"/>
-            </w:tcBorders>
-            <w:tcMar>
-              <w:top w:w="90" w:type="dxa"/>
-              <w:right w:w="80" w:type="dxa"/>
-              <w:bottom w:w="90" w:type="dxa"/>
-              <w:left w:w="80" w:type="dxa"/>
-            </w:tcMar>
-            <w:vAlign w:val="center"/>
-          </w:tcPr>
-          <w:p>
-            <w:pPr>
-              <w:jc w:val="right"/>
-              <w:bidi/>
-              <w:spacing w:before="0" w:after="0"/>
-            </w:pPr>
-            <w:r>
-              <w:rPr>
+            <w:shd w:val="clear" w:color="auto" w:fill="FAFAFA"/>
+            <w:tcMar>
+              <w:top w:w="90" w:type="dxa"/>
+              <w:right w:w="120" w:type="dxa"/>
+              <w:bottom w:w="90" w:type="dxa"/>
+              <w:left w:w="120" w:type="dxa"/>
+            </w:tcMar>
+            <w:vAlign w:val="center"/>
+          </w:tcPr>
+          <w:p>
+            <w:pPr>
+              <w:jc w:val="center"/>
+              <w:bidi/>
+              <w:spacing w:before="0" w:after="0"/>
+            </w:pPr>
+            <w:r>
+              <w:rPr>
+                <w:rFonts w:ascii="Assistant" w:hAnsi="Assistant" w:cs="Assistant" w:eastAsia="Assistant"/>
                 <w:sz w:val="20"/>
                 <w:szCs w:val="20"/>
                 <w:rtl/>
@@ -2075,28 +1851,24 @@
         <w:tc>
           <w:tcPr>
             <w:tcW w:w="1496" w:type="dxa"/>
-            <w:tcBorders>
-              <w:top w:val="single" w:sz="6" w:space="0" w:color="D3DCE3"/>
-              <w:right w:val="single" w:sz="6" w:space="0" w:color="D3DCE3"/>
-              <w:bottom w:val="single" w:sz="6" w:space="0" w:color="D3DCE3"/>
-              <w:left w:val="single" w:sz="6" w:space="0" w:color="D3DCE3"/>
-            </w:tcBorders>
-            <w:tcMar>
-              <w:top w:w="90" w:type="dxa"/>
-              <w:right w:w="80" w:type="dxa"/>
-              <w:bottom w:w="90" w:type="dxa"/>
-              <w:left w:w="80" w:type="dxa"/>
-            </w:tcMar>
-            <w:vAlign w:val="center"/>
-          </w:tcPr>
-          <w:p>
-            <w:pPr>
-              <w:jc w:val="right"/>
-              <w:bidi/>
-              <w:spacing w:before="0" w:after="0"/>
-            </w:pPr>
-            <w:r>
-              <w:rPr>
+            <w:shd w:val="clear" w:color="auto" w:fill="FAFAFA"/>
+            <w:tcMar>
+              <w:top w:w="90" w:type="dxa"/>
+              <w:right w:w="120" w:type="dxa"/>
+              <w:bottom w:w="90" w:type="dxa"/>
+              <w:left w:w="120" w:type="dxa"/>
+            </w:tcMar>
+            <w:vAlign w:val="center"/>
+          </w:tcPr>
+          <w:p>
+            <w:pPr>
+              <w:jc w:val="center"/>
+              <w:bidi/>
+              <w:spacing w:before="0" w:after="0"/>
+            </w:pPr>
+            <w:r>
+              <w:rPr>
+                <w:rFonts w:ascii="Assistant" w:hAnsi="Assistant" w:cs="Assistant" w:eastAsia="Assistant"/>
                 <w:sz w:val="20"/>
                 <w:szCs w:val="20"/>
                 <w:rtl/>
@@ -2108,28 +1880,24 @@
         <w:tc>
           <w:tcPr>
             <w:tcW w:w="1496" w:type="dxa"/>
-            <w:tcBorders>
-              <w:top w:val="single" w:sz="6" w:space="0" w:color="D3DCE3"/>
-              <w:right w:val="single" w:sz="6" w:space="0" w:color="D3DCE3"/>
-              <w:bottom w:val="single" w:sz="6" w:space="0" w:color="D3DCE3"/>
-              <w:left w:val="single" w:sz="6" w:space="0" w:color="D3DCE3"/>
-            </w:tcBorders>
-            <w:tcMar>
-              <w:top w:w="90" w:type="dxa"/>
-              <w:right w:w="80" w:type="dxa"/>
-              <w:bottom w:w="90" w:type="dxa"/>
-              <w:left w:w="80" w:type="dxa"/>
-            </w:tcMar>
-            <w:vAlign w:val="center"/>
-          </w:tcPr>
-          <w:p>
-            <w:pPr>
-              <w:jc w:val="right"/>
-              <w:bidi/>
-              <w:spacing w:before="0" w:after="0"/>
-            </w:pPr>
-            <w:r>
-              <w:rPr>
+            <w:shd w:val="clear" w:color="auto" w:fill="FAFAFA"/>
+            <w:tcMar>
+              <w:top w:w="90" w:type="dxa"/>
+              <w:right w:w="120" w:type="dxa"/>
+              <w:bottom w:w="90" w:type="dxa"/>
+              <w:left w:w="120" w:type="dxa"/>
+            </w:tcMar>
+            <w:vAlign w:val="center"/>
+          </w:tcPr>
+          <w:p>
+            <w:pPr>
+              <w:jc w:val="center"/>
+              <w:bidi/>
+              <w:spacing w:before="0" w:after="0"/>
+            </w:pPr>
+            <w:r>
+              <w:rPr>
+                <w:rFonts w:ascii="Assistant" w:hAnsi="Assistant" w:cs="Assistant" w:eastAsia="Assistant"/>
                 <w:sz w:val="20"/>
                 <w:szCs w:val="20"/>
                 <w:rtl/>
@@ -2141,28 +1909,24 @@
         <w:tc>
           <w:tcPr>
             <w:tcW w:w="1496" w:type="dxa"/>
-            <w:tcBorders>
-              <w:top w:val="single" w:sz="6" w:space="0" w:color="D3DCE3"/>
-              <w:right w:val="single" w:sz="6" w:space="0" w:color="D3DCE3"/>
-              <w:bottom w:val="single" w:sz="6" w:space="0" w:color="D3DCE3"/>
-              <w:left w:val="single" w:sz="6" w:space="0" w:color="D3DCE3"/>
-            </w:tcBorders>
-            <w:tcMar>
-              <w:top w:w="90" w:type="dxa"/>
-              <w:right w:w="80" w:type="dxa"/>
-              <w:bottom w:w="90" w:type="dxa"/>
-              <w:left w:w="80" w:type="dxa"/>
-            </w:tcMar>
-            <w:vAlign w:val="center"/>
-          </w:tcPr>
-          <w:p>
-            <w:pPr>
-              <w:jc w:val="right"/>
-              <w:bidi/>
-              <w:spacing w:before="0" w:after="0"/>
-            </w:pPr>
-            <w:r>
-              <w:rPr>
+            <w:shd w:val="clear" w:color="auto" w:fill="FAFAFA"/>
+            <w:tcMar>
+              <w:top w:w="90" w:type="dxa"/>
+              <w:right w:w="120" w:type="dxa"/>
+              <w:bottom w:w="90" w:type="dxa"/>
+              <w:left w:w="120" w:type="dxa"/>
+            </w:tcMar>
+            <w:vAlign w:val="center"/>
+          </w:tcPr>
+          <w:p>
+            <w:pPr>
+              <w:jc w:val="center"/>
+              <w:bidi/>
+              <w:spacing w:before="0" w:after="0"/>
+            </w:pPr>
+            <w:r>
+              <w:rPr>
+                <w:rFonts w:ascii="Assistant" w:hAnsi="Assistant" w:cs="Assistant" w:eastAsia="Assistant"/>
                 <w:sz w:val="20"/>
                 <w:szCs w:val="20"/>
                 <w:rtl/>
@@ -2174,28 +1938,24 @@
         <w:tc>
           <w:tcPr>
             <w:tcW w:w="1496" w:type="dxa"/>
-            <w:tcBorders>
-              <w:top w:val="single" w:sz="6" w:space="0" w:color="D3DCE3"/>
-              <w:right w:val="single" w:sz="6" w:space="0" w:color="D3DCE3"/>
-              <w:bottom w:val="single" w:sz="6" w:space="0" w:color="D3DCE3"/>
-              <w:left w:val="single" w:sz="6" w:space="0" w:color="D3DCE3"/>
-            </w:tcBorders>
-            <w:tcMar>
-              <w:top w:w="90" w:type="dxa"/>
-              <w:right w:w="80" w:type="dxa"/>
-              <w:bottom w:w="90" w:type="dxa"/>
-              <w:left w:w="80" w:type="dxa"/>
-            </w:tcMar>
-            <w:vAlign w:val="center"/>
-          </w:tcPr>
-          <w:p>
-            <w:pPr>
-              <w:jc w:val="right"/>
-              <w:bidi/>
-              <w:spacing w:before="0" w:after="0"/>
-            </w:pPr>
-            <w:r>
-              <w:rPr>
+            <w:shd w:val="clear" w:color="auto" w:fill="FAFAFA"/>
+            <w:tcMar>
+              <w:top w:w="90" w:type="dxa"/>
+              <w:right w:w="120" w:type="dxa"/>
+              <w:bottom w:w="90" w:type="dxa"/>
+              <w:left w:w="120" w:type="dxa"/>
+            </w:tcMar>
+            <w:vAlign w:val="center"/>
+          </w:tcPr>
+          <w:p>
+            <w:pPr>
+              <w:jc w:val="center"/>
+              <w:bidi/>
+              <w:spacing w:before="0" w:after="0"/>
+            </w:pPr>
+            <w:r>
+              <w:rPr>
+                <w:rFonts w:ascii="Assistant" w:hAnsi="Assistant" w:cs="Assistant" w:eastAsia="Assistant"/>
                 <w:sz w:val="20"/>
                 <w:szCs w:val="20"/>
                 <w:rtl/>
@@ -2207,28 +1967,24 @@
         <w:tc>
           <w:tcPr>
             <w:tcW w:w="1496" w:type="dxa"/>
-            <w:tcBorders>
-              <w:top w:val="single" w:sz="6" w:space="0" w:color="D3DCE3"/>
-              <w:right w:val="single" w:sz="6" w:space="0" w:color="D3DCE3"/>
-              <w:bottom w:val="single" w:sz="6" w:space="0" w:color="D3DCE3"/>
-              <w:left w:val="single" w:sz="6" w:space="0" w:color="D3DCE3"/>
-            </w:tcBorders>
-            <w:tcMar>
-              <w:top w:w="90" w:type="dxa"/>
-              <w:right w:w="80" w:type="dxa"/>
-              <w:bottom w:w="90" w:type="dxa"/>
-              <w:left w:w="80" w:type="dxa"/>
-            </w:tcMar>
-            <w:vAlign w:val="center"/>
-          </w:tcPr>
-          <w:p>
-            <w:pPr>
-              <w:jc w:val="right"/>
-              <w:bidi/>
-              <w:spacing w:before="0" w:after="0"/>
-            </w:pPr>
-            <w:r>
-              <w:rPr>
+            <w:shd w:val="clear" w:color="auto" w:fill="FAFAFA"/>
+            <w:tcMar>
+              <w:top w:w="90" w:type="dxa"/>
+              <w:right w:w="120" w:type="dxa"/>
+              <w:bottom w:w="90" w:type="dxa"/>
+              <w:left w:w="120" w:type="dxa"/>
+            </w:tcMar>
+            <w:vAlign w:val="center"/>
+          </w:tcPr>
+          <w:p>
+            <w:pPr>
+              <w:jc w:val="center"/>
+              <w:bidi/>
+              <w:spacing w:before="0" w:after="0"/>
+            </w:pPr>
+            <w:r>
+              <w:rPr>
+                <w:rFonts w:ascii="Assistant" w:hAnsi="Assistant" w:cs="Assistant" w:eastAsia="Assistant"/>
                 <w:sz w:val="20"/>
                 <w:szCs w:val="20"/>
                 <w:rtl/>
@@ -2240,18 +1996,12 @@
         <w:tc>
           <w:tcPr>
             <w:tcW w:w="1100" w:type="dxa"/>
-            <w:shd w:val="clear" w:color="auto" w:fill="D7E4EA"/>
-            <w:tcBorders>
-              <w:top w:val="single" w:sz="6" w:space="0" w:color="D3DCE3"/>
-              <w:right w:val="single" w:sz="6" w:space="0" w:color="D3DCE3"/>
-              <w:bottom w:val="single" w:sz="6" w:space="0" w:color="D3DCE3"/>
-              <w:left w:val="single" w:sz="6" w:space="0" w:color="D3DCE3"/>
-            </w:tcBorders>
-            <w:tcMar>
-              <w:top w:w="90" w:type="dxa"/>
-              <w:right w:w="80" w:type="dxa"/>
-              <w:bottom w:w="90" w:type="dxa"/>
-              <w:left w:w="80" w:type="dxa"/>
+            <w:shd w:val="clear" w:color="auto" w:fill="F4F4F5"/>
+            <w:tcMar>
+              <w:top w:w="90" w:type="dxa"/>
+              <w:right w:w="120" w:type="dxa"/>
+              <w:bottom w:w="90" w:type="dxa"/>
+              <w:left w:w="120" w:type="dxa"/>
             </w:tcMar>
             <w:vAlign w:val="center"/>
           </w:tcPr>
@@ -2263,6 +2013,7 @@
             </w:pPr>
             <w:r>
               <w:rPr>
+                <w:rFonts w:ascii="Assistant" w:hAnsi="Assistant" w:cs="Assistant" w:eastAsia="Assistant"/>
                 <w:sz w:val="20"/>
                 <w:szCs w:val="20"/>
                 <w:rtl/>
@@ -2278,70 +2029,42 @@
     <w:p>
       <w:pPr>
         <w:bidi/>
-        <w:spacing w:after="80"/>
+        <w:spacing w:after="180"/>
       </w:pPr>
+    </w:p>
+    <w:p>
+      <w:pPr>
+        <w:jc w:val="center"/>
+        <w:bidi/>
+        <w:spacing w:before="240" w:after="80"/>
+        <w:keepNext/>
+      </w:pPr>
+      <w:r>
+        <w:rPr>
+          <w:rFonts w:ascii="Assistant" w:hAnsi="Assistant" w:cs="Assistant" w:eastAsia="Assistant"/>
+          <w:sz w:val="28"/>
+          <w:szCs w:val="28"/>
+          <w:rtl/>
+          <w:b/>
+          <w:bCs/>
+          <w:color w:val="18181B"/>
+        </w:rPr>
+        <w:t xml:space="preserve">מרשם עדשות מגע</w:t>
+      </w:r>
     </w:p>
     <w:tbl>
       <w:tblPr>
-        <w:tblW w:w="10080" w:type="dxa"/>
+        <w:tblW w:w="10076" w:type="dxa"/>
         <w:tblLayout w:type="fixed"/>
         <w:jc w:val="right"/>
-        <w:tblCellMar>
-          <w:top w:w="0" w:type="dxa"/>
-          <w:right w:w="0" w:type="dxa"/>
-          <w:bottom w:w="0" w:type="dxa"/>
-          <w:left w:w="0" w:type="dxa"/>
-        </w:tblCellMar>
-      </w:tblPr>
-      <w:tblGrid>
-        <w:gridCol w:w="10080"/>
-      </w:tblGrid>
-      <w:tr>
-        <w:tc>
-          <w:tcPr>
-            <w:tcW w:w="10080" w:type="dxa"/>
-            <w:shd w:val="clear" w:color="auto" w:fill="D7E4EA"/>
-            <w:tcBorders>
-              <w:top w:val="single" w:sz="6" w:space="0" w:color="D3DCE3"/>
-              <w:right w:val="single" w:sz="6" w:space="0" w:color="D3DCE3"/>
-              <w:bottom w:val="single" w:sz="6" w:space="0" w:color="D3DCE3"/>
-              <w:left w:val="single" w:sz="6" w:space="0" w:color="D3DCE3"/>
-            </w:tcBorders>
-            <w:tcMar>
-              <w:top w:w="110" w:type="dxa"/>
-              <w:right w:w="180" w:type="dxa"/>
-              <w:bottom w:w="110" w:type="dxa"/>
-              <w:left w:w="180" w:type="dxa"/>
-            </w:tcMar>
-            <w:vAlign w:val="center"/>
-          </w:tcPr>
-          <w:p>
-            <w:pPr>
-              <w:jc w:val="right"/>
-              <w:bidi/>
-              <w:spacing w:before="0" w:after="0"/>
-              <w:keepNext/>
-            </w:pPr>
-            <w:r>
-              <w:rPr>
-                <w:sz w:val="24"/>
-                <w:szCs w:val="24"/>
-                <w:rtl/>
-                <w:b/>
-                <w:bCs/>
-                <w:color w:val="244550"/>
-              </w:rPr>
-              <w:t xml:space="preserve">מרשם עדשות מגע</w:t>
-            </w:r>
-          </w:p>
-        </w:tc>
-      </w:tr>
-    </w:tbl>
-    <w:tbl>
-      <w:tblPr>
-        <w:tblW w:w="10080" w:type="dxa"/>
-        <w:tblLayout w:type="fixed"/>
-        <w:jc w:val="right"/>
+        <w:tblBorders>
+          <w:top w:val="single" w:sz="4" w:space="0" w:color="E4E4E7"/>
+          <w:left w:val="single" w:sz="4" w:space="0" w:color="E4E4E7"/>
+          <w:bottom w:val="single" w:sz="4" w:space="0" w:color="E4E4E7"/>
+          <w:right w:val="single" w:sz="4" w:space="0" w:color="E4E4E7"/>
+          <w:insideH w:val="single" w:sz="4" w:space="0" w:color="E4E4E7"/>
+          <w:insideV w:val="single" w:sz="4" w:space="0" w:color="E4E4E7"/>
+        </w:tblBorders>
         <w:tblCellMar>
           <w:top w:w="0" w:type="dxa"/>
           <w:right w:w="0" w:type="dxa"/>
@@ -2364,18 +2087,12 @@
         <w:tc>
           <w:tcPr>
             <w:tcW w:w="1122" w:type="dxa"/>
-            <w:shd w:val="clear" w:color="auto" w:fill="EAF1F5"/>
-            <w:tcBorders>
-              <w:top w:val="single" w:sz="6" w:space="0" w:color="D3DCE3"/>
-              <w:right w:val="single" w:sz="6" w:space="0" w:color="D3DCE3"/>
-              <w:bottom w:val="single" w:sz="6" w:space="0" w:color="D3DCE3"/>
-              <w:left w:val="single" w:sz="6" w:space="0" w:color="D3DCE3"/>
-            </w:tcBorders>
-            <w:tcMar>
-              <w:top w:w="90" w:type="dxa"/>
-              <w:right w:w="80" w:type="dxa"/>
-              <w:bottom w:w="90" w:type="dxa"/>
-              <w:left w:w="80" w:type="dxa"/>
+            <w:shd w:val="clear" w:color="auto" w:fill="F4F4F5"/>
+            <w:tcMar>
+              <w:top w:w="90" w:type="dxa"/>
+              <w:right w:w="120" w:type="dxa"/>
+              <w:bottom w:w="90" w:type="dxa"/>
+              <w:left w:w="120" w:type="dxa"/>
             </w:tcMar>
             <w:vAlign w:val="center"/>
           </w:tcPr>
@@ -2387,11 +2104,13 @@
             </w:pPr>
             <w:r>
               <w:rPr>
-                <w:sz w:val="20"/>
-                <w:szCs w:val="20"/>
+                <w:rFonts w:ascii="Assistant" w:hAnsi="Assistant" w:cs="Assistant" w:eastAsia="Assistant"/>
+                <w:sz w:val="18"/>
+                <w:szCs w:val="18"/>
                 <w:rtl/>
                 <w:b/>
                 <w:bCs/>
+                <w:color w:val="52525B"/>
               </w:rPr>
               <w:t xml:space="preserve">READ/ADD</w:t>
             </w:r>
@@ -2400,18 +2119,12 @@
         <w:tc>
           <w:tcPr>
             <w:tcW w:w="1122" w:type="dxa"/>
-            <w:shd w:val="clear" w:color="auto" w:fill="EAF1F5"/>
-            <w:tcBorders>
-              <w:top w:val="single" w:sz="6" w:space="0" w:color="D3DCE3"/>
-              <w:right w:val="single" w:sz="6" w:space="0" w:color="D3DCE3"/>
-              <w:bottom w:val="single" w:sz="6" w:space="0" w:color="D3DCE3"/>
-              <w:left w:val="single" w:sz="6" w:space="0" w:color="D3DCE3"/>
-            </w:tcBorders>
-            <w:tcMar>
-              <w:top w:w="90" w:type="dxa"/>
-              <w:right w:w="80" w:type="dxa"/>
-              <w:bottom w:w="90" w:type="dxa"/>
-              <w:left w:w="80" w:type="dxa"/>
+            <w:shd w:val="clear" w:color="auto" w:fill="F4F4F5"/>
+            <w:tcMar>
+              <w:top w:w="90" w:type="dxa"/>
+              <w:right w:w="120" w:type="dxa"/>
+              <w:bottom w:w="90" w:type="dxa"/>
+              <w:left w:w="120" w:type="dxa"/>
             </w:tcMar>
             <w:vAlign w:val="center"/>
           </w:tcPr>
@@ -2423,11 +2136,13 @@
             </w:pPr>
             <w:r>
               <w:rPr>
-                <w:sz w:val="20"/>
-                <w:szCs w:val="20"/>
+                <w:rFonts w:ascii="Assistant" w:hAnsi="Assistant" w:cs="Assistant" w:eastAsia="Assistant"/>
+                <w:sz w:val="18"/>
+                <w:szCs w:val="18"/>
                 <w:rtl/>
                 <w:b/>
                 <w:bCs/>
+                <w:color w:val="52525B"/>
               </w:rPr>
               <w:t xml:space="preserve">AX</w:t>
             </w:r>
@@ -2436,18 +2151,12 @@
         <w:tc>
           <w:tcPr>
             <w:tcW w:w="1122" w:type="dxa"/>
-            <w:shd w:val="clear" w:color="auto" w:fill="EAF1F5"/>
-            <w:tcBorders>
-              <w:top w:val="single" w:sz="6" w:space="0" w:color="D3DCE3"/>
-              <w:right w:val="single" w:sz="6" w:space="0" w:color="D3DCE3"/>
-              <w:bottom w:val="single" w:sz="6" w:space="0" w:color="D3DCE3"/>
-              <w:left w:val="single" w:sz="6" w:space="0" w:color="D3DCE3"/>
-            </w:tcBorders>
-            <w:tcMar>
-              <w:top w:w="90" w:type="dxa"/>
-              <w:right w:w="80" w:type="dxa"/>
-              <w:bottom w:w="90" w:type="dxa"/>
-              <w:left w:w="80" w:type="dxa"/>
+            <w:shd w:val="clear" w:color="auto" w:fill="F4F4F5"/>
+            <w:tcMar>
+              <w:top w:w="90" w:type="dxa"/>
+              <w:right w:w="120" w:type="dxa"/>
+              <w:bottom w:w="90" w:type="dxa"/>
+              <w:left w:w="120" w:type="dxa"/>
             </w:tcMar>
             <w:vAlign w:val="center"/>
           </w:tcPr>
@@ -2459,11 +2168,13 @@
             </w:pPr>
             <w:r>
               <w:rPr>
-                <w:sz w:val="20"/>
-                <w:szCs w:val="20"/>
+                <w:rFonts w:ascii="Assistant" w:hAnsi="Assistant" w:cs="Assistant" w:eastAsia="Assistant"/>
+                <w:sz w:val="18"/>
+                <w:szCs w:val="18"/>
                 <w:rtl/>
                 <w:b/>
                 <w:bCs/>
+                <w:color w:val="52525B"/>
               </w:rPr>
               <w:t xml:space="preserve">CYL</w:t>
             </w:r>
@@ -2472,18 +2183,12 @@
         <w:tc>
           <w:tcPr>
             <w:tcW w:w="1122" w:type="dxa"/>
-            <w:shd w:val="clear" w:color="auto" w:fill="EAF1F5"/>
-            <w:tcBorders>
-              <w:top w:val="single" w:sz="6" w:space="0" w:color="D3DCE3"/>
-              <w:right w:val="single" w:sz="6" w:space="0" w:color="D3DCE3"/>
-              <w:bottom w:val="single" w:sz="6" w:space="0" w:color="D3DCE3"/>
-              <w:left w:val="single" w:sz="6" w:space="0" w:color="D3DCE3"/>
-            </w:tcBorders>
-            <w:tcMar>
-              <w:top w:w="90" w:type="dxa"/>
-              <w:right w:w="80" w:type="dxa"/>
-              <w:bottom w:w="90" w:type="dxa"/>
-              <w:left w:w="80" w:type="dxa"/>
+            <w:shd w:val="clear" w:color="auto" w:fill="F4F4F5"/>
+            <w:tcMar>
+              <w:top w:w="90" w:type="dxa"/>
+              <w:right w:w="120" w:type="dxa"/>
+              <w:bottom w:w="90" w:type="dxa"/>
+              <w:left w:w="120" w:type="dxa"/>
             </w:tcMar>
             <w:vAlign w:val="center"/>
           </w:tcPr>
@@ -2495,11 +2200,13 @@
             </w:pPr>
             <w:r>
               <w:rPr>
-                <w:sz w:val="20"/>
-                <w:szCs w:val="20"/>
+                <w:rFonts w:ascii="Assistant" w:hAnsi="Assistant" w:cs="Assistant" w:eastAsia="Assistant"/>
+                <w:sz w:val="18"/>
+                <w:szCs w:val="18"/>
                 <w:rtl/>
                 <w:b/>
                 <w:bCs/>
+                <w:color w:val="52525B"/>
               </w:rPr>
               <w:t xml:space="preserve">SPH</w:t>
             </w:r>
@@ -2508,18 +2215,12 @@
         <w:tc>
           <w:tcPr>
             <w:tcW w:w="1122" w:type="dxa"/>
-            <w:shd w:val="clear" w:color="auto" w:fill="EAF1F5"/>
-            <w:tcBorders>
-              <w:top w:val="single" w:sz="6" w:space="0" w:color="D3DCE3"/>
-              <w:right w:val="single" w:sz="6" w:space="0" w:color="D3DCE3"/>
-              <w:bottom w:val="single" w:sz="6" w:space="0" w:color="D3DCE3"/>
-              <w:left w:val="single" w:sz="6" w:space="0" w:color="D3DCE3"/>
-            </w:tcBorders>
-            <w:tcMar>
-              <w:top w:w="90" w:type="dxa"/>
-              <w:right w:w="80" w:type="dxa"/>
-              <w:bottom w:w="90" w:type="dxa"/>
-              <w:left w:w="80" w:type="dxa"/>
+            <w:shd w:val="clear" w:color="auto" w:fill="F4F4F5"/>
+            <w:tcMar>
+              <w:top w:w="90" w:type="dxa"/>
+              <w:right w:w="120" w:type="dxa"/>
+              <w:bottom w:w="90" w:type="dxa"/>
+              <w:left w:w="120" w:type="dxa"/>
             </w:tcMar>
             <w:vAlign w:val="center"/>
           </w:tcPr>
@@ -2531,11 +2232,13 @@
             </w:pPr>
             <w:r>
               <w:rPr>
-                <w:sz w:val="20"/>
-                <w:szCs w:val="20"/>
+                <w:rFonts w:ascii="Assistant" w:hAnsi="Assistant" w:cs="Assistant" w:eastAsia="Assistant"/>
+                <w:sz w:val="18"/>
+                <w:szCs w:val="18"/>
                 <w:rtl/>
                 <w:b/>
                 <w:bCs/>
+                <w:color w:val="52525B"/>
               </w:rPr>
               <w:t xml:space="preserve">DIAM</w:t>
             </w:r>
@@ -2544,18 +2247,12 @@
         <w:tc>
           <w:tcPr>
             <w:tcW w:w="1122" w:type="dxa"/>
-            <w:shd w:val="clear" w:color="auto" w:fill="EAF1F5"/>
-            <w:tcBorders>
-              <w:top w:val="single" w:sz="6" w:space="0" w:color="D3DCE3"/>
-              <w:right w:val="single" w:sz="6" w:space="0" w:color="D3DCE3"/>
-              <w:bottom w:val="single" w:sz="6" w:space="0" w:color="D3DCE3"/>
-              <w:left w:val="single" w:sz="6" w:space="0" w:color="D3DCE3"/>
-            </w:tcBorders>
-            <w:tcMar>
-              <w:top w:w="90" w:type="dxa"/>
-              <w:right w:w="80" w:type="dxa"/>
-              <w:bottom w:w="90" w:type="dxa"/>
-              <w:left w:w="80" w:type="dxa"/>
+            <w:shd w:val="clear" w:color="auto" w:fill="F4F4F5"/>
+            <w:tcMar>
+              <w:top w:w="90" w:type="dxa"/>
+              <w:right w:w="120" w:type="dxa"/>
+              <w:bottom w:w="90" w:type="dxa"/>
+              <w:left w:w="120" w:type="dxa"/>
             </w:tcMar>
             <w:vAlign w:val="center"/>
           </w:tcPr>
@@ -2567,11 +2264,13 @@
             </w:pPr>
             <w:r>
               <w:rPr>
-                <w:sz w:val="20"/>
-                <w:szCs w:val="20"/>
+                <w:rFonts w:ascii="Assistant" w:hAnsi="Assistant" w:cs="Assistant" w:eastAsia="Assistant"/>
+                <w:sz w:val="18"/>
+                <w:szCs w:val="18"/>
                 <w:rtl/>
                 <w:b/>
                 <w:bCs/>
+                <w:color w:val="52525B"/>
               </w:rPr>
               <w:t xml:space="preserve">OZ</w:t>
             </w:r>
@@ -2580,18 +2279,12 @@
         <w:tc>
           <w:tcPr>
             <w:tcW w:w="1122" w:type="dxa"/>
-            <w:shd w:val="clear" w:color="auto" w:fill="EAF1F5"/>
-            <w:tcBorders>
-              <w:top w:val="single" w:sz="6" w:space="0" w:color="D3DCE3"/>
-              <w:right w:val="single" w:sz="6" w:space="0" w:color="D3DCE3"/>
-              <w:bottom w:val="single" w:sz="6" w:space="0" w:color="D3DCE3"/>
-              <w:left w:val="single" w:sz="6" w:space="0" w:color="D3DCE3"/>
-            </w:tcBorders>
-            <w:tcMar>
-              <w:top w:w="90" w:type="dxa"/>
-              <w:right w:w="80" w:type="dxa"/>
-              <w:bottom w:w="90" w:type="dxa"/>
-              <w:left w:w="80" w:type="dxa"/>
+            <w:shd w:val="clear" w:color="auto" w:fill="F4F4F5"/>
+            <w:tcMar>
+              <w:top w:w="90" w:type="dxa"/>
+              <w:right w:w="120" w:type="dxa"/>
+              <w:bottom w:w="90" w:type="dxa"/>
+              <w:left w:w="120" w:type="dxa"/>
             </w:tcMar>
             <w:vAlign w:val="center"/>
           </w:tcPr>
@@ -2603,11 +2296,13 @@
             </w:pPr>
             <w:r>
               <w:rPr>
-                <w:sz w:val="20"/>
-                <w:szCs w:val="20"/>
+                <w:rFonts w:ascii="Assistant" w:hAnsi="Assistant" w:cs="Assistant" w:eastAsia="Assistant"/>
+                <w:sz w:val="18"/>
+                <w:szCs w:val="18"/>
                 <w:rtl/>
                 <w:b/>
                 <w:bCs/>
+                <w:color w:val="52525B"/>
               </w:rPr>
               <w:t xml:space="preserve">BC2</w:t>
             </w:r>
@@ -2616,18 +2311,12 @@
         <w:tc>
           <w:tcPr>
             <w:tcW w:w="1122" w:type="dxa"/>
-            <w:shd w:val="clear" w:color="auto" w:fill="EAF1F5"/>
-            <w:tcBorders>
-              <w:top w:val="single" w:sz="6" w:space="0" w:color="D3DCE3"/>
-              <w:right w:val="single" w:sz="6" w:space="0" w:color="D3DCE3"/>
-              <w:bottom w:val="single" w:sz="6" w:space="0" w:color="D3DCE3"/>
-              <w:left w:val="single" w:sz="6" w:space="0" w:color="D3DCE3"/>
-            </w:tcBorders>
-            <w:tcMar>
-              <w:top w:w="90" w:type="dxa"/>
-              <w:right w:w="80" w:type="dxa"/>
-              <w:bottom w:w="90" w:type="dxa"/>
-              <w:left w:w="80" w:type="dxa"/>
+            <w:shd w:val="clear" w:color="auto" w:fill="F4F4F5"/>
+            <w:tcMar>
+              <w:top w:w="90" w:type="dxa"/>
+              <w:right w:w="120" w:type="dxa"/>
+              <w:bottom w:w="90" w:type="dxa"/>
+              <w:left w:w="120" w:type="dxa"/>
             </w:tcMar>
             <w:vAlign w:val="center"/>
           </w:tcPr>
@@ -2639,11 +2328,13 @@
             </w:pPr>
             <w:r>
               <w:rPr>
-                <w:sz w:val="20"/>
-                <w:szCs w:val="20"/>
+                <w:rFonts w:ascii="Assistant" w:hAnsi="Assistant" w:cs="Assistant" w:eastAsia="Assistant"/>
+                <w:sz w:val="18"/>
+                <w:szCs w:val="18"/>
                 <w:rtl/>
                 <w:b/>
                 <w:bCs/>
+                <w:color w:val="52525B"/>
               </w:rPr>
               <w:t xml:space="preserve">BC1</w:t>
             </w:r>
@@ -2652,18 +2343,12 @@
         <w:tc>
           <w:tcPr>
             <w:tcW w:w="1100" w:type="dxa"/>
-            <w:shd w:val="clear" w:color="auto" w:fill="D7E4EA"/>
-            <w:tcBorders>
-              <w:top w:val="single" w:sz="6" w:space="0" w:color="D3DCE3"/>
-              <w:right w:val="single" w:sz="6" w:space="0" w:color="D3DCE3"/>
-              <w:bottom w:val="single" w:sz="6" w:space="0" w:color="D3DCE3"/>
-              <w:left w:val="single" w:sz="6" w:space="0" w:color="D3DCE3"/>
-            </w:tcBorders>
-            <w:tcMar>
-              <w:top w:w="90" w:type="dxa"/>
-              <w:right w:w="80" w:type="dxa"/>
-              <w:bottom w:w="90" w:type="dxa"/>
-              <w:left w:w="80" w:type="dxa"/>
+            <w:shd w:val="clear" w:color="auto" w:fill="18181B"/>
+            <w:tcMar>
+              <w:top w:w="90" w:type="dxa"/>
+              <w:right w:w="120" w:type="dxa"/>
+              <w:bottom w:w="90" w:type="dxa"/>
+              <w:left w:w="120" w:type="dxa"/>
             </w:tcMar>
             <w:vAlign w:val="center"/>
           </w:tcPr>
@@ -2675,11 +2360,13 @@
             </w:pPr>
             <w:r>
               <w:rPr>
-                <w:sz w:val="20"/>
-                <w:szCs w:val="20"/>
+                <w:rFonts w:ascii="Assistant" w:hAnsi="Assistant" w:cs="Assistant" w:eastAsia="Assistant"/>
+                <w:sz w:val="18"/>
+                <w:szCs w:val="18"/>
                 <w:rtl/>
                 <w:b/>
                 <w:bCs/>
+                <w:color w:val="FFFFFF"/>
               </w:rPr>
               <w:t xml:space="preserve">עין</w:t>
             </w:r>
@@ -2690,28 +2377,24 @@
         <w:tc>
           <w:tcPr>
             <w:tcW w:w="1122" w:type="dxa"/>
-            <w:tcBorders>
-              <w:top w:val="single" w:sz="6" w:space="0" w:color="D3DCE3"/>
-              <w:right w:val="single" w:sz="6" w:space="0" w:color="D3DCE3"/>
-              <w:bottom w:val="single" w:sz="6" w:space="0" w:color="D3DCE3"/>
-              <w:left w:val="single" w:sz="6" w:space="0" w:color="D3DCE3"/>
-            </w:tcBorders>
-            <w:tcMar>
-              <w:top w:w="90" w:type="dxa"/>
-              <w:right w:w="80" w:type="dxa"/>
-              <w:bottom w:w="90" w:type="dxa"/>
-              <w:left w:w="80" w:type="dxa"/>
-            </w:tcMar>
-            <w:vAlign w:val="center"/>
-          </w:tcPr>
-          <w:p>
-            <w:pPr>
-              <w:jc w:val="right"/>
-              <w:bidi/>
-              <w:spacing w:before="0" w:after="0"/>
-            </w:pPr>
-            <w:r>
-              <w:rPr>
+            <w:shd w:val="clear" w:color="auto" w:fill="FAFAFA"/>
+            <w:tcMar>
+              <w:top w:w="90" w:type="dxa"/>
+              <w:right w:w="120" w:type="dxa"/>
+              <w:bottom w:w="90" w:type="dxa"/>
+              <w:left w:w="120" w:type="dxa"/>
+            </w:tcMar>
+            <w:vAlign w:val="center"/>
+          </w:tcPr>
+          <w:p>
+            <w:pPr>
+              <w:jc w:val="center"/>
+              <w:bidi/>
+              <w:spacing w:before="0" w:after="0"/>
+            </w:pPr>
+            <w:r>
+              <w:rPr>
+                <w:rFonts w:ascii="Assistant" w:hAnsi="Assistant" w:cs="Assistant" w:eastAsia="Assistant"/>
                 <w:sz w:val="20"/>
                 <w:szCs w:val="20"/>
                 <w:rtl/>
@@ -2723,28 +2406,24 @@
         <w:tc>
           <w:tcPr>
             <w:tcW w:w="1122" w:type="dxa"/>
-            <w:tcBorders>
-              <w:top w:val="single" w:sz="6" w:space="0" w:color="D3DCE3"/>
-              <w:right w:val="single" w:sz="6" w:space="0" w:color="D3DCE3"/>
-              <w:bottom w:val="single" w:sz="6" w:space="0" w:color="D3DCE3"/>
-              <w:left w:val="single" w:sz="6" w:space="0" w:color="D3DCE3"/>
-            </w:tcBorders>
-            <w:tcMar>
-              <w:top w:w="90" w:type="dxa"/>
-              <w:right w:w="80" w:type="dxa"/>
-              <w:bottom w:w="90" w:type="dxa"/>
-              <w:left w:w="80" w:type="dxa"/>
-            </w:tcMar>
-            <w:vAlign w:val="center"/>
-          </w:tcPr>
-          <w:p>
-            <w:pPr>
-              <w:jc w:val="right"/>
-              <w:bidi/>
-              <w:spacing w:before="0" w:after="0"/>
-            </w:pPr>
-            <w:r>
-              <w:rPr>
+            <w:shd w:val="clear" w:color="auto" w:fill="FAFAFA"/>
+            <w:tcMar>
+              <w:top w:w="90" w:type="dxa"/>
+              <w:right w:w="120" w:type="dxa"/>
+              <w:bottom w:w="90" w:type="dxa"/>
+              <w:left w:w="120" w:type="dxa"/>
+            </w:tcMar>
+            <w:vAlign w:val="center"/>
+          </w:tcPr>
+          <w:p>
+            <w:pPr>
+              <w:jc w:val="center"/>
+              <w:bidi/>
+              <w:spacing w:before="0" w:after="0"/>
+            </w:pPr>
+            <w:r>
+              <w:rPr>
+                <w:rFonts w:ascii="Assistant" w:hAnsi="Assistant" w:cs="Assistant" w:eastAsia="Assistant"/>
                 <w:sz w:val="20"/>
                 <w:szCs w:val="20"/>
                 <w:rtl/>
@@ -2756,28 +2435,24 @@
         <w:tc>
           <w:tcPr>
             <w:tcW w:w="1122" w:type="dxa"/>
-            <w:tcBorders>
-              <w:top w:val="single" w:sz="6" w:space="0" w:color="D3DCE3"/>
-              <w:right w:val="single" w:sz="6" w:space="0" w:color="D3DCE3"/>
-              <w:bottom w:val="single" w:sz="6" w:space="0" w:color="D3DCE3"/>
-              <w:left w:val="single" w:sz="6" w:space="0" w:color="D3DCE3"/>
-            </w:tcBorders>
-            <w:tcMar>
-              <w:top w:w="90" w:type="dxa"/>
-              <w:right w:w="80" w:type="dxa"/>
-              <w:bottom w:w="90" w:type="dxa"/>
-              <w:left w:w="80" w:type="dxa"/>
-            </w:tcMar>
-            <w:vAlign w:val="center"/>
-          </w:tcPr>
-          <w:p>
-            <w:pPr>
-              <w:jc w:val="right"/>
-              <w:bidi/>
-              <w:spacing w:before="0" w:after="0"/>
-            </w:pPr>
-            <w:r>
-              <w:rPr>
+            <w:shd w:val="clear" w:color="auto" w:fill="FAFAFA"/>
+            <w:tcMar>
+              <w:top w:w="90" w:type="dxa"/>
+              <w:right w:w="120" w:type="dxa"/>
+              <w:bottom w:w="90" w:type="dxa"/>
+              <w:left w:w="120" w:type="dxa"/>
+            </w:tcMar>
+            <w:vAlign w:val="center"/>
+          </w:tcPr>
+          <w:p>
+            <w:pPr>
+              <w:jc w:val="center"/>
+              <w:bidi/>
+              <w:spacing w:before="0" w:after="0"/>
+            </w:pPr>
+            <w:r>
+              <w:rPr>
+                <w:rFonts w:ascii="Assistant" w:hAnsi="Assistant" w:cs="Assistant" w:eastAsia="Assistant"/>
                 <w:sz w:val="20"/>
                 <w:szCs w:val="20"/>
                 <w:rtl/>
@@ -2789,28 +2464,24 @@
         <w:tc>
           <w:tcPr>
             <w:tcW w:w="1122" w:type="dxa"/>
-            <w:tcBorders>
-              <w:top w:val="single" w:sz="6" w:space="0" w:color="D3DCE3"/>
-              <w:right w:val="single" w:sz="6" w:space="0" w:color="D3DCE3"/>
-              <w:bottom w:val="single" w:sz="6" w:space="0" w:color="D3DCE3"/>
-              <w:left w:val="single" w:sz="6" w:space="0" w:color="D3DCE3"/>
-            </w:tcBorders>
-            <w:tcMar>
-              <w:top w:w="90" w:type="dxa"/>
-              <w:right w:w="80" w:type="dxa"/>
-              <w:bottom w:w="90" w:type="dxa"/>
-              <w:left w:w="80" w:type="dxa"/>
-            </w:tcMar>
-            <w:vAlign w:val="center"/>
-          </w:tcPr>
-          <w:p>
-            <w:pPr>
-              <w:jc w:val="right"/>
-              <w:bidi/>
-              <w:spacing w:before="0" w:after="0"/>
-            </w:pPr>
-            <w:r>
-              <w:rPr>
+            <w:shd w:val="clear" w:color="auto" w:fill="FAFAFA"/>
+            <w:tcMar>
+              <w:top w:w="90" w:type="dxa"/>
+              <w:right w:w="120" w:type="dxa"/>
+              <w:bottom w:w="90" w:type="dxa"/>
+              <w:left w:w="120" w:type="dxa"/>
+            </w:tcMar>
+            <w:vAlign w:val="center"/>
+          </w:tcPr>
+          <w:p>
+            <w:pPr>
+              <w:jc w:val="center"/>
+              <w:bidi/>
+              <w:spacing w:before="0" w:after="0"/>
+            </w:pPr>
+            <w:r>
+              <w:rPr>
+                <w:rFonts w:ascii="Assistant" w:hAnsi="Assistant" w:cs="Assistant" w:eastAsia="Assistant"/>
                 <w:sz w:val="20"/>
                 <w:szCs w:val="20"/>
                 <w:rtl/>
@@ -2822,28 +2493,24 @@
         <w:tc>
           <w:tcPr>
             <w:tcW w:w="1122" w:type="dxa"/>
-            <w:tcBorders>
-              <w:top w:val="single" w:sz="6" w:space="0" w:color="D3DCE3"/>
-              <w:right w:val="single" w:sz="6" w:space="0" w:color="D3DCE3"/>
-              <w:bottom w:val="single" w:sz="6" w:space="0" w:color="D3DCE3"/>
-              <w:left w:val="single" w:sz="6" w:space="0" w:color="D3DCE3"/>
-            </w:tcBorders>
-            <w:tcMar>
-              <w:top w:w="90" w:type="dxa"/>
-              <w:right w:w="80" w:type="dxa"/>
-              <w:bottom w:w="90" w:type="dxa"/>
-              <w:left w:w="80" w:type="dxa"/>
-            </w:tcMar>
-            <w:vAlign w:val="center"/>
-          </w:tcPr>
-          <w:p>
-            <w:pPr>
-              <w:jc w:val="right"/>
-              <w:bidi/>
-              <w:spacing w:before="0" w:after="0"/>
-            </w:pPr>
-            <w:r>
-              <w:rPr>
+            <w:shd w:val="clear" w:color="auto" w:fill="FAFAFA"/>
+            <w:tcMar>
+              <w:top w:w="90" w:type="dxa"/>
+              <w:right w:w="120" w:type="dxa"/>
+              <w:bottom w:w="90" w:type="dxa"/>
+              <w:left w:w="120" w:type="dxa"/>
+            </w:tcMar>
+            <w:vAlign w:val="center"/>
+          </w:tcPr>
+          <w:p>
+            <w:pPr>
+              <w:jc w:val="center"/>
+              <w:bidi/>
+              <w:spacing w:before="0" w:after="0"/>
+            </w:pPr>
+            <w:r>
+              <w:rPr>
+                <w:rFonts w:ascii="Assistant" w:hAnsi="Assistant" w:cs="Assistant" w:eastAsia="Assistant"/>
                 <w:sz w:val="20"/>
                 <w:szCs w:val="20"/>
                 <w:rtl/>
@@ -2855,28 +2522,24 @@
         <w:tc>
           <w:tcPr>
             <w:tcW w:w="1122" w:type="dxa"/>
-            <w:tcBorders>
-              <w:top w:val="single" w:sz="6" w:space="0" w:color="D3DCE3"/>
-              <w:right w:val="single" w:sz="6" w:space="0" w:color="D3DCE3"/>
-              <w:bottom w:val="single" w:sz="6" w:space="0" w:color="D3DCE3"/>
-              <w:left w:val="single" w:sz="6" w:space="0" w:color="D3DCE3"/>
-            </w:tcBorders>
-            <w:tcMar>
-              <w:top w:w="90" w:type="dxa"/>
-              <w:right w:w="80" w:type="dxa"/>
-              <w:bottom w:w="90" w:type="dxa"/>
-              <w:left w:w="80" w:type="dxa"/>
-            </w:tcMar>
-            <w:vAlign w:val="center"/>
-          </w:tcPr>
-          <w:p>
-            <w:pPr>
-              <w:jc w:val="right"/>
-              <w:bidi/>
-              <w:spacing w:before="0" w:after="0"/>
-            </w:pPr>
-            <w:r>
-              <w:rPr>
+            <w:shd w:val="clear" w:color="auto" w:fill="FAFAFA"/>
+            <w:tcMar>
+              <w:top w:w="90" w:type="dxa"/>
+              <w:right w:w="120" w:type="dxa"/>
+              <w:bottom w:w="90" w:type="dxa"/>
+              <w:left w:w="120" w:type="dxa"/>
+            </w:tcMar>
+            <w:vAlign w:val="center"/>
+          </w:tcPr>
+          <w:p>
+            <w:pPr>
+              <w:jc w:val="center"/>
+              <w:bidi/>
+              <w:spacing w:before="0" w:after="0"/>
+            </w:pPr>
+            <w:r>
+              <w:rPr>
+                <w:rFonts w:ascii="Assistant" w:hAnsi="Assistant" w:cs="Assistant" w:eastAsia="Assistant"/>
                 <w:sz w:val="20"/>
                 <w:szCs w:val="20"/>
                 <w:rtl/>
@@ -2888,28 +2551,24 @@
         <w:tc>
           <w:tcPr>
             <w:tcW w:w="1122" w:type="dxa"/>
-            <w:tcBorders>
-              <w:top w:val="single" w:sz="6" w:space="0" w:color="D3DCE3"/>
-              <w:right w:val="single" w:sz="6" w:space="0" w:color="D3DCE3"/>
-              <w:bottom w:val="single" w:sz="6" w:space="0" w:color="D3DCE3"/>
-              <w:left w:val="single" w:sz="6" w:space="0" w:color="D3DCE3"/>
-            </w:tcBorders>
-            <w:tcMar>
-              <w:top w:w="90" w:type="dxa"/>
-              <w:right w:w="80" w:type="dxa"/>
-              <w:bottom w:w="90" w:type="dxa"/>
-              <w:left w:w="80" w:type="dxa"/>
-            </w:tcMar>
-            <w:vAlign w:val="center"/>
-          </w:tcPr>
-          <w:p>
-            <w:pPr>
-              <w:jc w:val="right"/>
-              <w:bidi/>
-              <w:spacing w:before="0" w:after="0"/>
-            </w:pPr>
-            <w:r>
-              <w:rPr>
+            <w:shd w:val="clear" w:color="auto" w:fill="FAFAFA"/>
+            <w:tcMar>
+              <w:top w:w="90" w:type="dxa"/>
+              <w:right w:w="120" w:type="dxa"/>
+              <w:bottom w:w="90" w:type="dxa"/>
+              <w:left w:w="120" w:type="dxa"/>
+            </w:tcMar>
+            <w:vAlign w:val="center"/>
+          </w:tcPr>
+          <w:p>
+            <w:pPr>
+              <w:jc w:val="center"/>
+              <w:bidi/>
+              <w:spacing w:before="0" w:after="0"/>
+            </w:pPr>
+            <w:r>
+              <w:rPr>
+                <w:rFonts w:ascii="Assistant" w:hAnsi="Assistant" w:cs="Assistant" w:eastAsia="Assistant"/>
                 <w:sz w:val="20"/>
                 <w:szCs w:val="20"/>
                 <w:rtl/>
@@ -2921,28 +2580,24 @@
         <w:tc>
           <w:tcPr>
             <w:tcW w:w="1122" w:type="dxa"/>
-            <w:tcBorders>
-              <w:top w:val="single" w:sz="6" w:space="0" w:color="D3DCE3"/>
-              <w:right w:val="single" w:sz="6" w:space="0" w:color="D3DCE3"/>
-              <w:bottom w:val="single" w:sz="6" w:space="0" w:color="D3DCE3"/>
-              <w:left w:val="single" w:sz="6" w:space="0" w:color="D3DCE3"/>
-            </w:tcBorders>
-            <w:tcMar>
-              <w:top w:w="90" w:type="dxa"/>
-              <w:right w:w="80" w:type="dxa"/>
-              <w:bottom w:w="90" w:type="dxa"/>
-              <w:left w:w="80" w:type="dxa"/>
-            </w:tcMar>
-            <w:vAlign w:val="center"/>
-          </w:tcPr>
-          <w:p>
-            <w:pPr>
-              <w:jc w:val="right"/>
-              <w:bidi/>
-              <w:spacing w:before="0" w:after="0"/>
-            </w:pPr>
-            <w:r>
-              <w:rPr>
+            <w:shd w:val="clear" w:color="auto" w:fill="FAFAFA"/>
+            <w:tcMar>
+              <w:top w:w="90" w:type="dxa"/>
+              <w:right w:w="120" w:type="dxa"/>
+              <w:bottom w:w="90" w:type="dxa"/>
+              <w:left w:w="120" w:type="dxa"/>
+            </w:tcMar>
+            <w:vAlign w:val="center"/>
+          </w:tcPr>
+          <w:p>
+            <w:pPr>
+              <w:jc w:val="center"/>
+              <w:bidi/>
+              <w:spacing w:before="0" w:after="0"/>
+            </w:pPr>
+            <w:r>
+              <w:rPr>
+                <w:rFonts w:ascii="Assistant" w:hAnsi="Assistant" w:cs="Assistant" w:eastAsia="Assistant"/>
                 <w:sz w:val="20"/>
                 <w:szCs w:val="20"/>
                 <w:rtl/>
@@ -2954,18 +2609,12 @@
         <w:tc>
           <w:tcPr>
             <w:tcW w:w="1100" w:type="dxa"/>
-            <w:shd w:val="clear" w:color="auto" w:fill="D7E4EA"/>
-            <w:tcBorders>
-              <w:top w:val="single" w:sz="6" w:space="0" w:color="D3DCE3"/>
-              <w:right w:val="single" w:sz="6" w:space="0" w:color="D3DCE3"/>
-              <w:bottom w:val="single" w:sz="6" w:space="0" w:color="D3DCE3"/>
-              <w:left w:val="single" w:sz="6" w:space="0" w:color="D3DCE3"/>
-            </w:tcBorders>
-            <w:tcMar>
-              <w:top w:w="90" w:type="dxa"/>
-              <w:right w:w="80" w:type="dxa"/>
-              <w:bottom w:w="90" w:type="dxa"/>
-              <w:left w:w="80" w:type="dxa"/>
+            <w:shd w:val="clear" w:color="auto" w:fill="F4F4F5"/>
+            <w:tcMar>
+              <w:top w:w="90" w:type="dxa"/>
+              <w:right w:w="120" w:type="dxa"/>
+              <w:bottom w:w="90" w:type="dxa"/>
+              <w:left w:w="120" w:type="dxa"/>
             </w:tcMar>
             <w:vAlign w:val="center"/>
           </w:tcPr>
@@ -2977,6 +2626,7 @@
             </w:pPr>
             <w:r>
               <w:rPr>
+                <w:rFonts w:ascii="Assistant" w:hAnsi="Assistant" w:cs="Assistant" w:eastAsia="Assistant"/>
                 <w:sz w:val="20"/>
                 <w:szCs w:val="20"/>
                 <w:rtl/>
@@ -2992,28 +2642,24 @@
         <w:tc>
           <w:tcPr>
             <w:tcW w:w="1122" w:type="dxa"/>
-            <w:tcBorders>
-              <w:top w:val="single" w:sz="6" w:space="0" w:color="D3DCE3"/>
-              <w:right w:val="single" w:sz="6" w:space="0" w:color="D3DCE3"/>
-              <w:bottom w:val="single" w:sz="6" w:space="0" w:color="D3DCE3"/>
-              <w:left w:val="single" w:sz="6" w:space="0" w:color="D3DCE3"/>
-            </w:tcBorders>
-            <w:tcMar>
-              <w:top w:w="90" w:type="dxa"/>
-              <w:right w:w="80" w:type="dxa"/>
-              <w:bottom w:w="90" w:type="dxa"/>
-              <w:left w:w="80" w:type="dxa"/>
-            </w:tcMar>
-            <w:vAlign w:val="center"/>
-          </w:tcPr>
-          <w:p>
-            <w:pPr>
-              <w:jc w:val="right"/>
-              <w:bidi/>
-              <w:spacing w:before="0" w:after="0"/>
-            </w:pPr>
-            <w:r>
-              <w:rPr>
+            <w:shd w:val="clear" w:color="auto" w:fill="FAFAFA"/>
+            <w:tcMar>
+              <w:top w:w="90" w:type="dxa"/>
+              <w:right w:w="120" w:type="dxa"/>
+              <w:bottom w:w="90" w:type="dxa"/>
+              <w:left w:w="120" w:type="dxa"/>
+            </w:tcMar>
+            <w:vAlign w:val="center"/>
+          </w:tcPr>
+          <w:p>
+            <w:pPr>
+              <w:jc w:val="center"/>
+              <w:bidi/>
+              <w:spacing w:before="0" w:after="0"/>
+            </w:pPr>
+            <w:r>
+              <w:rPr>
+                <w:rFonts w:ascii="Assistant" w:hAnsi="Assistant" w:cs="Assistant" w:eastAsia="Assistant"/>
                 <w:sz w:val="20"/>
                 <w:szCs w:val="20"/>
                 <w:rtl/>
@@ -3025,28 +2671,24 @@
         <w:tc>
           <w:tcPr>
             <w:tcW w:w="1122" w:type="dxa"/>
-            <w:tcBorders>
-              <w:top w:val="single" w:sz="6" w:space="0" w:color="D3DCE3"/>
-              <w:right w:val="single" w:sz="6" w:space="0" w:color="D3DCE3"/>
-              <w:bottom w:val="single" w:sz="6" w:space="0" w:color="D3DCE3"/>
-              <w:left w:val="single" w:sz="6" w:space="0" w:color="D3DCE3"/>
-            </w:tcBorders>
-            <w:tcMar>
-              <w:top w:w="90" w:type="dxa"/>
-              <w:right w:w="80" w:type="dxa"/>
-              <w:bottom w:w="90" w:type="dxa"/>
-              <w:left w:w="80" w:type="dxa"/>
-            </w:tcMar>
-            <w:vAlign w:val="center"/>
-          </w:tcPr>
-          <w:p>
-            <w:pPr>
-              <w:jc w:val="right"/>
-              <w:bidi/>
-              <w:spacing w:before="0" w:after="0"/>
-            </w:pPr>
-            <w:r>
-              <w:rPr>
+            <w:shd w:val="clear" w:color="auto" w:fill="FAFAFA"/>
+            <w:tcMar>
+              <w:top w:w="90" w:type="dxa"/>
+              <w:right w:w="120" w:type="dxa"/>
+              <w:bottom w:w="90" w:type="dxa"/>
+              <w:left w:w="120" w:type="dxa"/>
+            </w:tcMar>
+            <w:vAlign w:val="center"/>
+          </w:tcPr>
+          <w:p>
+            <w:pPr>
+              <w:jc w:val="center"/>
+              <w:bidi/>
+              <w:spacing w:before="0" w:after="0"/>
+            </w:pPr>
+            <w:r>
+              <w:rPr>
+                <w:rFonts w:ascii="Assistant" w:hAnsi="Assistant" w:cs="Assistant" w:eastAsia="Assistant"/>
                 <w:sz w:val="20"/>
                 <w:szCs w:val="20"/>
                 <w:rtl/>
@@ -3058,28 +2700,24 @@
         <w:tc>
           <w:tcPr>
             <w:tcW w:w="1122" w:type="dxa"/>
-            <w:tcBorders>
-              <w:top w:val="single" w:sz="6" w:space="0" w:color="D3DCE3"/>
-              <w:right w:val="single" w:sz="6" w:space="0" w:color="D3DCE3"/>
-              <w:bottom w:val="single" w:sz="6" w:space="0" w:color="D3DCE3"/>
-              <w:left w:val="single" w:sz="6" w:space="0" w:color="D3DCE3"/>
-            </w:tcBorders>
-            <w:tcMar>
-              <w:top w:w="90" w:type="dxa"/>
-              <w:right w:w="80" w:type="dxa"/>
-              <w:bottom w:w="90" w:type="dxa"/>
-              <w:left w:w="80" w:type="dxa"/>
-            </w:tcMar>
-            <w:vAlign w:val="center"/>
-          </w:tcPr>
-          <w:p>
-            <w:pPr>
-              <w:jc w:val="right"/>
-              <w:bidi/>
-              <w:spacing w:before="0" w:after="0"/>
-            </w:pPr>
-            <w:r>
-              <w:rPr>
+            <w:shd w:val="clear" w:color="auto" w:fill="FAFAFA"/>
+            <w:tcMar>
+              <w:top w:w="90" w:type="dxa"/>
+              <w:right w:w="120" w:type="dxa"/>
+              <w:bottom w:w="90" w:type="dxa"/>
+              <w:left w:w="120" w:type="dxa"/>
+            </w:tcMar>
+            <w:vAlign w:val="center"/>
+          </w:tcPr>
+          <w:p>
+            <w:pPr>
+              <w:jc w:val="center"/>
+              <w:bidi/>
+              <w:spacing w:before="0" w:after="0"/>
+            </w:pPr>
+            <w:r>
+              <w:rPr>
+                <w:rFonts w:ascii="Assistant" w:hAnsi="Assistant" w:cs="Assistant" w:eastAsia="Assistant"/>
                 <w:sz w:val="20"/>
                 <w:szCs w:val="20"/>
                 <w:rtl/>
@@ -3091,28 +2729,24 @@
         <w:tc>
           <w:tcPr>
             <w:tcW w:w="1122" w:type="dxa"/>
-            <w:tcBorders>
-              <w:top w:val="single" w:sz="6" w:space="0" w:color="D3DCE3"/>
-              <w:right w:val="single" w:sz="6" w:space="0" w:color="D3DCE3"/>
-              <w:bottom w:val="single" w:sz="6" w:space="0" w:color="D3DCE3"/>
-              <w:left w:val="single" w:sz="6" w:space="0" w:color="D3DCE3"/>
-            </w:tcBorders>
-            <w:tcMar>
-              <w:top w:w="90" w:type="dxa"/>
-              <w:right w:w="80" w:type="dxa"/>
-              <w:bottom w:w="90" w:type="dxa"/>
-              <w:left w:w="80" w:type="dxa"/>
-            </w:tcMar>
-            <w:vAlign w:val="center"/>
-          </w:tcPr>
-          <w:p>
-            <w:pPr>
-              <w:jc w:val="right"/>
-              <w:bidi/>
-              <w:spacing w:before="0" w:after="0"/>
-            </w:pPr>
-            <w:r>
-              <w:rPr>
+            <w:shd w:val="clear" w:color="auto" w:fill="FAFAFA"/>
+            <w:tcMar>
+              <w:top w:w="90" w:type="dxa"/>
+              <w:right w:w="120" w:type="dxa"/>
+              <w:bottom w:w="90" w:type="dxa"/>
+              <w:left w:w="120" w:type="dxa"/>
+            </w:tcMar>
+            <w:vAlign w:val="center"/>
+          </w:tcPr>
+          <w:p>
+            <w:pPr>
+              <w:jc w:val="center"/>
+              <w:bidi/>
+              <w:spacing w:before="0" w:after="0"/>
+            </w:pPr>
+            <w:r>
+              <w:rPr>
+                <w:rFonts w:ascii="Assistant" w:hAnsi="Assistant" w:cs="Assistant" w:eastAsia="Assistant"/>
                 <w:sz w:val="20"/>
                 <w:szCs w:val="20"/>
                 <w:rtl/>
@@ -3124,28 +2758,24 @@
         <w:tc>
           <w:tcPr>
             <w:tcW w:w="1122" w:type="dxa"/>
-            <w:tcBorders>
-              <w:top w:val="single" w:sz="6" w:space="0" w:color="D3DCE3"/>
-              <w:right w:val="single" w:sz="6" w:space="0" w:color="D3DCE3"/>
-              <w:bottom w:val="single" w:sz="6" w:space="0" w:color="D3DCE3"/>
-              <w:left w:val="single" w:sz="6" w:space="0" w:color="D3DCE3"/>
-            </w:tcBorders>
-            <w:tcMar>
-              <w:top w:w="90" w:type="dxa"/>
-              <w:right w:w="80" w:type="dxa"/>
-              <w:bottom w:w="90" w:type="dxa"/>
-              <w:left w:w="80" w:type="dxa"/>
-            </w:tcMar>
-            <w:vAlign w:val="center"/>
-          </w:tcPr>
-          <w:p>
-            <w:pPr>
-              <w:jc w:val="right"/>
-              <w:bidi/>
-              <w:spacing w:before="0" w:after="0"/>
-            </w:pPr>
-            <w:r>
-              <w:rPr>
+            <w:shd w:val="clear" w:color="auto" w:fill="FAFAFA"/>
+            <w:tcMar>
+              <w:top w:w="90" w:type="dxa"/>
+              <w:right w:w="120" w:type="dxa"/>
+              <w:bottom w:w="90" w:type="dxa"/>
+              <w:left w:w="120" w:type="dxa"/>
+            </w:tcMar>
+            <w:vAlign w:val="center"/>
+          </w:tcPr>
+          <w:p>
+            <w:pPr>
+              <w:jc w:val="center"/>
+              <w:bidi/>
+              <w:spacing w:before="0" w:after="0"/>
+            </w:pPr>
+            <w:r>
+              <w:rPr>
+                <w:rFonts w:ascii="Assistant" w:hAnsi="Assistant" w:cs="Assistant" w:eastAsia="Assistant"/>
                 <w:sz w:val="20"/>
                 <w:szCs w:val="20"/>
                 <w:rtl/>
@@ -3157,28 +2787,24 @@
         <w:tc>
           <w:tcPr>
             <w:tcW w:w="1122" w:type="dxa"/>
-            <w:tcBorders>
-              <w:top w:val="single" w:sz="6" w:space="0" w:color="D3DCE3"/>
-              <w:right w:val="single" w:sz="6" w:space="0" w:color="D3DCE3"/>
-              <w:bottom w:val="single" w:sz="6" w:space="0" w:color="D3DCE3"/>
-              <w:left w:val="single" w:sz="6" w:space="0" w:color="D3DCE3"/>
-            </w:tcBorders>
-            <w:tcMar>
-              <w:top w:w="90" w:type="dxa"/>
-              <w:right w:w="80" w:type="dxa"/>
-              <w:bottom w:w="90" w:type="dxa"/>
-              <w:left w:w="80" w:type="dxa"/>
-            </w:tcMar>
-            <w:vAlign w:val="center"/>
-          </w:tcPr>
-          <w:p>
-            <w:pPr>
-              <w:jc w:val="right"/>
-              <w:bidi/>
-              <w:spacing w:before="0" w:after="0"/>
-            </w:pPr>
-            <w:r>
-              <w:rPr>
+            <w:shd w:val="clear" w:color="auto" w:fill="FAFAFA"/>
+            <w:tcMar>
+              <w:top w:w="90" w:type="dxa"/>
+              <w:right w:w="120" w:type="dxa"/>
+              <w:bottom w:w="90" w:type="dxa"/>
+              <w:left w:w="120" w:type="dxa"/>
+            </w:tcMar>
+            <w:vAlign w:val="center"/>
+          </w:tcPr>
+          <w:p>
+            <w:pPr>
+              <w:jc w:val="center"/>
+              <w:bidi/>
+              <w:spacing w:before="0" w:after="0"/>
+            </w:pPr>
+            <w:r>
+              <w:rPr>
+                <w:rFonts w:ascii="Assistant" w:hAnsi="Assistant" w:cs="Assistant" w:eastAsia="Assistant"/>
                 <w:sz w:val="20"/>
                 <w:szCs w:val="20"/>
                 <w:rtl/>
@@ -3190,28 +2816,24 @@
         <w:tc>
           <w:tcPr>
             <w:tcW w:w="1122" w:type="dxa"/>
-            <w:tcBorders>
-              <w:top w:val="single" w:sz="6" w:space="0" w:color="D3DCE3"/>
-              <w:right w:val="single" w:sz="6" w:space="0" w:color="D3DCE3"/>
-              <w:bottom w:val="single" w:sz="6" w:space="0" w:color="D3DCE3"/>
-              <w:left w:val="single" w:sz="6" w:space="0" w:color="D3DCE3"/>
-            </w:tcBorders>
-            <w:tcMar>
-              <w:top w:w="90" w:type="dxa"/>
-              <w:right w:w="80" w:type="dxa"/>
-              <w:bottom w:w="90" w:type="dxa"/>
-              <w:left w:w="80" w:type="dxa"/>
-            </w:tcMar>
-            <w:vAlign w:val="center"/>
-          </w:tcPr>
-          <w:p>
-            <w:pPr>
-              <w:jc w:val="right"/>
-              <w:bidi/>
-              <w:spacing w:before="0" w:after="0"/>
-            </w:pPr>
-            <w:r>
-              <w:rPr>
+            <w:shd w:val="clear" w:color="auto" w:fill="FAFAFA"/>
+            <w:tcMar>
+              <w:top w:w="90" w:type="dxa"/>
+              <w:right w:w="120" w:type="dxa"/>
+              <w:bottom w:w="90" w:type="dxa"/>
+              <w:left w:w="120" w:type="dxa"/>
+            </w:tcMar>
+            <w:vAlign w:val="center"/>
+          </w:tcPr>
+          <w:p>
+            <w:pPr>
+              <w:jc w:val="center"/>
+              <w:bidi/>
+              <w:spacing w:before="0" w:after="0"/>
+            </w:pPr>
+            <w:r>
+              <w:rPr>
+                <w:rFonts w:ascii="Assistant" w:hAnsi="Assistant" w:cs="Assistant" w:eastAsia="Assistant"/>
                 <w:sz w:val="20"/>
                 <w:szCs w:val="20"/>
                 <w:rtl/>
@@ -3223,28 +2845,24 @@
         <w:tc>
           <w:tcPr>
             <w:tcW w:w="1122" w:type="dxa"/>
-            <w:tcBorders>
-              <w:top w:val="single" w:sz="6" w:space="0" w:color="D3DCE3"/>
-              <w:right w:val="single" w:sz="6" w:space="0" w:color="D3DCE3"/>
-              <w:bottom w:val="single" w:sz="6" w:space="0" w:color="D3DCE3"/>
-              <w:left w:val="single" w:sz="6" w:space="0" w:color="D3DCE3"/>
-            </w:tcBorders>
-            <w:tcMar>
-              <w:top w:w="90" w:type="dxa"/>
-              <w:right w:w="80" w:type="dxa"/>
-              <w:bottom w:w="90" w:type="dxa"/>
-              <w:left w:w="80" w:type="dxa"/>
-            </w:tcMar>
-            <w:vAlign w:val="center"/>
-          </w:tcPr>
-          <w:p>
-            <w:pPr>
-              <w:jc w:val="right"/>
-              <w:bidi/>
-              <w:spacing w:before="0" w:after="0"/>
-            </w:pPr>
-            <w:r>
-              <w:rPr>
+            <w:shd w:val="clear" w:color="auto" w:fill="FAFAFA"/>
+            <w:tcMar>
+              <w:top w:w="90" w:type="dxa"/>
+              <w:right w:w="120" w:type="dxa"/>
+              <w:bottom w:w="90" w:type="dxa"/>
+              <w:left w:w="120" w:type="dxa"/>
+            </w:tcMar>
+            <w:vAlign w:val="center"/>
+          </w:tcPr>
+          <w:p>
+            <w:pPr>
+              <w:jc w:val="center"/>
+              <w:bidi/>
+              <w:spacing w:before="0" w:after="0"/>
+            </w:pPr>
+            <w:r>
+              <w:rPr>
+                <w:rFonts w:ascii="Assistant" w:hAnsi="Assistant" w:cs="Assistant" w:eastAsia="Assistant"/>
                 <w:sz w:val="20"/>
                 <w:szCs w:val="20"/>
                 <w:rtl/>
@@ -3256,18 +2874,12 @@
         <w:tc>
           <w:tcPr>
             <w:tcW w:w="1100" w:type="dxa"/>
-            <w:shd w:val="clear" w:color="auto" w:fill="D7E4EA"/>
-            <w:tcBorders>
-              <w:top w:val="single" w:sz="6" w:space="0" w:color="D3DCE3"/>
-              <w:right w:val="single" w:sz="6" w:space="0" w:color="D3DCE3"/>
-              <w:bottom w:val="single" w:sz="6" w:space="0" w:color="D3DCE3"/>
-              <w:left w:val="single" w:sz="6" w:space="0" w:color="D3DCE3"/>
-            </w:tcBorders>
-            <w:tcMar>
-              <w:top w:w="90" w:type="dxa"/>
-              <w:right w:w="80" w:type="dxa"/>
-              <w:bottom w:w="90" w:type="dxa"/>
-              <w:left w:w="80" w:type="dxa"/>
+            <w:shd w:val="clear" w:color="auto" w:fill="F4F4F5"/>
+            <w:tcMar>
+              <w:top w:w="90" w:type="dxa"/>
+              <w:right w:w="120" w:type="dxa"/>
+              <w:bottom w:w="90" w:type="dxa"/>
+              <w:left w:w="120" w:type="dxa"/>
             </w:tcMar>
             <w:vAlign w:val="center"/>
           </w:tcPr>
@@ -3279,6 +2891,7 @@
             </w:pPr>
             <w:r>
               <w:rPr>
+                <w:rFonts w:ascii="Assistant" w:hAnsi="Assistant" w:cs="Assistant" w:eastAsia="Assistant"/>
                 <w:sz w:val="20"/>
                 <w:szCs w:val="20"/>
                 <w:rtl/>
@@ -3294,70 +2907,42 @@
     <w:p>
       <w:pPr>
         <w:bidi/>
-        <w:spacing w:after="80"/>
+        <w:spacing w:after="180"/>
       </w:pPr>
+    </w:p>
+    <w:p>
+      <w:pPr>
+        <w:jc w:val="center"/>
+        <w:bidi/>
+        <w:spacing w:before="240" w:after="80"/>
+        <w:keepNext/>
+      </w:pPr>
+      <w:r>
+        <w:rPr>
+          <w:rFonts w:ascii="Assistant" w:hAnsi="Assistant" w:cs="Assistant" w:eastAsia="Assistant"/>
+          <w:sz w:val="28"/>
+          <w:szCs w:val="28"/>
+          <w:rtl/>
+          <w:b/>
+          <w:bCs/>
+          <w:color w:val="18181B"/>
+        </w:rPr>
+        <w:t xml:space="preserve">תמיסות</w:t>
+      </w:r>
     </w:p>
     <w:tbl>
       <w:tblPr>
         <w:tblW w:w="10080" w:type="dxa"/>
         <w:tblLayout w:type="fixed"/>
         <w:jc w:val="right"/>
-        <w:tblCellMar>
-          <w:top w:w="0" w:type="dxa"/>
-          <w:right w:w="0" w:type="dxa"/>
-          <w:bottom w:w="0" w:type="dxa"/>
-          <w:left w:w="0" w:type="dxa"/>
-        </w:tblCellMar>
-      </w:tblPr>
-      <w:tblGrid>
-        <w:gridCol w:w="10080"/>
-      </w:tblGrid>
-      <w:tr>
-        <w:tc>
-          <w:tcPr>
-            <w:tcW w:w="10080" w:type="dxa"/>
-            <w:shd w:val="clear" w:color="auto" w:fill="D7E4EA"/>
-            <w:tcBorders>
-              <w:top w:val="single" w:sz="6" w:space="0" w:color="D3DCE3"/>
-              <w:right w:val="single" w:sz="6" w:space="0" w:color="D3DCE3"/>
-              <w:bottom w:val="single" w:sz="6" w:space="0" w:color="D3DCE3"/>
-              <w:left w:val="single" w:sz="6" w:space="0" w:color="D3DCE3"/>
-            </w:tcBorders>
-            <w:tcMar>
-              <w:top w:w="110" w:type="dxa"/>
-              <w:right w:w="180" w:type="dxa"/>
-              <w:bottom w:w="110" w:type="dxa"/>
-              <w:left w:w="180" w:type="dxa"/>
-            </w:tcMar>
-            <w:vAlign w:val="center"/>
-          </w:tcPr>
-          <w:p>
-            <w:pPr>
-              <w:jc w:val="right"/>
-              <w:bidi/>
-              <w:spacing w:before="0" w:after="0"/>
-              <w:keepNext/>
-            </w:pPr>
-            <w:r>
-              <w:rPr>
-                <w:sz w:val="24"/>
-                <w:szCs w:val="24"/>
-                <w:rtl/>
-                <w:b/>
-                <w:bCs/>
-                <w:color w:val="244550"/>
-              </w:rPr>
-              <w:t xml:space="preserve">תמיסות</w:t>
-            </w:r>
-          </w:p>
-        </w:tc>
-      </w:tr>
-    </w:tbl>
-    <w:tbl>
-      <w:tblPr>
-        <w:tblW w:w="10080" w:type="dxa"/>
-        <w:tblLayout w:type="fixed"/>
-        <w:jc w:val="right"/>
+        <w:tblBorders>
+          <w:top w:val="single" w:sz="4" w:space="0" w:color="E4E4E7"/>
+          <w:left w:val="single" w:sz="4" w:space="0" w:color="E4E4E7"/>
+          <w:bottom w:val="single" w:sz="4" w:space="0" w:color="E4E4E7"/>
+          <w:right w:val="single" w:sz="4" w:space="0" w:color="E4E4E7"/>
+          <w:insideH w:val="single" w:sz="4" w:space="0" w:color="E4E4E7"/>
+          <w:insideV w:val="single" w:sz="4" w:space="0" w:color="E4E4E7"/>
+        </w:tblBorders>
         <w:tblCellMar>
           <w:top w:w="0" w:type="dxa"/>
           <w:right w:w="0" w:type="dxa"/>
@@ -3377,17 +2962,12 @@
         <w:tc>
           <w:tcPr>
             <w:tcW w:w="2160" w:type="dxa"/>
-            <w:tcBorders>
-              <w:top w:val="single" w:sz="6" w:space="0" w:color="D3DCE3"/>
-              <w:right w:val="single" w:sz="6" w:space="0" w:color="D3DCE3"/>
-              <w:bottom w:val="single" w:sz="6" w:space="0" w:color="D3DCE3"/>
-              <w:left w:val="single" w:sz="6" w:space="0" w:color="D3DCE3"/>
-            </w:tcBorders>
-            <w:tcMar>
-              <w:top w:w="90" w:type="dxa"/>
-              <w:right w:w="80" w:type="dxa"/>
-              <w:bottom w:w="90" w:type="dxa"/>
-              <w:left w:w="80" w:type="dxa"/>
+            <w:shd w:val="clear" w:color="auto" w:fill="FAFAFA"/>
+            <w:tcMar>
+              <w:top w:w="90" w:type="dxa"/>
+              <w:right w:w="120" w:type="dxa"/>
+              <w:bottom w:w="90" w:type="dxa"/>
+              <w:left w:w="120" w:type="dxa"/>
             </w:tcMar>
             <w:vAlign w:val="center"/>
           </w:tcPr>
@@ -3399,6 +2979,7 @@
             </w:pPr>
             <w:r>
               <w:rPr>
+                <w:rFonts w:ascii="Assistant" w:hAnsi="Assistant" w:cs="Assistant" w:eastAsia="Assistant"/>
                 <w:sz w:val="20"/>
                 <w:szCs w:val="20"/>
                 <w:rtl/>
@@ -3410,18 +2991,12 @@
         <w:tc>
           <w:tcPr>
             <w:tcW w:w="1200" w:type="dxa"/>
-            <w:shd w:val="clear" w:color="auto" w:fill="EAF1F5"/>
-            <w:tcBorders>
-              <w:top w:val="single" w:sz="6" w:space="0" w:color="D3DCE3"/>
-              <w:right w:val="single" w:sz="6" w:space="0" w:color="D3DCE3"/>
-              <w:bottom w:val="single" w:sz="6" w:space="0" w:color="D3DCE3"/>
-              <w:left w:val="single" w:sz="6" w:space="0" w:color="D3DCE3"/>
-            </w:tcBorders>
-            <w:tcMar>
-              <w:top w:w="90" w:type="dxa"/>
-              <w:right w:w="80" w:type="dxa"/>
-              <w:bottom w:w="90" w:type="dxa"/>
-              <w:left w:w="80" w:type="dxa"/>
+            <w:shd w:val="clear" w:color="auto" w:fill="F4F4F5"/>
+            <w:tcMar>
+              <w:top w:w="90" w:type="dxa"/>
+              <w:right w:w="120" w:type="dxa"/>
+              <w:bottom w:w="90" w:type="dxa"/>
+              <w:left w:w="120" w:type="dxa"/>
             </w:tcMar>
             <w:vAlign w:val="center"/>
           </w:tcPr>
@@ -3433,11 +3008,13 @@
             </w:pPr>
             <w:r>
               <w:rPr>
-                <w:sz w:val="20"/>
-                <w:szCs w:val="20"/>
+                <w:rFonts w:ascii="Assistant" w:hAnsi="Assistant" w:cs="Assistant" w:eastAsia="Assistant"/>
+                <w:sz w:val="18"/>
+                <w:szCs w:val="18"/>
                 <w:rtl/>
                 <w:b/>
                 <w:bCs/>
+                <w:color w:val="52525B"/>
               </w:rPr>
               <w:t xml:space="preserve">שטיפה</w:t>
             </w:r>
@@ -3446,17 +3023,12 @@
         <w:tc>
           <w:tcPr>
             <w:tcW w:w="2160" w:type="dxa"/>
-            <w:tcBorders>
-              <w:top w:val="single" w:sz="6" w:space="0" w:color="D3DCE3"/>
-              <w:right w:val="single" w:sz="6" w:space="0" w:color="D3DCE3"/>
-              <w:bottom w:val="single" w:sz="6" w:space="0" w:color="D3DCE3"/>
-              <w:left w:val="single" w:sz="6" w:space="0" w:color="D3DCE3"/>
-            </w:tcBorders>
-            <w:tcMar>
-              <w:top w:w="90" w:type="dxa"/>
-              <w:right w:w="80" w:type="dxa"/>
-              <w:bottom w:w="90" w:type="dxa"/>
-              <w:left w:w="80" w:type="dxa"/>
+            <w:shd w:val="clear" w:color="auto" w:fill="FAFAFA"/>
+            <w:tcMar>
+              <w:top w:w="90" w:type="dxa"/>
+              <w:right w:w="120" w:type="dxa"/>
+              <w:bottom w:w="90" w:type="dxa"/>
+              <w:left w:w="120" w:type="dxa"/>
             </w:tcMar>
             <w:vAlign w:val="center"/>
           </w:tcPr>
@@ -3468,6 +3040,7 @@
             </w:pPr>
             <w:r>
               <w:rPr>
+                <w:rFonts w:ascii="Assistant" w:hAnsi="Assistant" w:cs="Assistant" w:eastAsia="Assistant"/>
                 <w:sz w:val="20"/>
                 <w:szCs w:val="20"/>
                 <w:rtl/>
@@ -3479,18 +3052,12 @@
         <w:tc>
           <w:tcPr>
             <w:tcW w:w="1200" w:type="dxa"/>
-            <w:shd w:val="clear" w:color="auto" w:fill="EAF1F5"/>
-            <w:tcBorders>
-              <w:top w:val="single" w:sz="6" w:space="0" w:color="D3DCE3"/>
-              <w:right w:val="single" w:sz="6" w:space="0" w:color="D3DCE3"/>
-              <w:bottom w:val="single" w:sz="6" w:space="0" w:color="D3DCE3"/>
-              <w:left w:val="single" w:sz="6" w:space="0" w:color="D3DCE3"/>
-            </w:tcBorders>
-            <w:tcMar>
-              <w:top w:w="90" w:type="dxa"/>
-              <w:right w:w="80" w:type="dxa"/>
-              <w:bottom w:w="90" w:type="dxa"/>
-              <w:left w:w="80" w:type="dxa"/>
+            <w:shd w:val="clear" w:color="auto" w:fill="F4F4F5"/>
+            <w:tcMar>
+              <w:top w:w="90" w:type="dxa"/>
+              <w:right w:w="120" w:type="dxa"/>
+              <w:bottom w:w="90" w:type="dxa"/>
+              <w:left w:w="120" w:type="dxa"/>
             </w:tcMar>
             <w:vAlign w:val="center"/>
           </w:tcPr>
@@ -3502,11 +3069,13 @@
             </w:pPr>
             <w:r>
               <w:rPr>
-                <w:sz w:val="20"/>
-                <w:szCs w:val="20"/>
+                <w:rFonts w:ascii="Assistant" w:hAnsi="Assistant" w:cs="Assistant" w:eastAsia="Assistant"/>
+                <w:sz w:val="18"/>
+                <w:szCs w:val="18"/>
                 <w:rtl/>
                 <w:b/>
                 <w:bCs/>
+                <w:color w:val="52525B"/>
               </w:rPr>
               <w:t xml:space="preserve">חיטוי</w:t>
             </w:r>
@@ -3515,17 +3084,12 @@
         <w:tc>
           <w:tcPr>
             <w:tcW w:w="2160" w:type="dxa"/>
-            <w:tcBorders>
-              <w:top w:val="single" w:sz="6" w:space="0" w:color="D3DCE3"/>
-              <w:right w:val="single" w:sz="6" w:space="0" w:color="D3DCE3"/>
-              <w:bottom w:val="single" w:sz="6" w:space="0" w:color="D3DCE3"/>
-              <w:left w:val="single" w:sz="6" w:space="0" w:color="D3DCE3"/>
-            </w:tcBorders>
-            <w:tcMar>
-              <w:top w:w="90" w:type="dxa"/>
-              <w:right w:w="80" w:type="dxa"/>
-              <w:bottom w:w="90" w:type="dxa"/>
-              <w:left w:w="80" w:type="dxa"/>
+            <w:shd w:val="clear" w:color="auto" w:fill="FAFAFA"/>
+            <w:tcMar>
+              <w:top w:w="90" w:type="dxa"/>
+              <w:right w:w="120" w:type="dxa"/>
+              <w:bottom w:w="90" w:type="dxa"/>
+              <w:left w:w="120" w:type="dxa"/>
             </w:tcMar>
             <w:vAlign w:val="center"/>
           </w:tcPr>
@@ -3537,6 +3101,7 @@
             </w:pPr>
             <w:r>
               <w:rPr>
+                <w:rFonts w:ascii="Assistant" w:hAnsi="Assistant" w:cs="Assistant" w:eastAsia="Assistant"/>
                 <w:sz w:val="20"/>
                 <w:szCs w:val="20"/>
                 <w:rtl/>
@@ -3548,18 +3113,12 @@
         <w:tc>
           <w:tcPr>
             <w:tcW w:w="1200" w:type="dxa"/>
-            <w:shd w:val="clear" w:color="auto" w:fill="EAF1F5"/>
-            <w:tcBorders>
-              <w:top w:val="single" w:sz="6" w:space="0" w:color="D3DCE3"/>
-              <w:right w:val="single" w:sz="6" w:space="0" w:color="D3DCE3"/>
-              <w:bottom w:val="single" w:sz="6" w:space="0" w:color="D3DCE3"/>
-              <w:left w:val="single" w:sz="6" w:space="0" w:color="D3DCE3"/>
-            </w:tcBorders>
-            <w:tcMar>
-              <w:top w:w="90" w:type="dxa"/>
-              <w:right w:w="80" w:type="dxa"/>
-              <w:bottom w:w="90" w:type="dxa"/>
-              <w:left w:w="80" w:type="dxa"/>
+            <w:shd w:val="clear" w:color="auto" w:fill="F4F4F5"/>
+            <w:tcMar>
+              <w:top w:w="90" w:type="dxa"/>
+              <w:right w:w="120" w:type="dxa"/>
+              <w:bottom w:w="90" w:type="dxa"/>
+              <w:left w:w="120" w:type="dxa"/>
             </w:tcMar>
             <w:vAlign w:val="center"/>
           </w:tcPr>
@@ -3571,11 +3130,13 @@
             </w:pPr>
             <w:r>
               <w:rPr>
-                <w:sz w:val="20"/>
-                <w:szCs w:val="20"/>
+                <w:rFonts w:ascii="Assistant" w:hAnsi="Assistant" w:cs="Assistant" w:eastAsia="Assistant"/>
+                <w:sz w:val="18"/>
+                <w:szCs w:val="18"/>
                 <w:rtl/>
                 <w:b/>
                 <w:bCs/>
+                <w:color w:val="52525B"/>
               </w:rPr>
               <w:t xml:space="preserve">ניקוי</w:t>
             </w:r>
@@ -3586,70 +3147,42 @@
     <w:p>
       <w:pPr>
         <w:bidi/>
-        <w:spacing w:after="80"/>
+        <w:spacing w:after="180"/>
       </w:pPr>
+    </w:p>
+    <w:p>
+      <w:pPr>
+        <w:jc w:val="center"/>
+        <w:bidi/>
+        <w:spacing w:before="240" w:after="80"/>
+        <w:keepNext/>
+      </w:pPr>
+      <w:r>
+        <w:rPr>
+          <w:rFonts w:ascii="Assistant" w:hAnsi="Assistant" w:cs="Assistant" w:eastAsia="Assistant"/>
+          <w:sz w:val="28"/>
+          <w:szCs w:val="28"/>
+          <w:rtl/>
+          <w:b/>
+          <w:bCs/>
+          <w:color w:val="18181B"/>
+        </w:rPr>
+        <w:t xml:space="preserve">סיכום כספי</w:t>
+      </w:r>
     </w:p>
     <w:tbl>
       <w:tblPr>
         <w:tblW w:w="10080" w:type="dxa"/>
         <w:tblLayout w:type="fixed"/>
         <w:jc w:val="right"/>
-        <w:tblCellMar>
-          <w:top w:w="0" w:type="dxa"/>
-          <w:right w:w="0" w:type="dxa"/>
-          <w:bottom w:w="0" w:type="dxa"/>
-          <w:left w:w="0" w:type="dxa"/>
-        </w:tblCellMar>
-      </w:tblPr>
-      <w:tblGrid>
-        <w:gridCol w:w="10080"/>
-      </w:tblGrid>
-      <w:tr>
-        <w:tc>
-          <w:tcPr>
-            <w:tcW w:w="10080" w:type="dxa"/>
-            <w:shd w:val="clear" w:color="auto" w:fill="D7E4EA"/>
-            <w:tcBorders>
-              <w:top w:val="single" w:sz="6" w:space="0" w:color="D3DCE3"/>
-              <w:right w:val="single" w:sz="6" w:space="0" w:color="D3DCE3"/>
-              <w:bottom w:val="single" w:sz="6" w:space="0" w:color="D3DCE3"/>
-              <w:left w:val="single" w:sz="6" w:space="0" w:color="D3DCE3"/>
-            </w:tcBorders>
-            <w:tcMar>
-              <w:top w:w="110" w:type="dxa"/>
-              <w:right w:w="180" w:type="dxa"/>
-              <w:bottom w:w="110" w:type="dxa"/>
-              <w:left w:w="180" w:type="dxa"/>
-            </w:tcMar>
-            <w:vAlign w:val="center"/>
-          </w:tcPr>
-          <w:p>
-            <w:pPr>
-              <w:jc w:val="right"/>
-              <w:bidi/>
-              <w:spacing w:before="0" w:after="0"/>
-              <w:keepNext/>
-            </w:pPr>
-            <w:r>
-              <w:rPr>
-                <w:sz w:val="24"/>
-                <w:szCs w:val="24"/>
-                <w:rtl/>
-                <w:b/>
-                <w:bCs/>
-                <w:color w:val="244550"/>
-              </w:rPr>
-              <w:t xml:space="preserve">סיכום כספי</w:t>
-            </w:r>
-          </w:p>
-        </w:tc>
-      </w:tr>
-    </w:tbl>
-    <w:tbl>
-      <w:tblPr>
-        <w:tblW w:w="10080" w:type="dxa"/>
-        <w:tblLayout w:type="fixed"/>
-        <w:jc w:val="right"/>
+        <w:tblBorders>
+          <w:top w:val="single" w:sz="4" w:space="0" w:color="E4E4E7"/>
+          <w:left w:val="single" w:sz="4" w:space="0" w:color="E4E4E7"/>
+          <w:bottom w:val="single" w:sz="4" w:space="0" w:color="E4E4E7"/>
+          <w:right w:val="single" w:sz="4" w:space="0" w:color="E4E4E7"/>
+          <w:insideH w:val="single" w:sz="4" w:space="0" w:color="E4E4E7"/>
+          <w:insideV w:val="single" w:sz="4" w:space="0" w:color="E4E4E7"/>
+        </w:tblBorders>
         <w:tblCellMar>
           <w:top w:w="0" w:type="dxa"/>
           <w:right w:w="0" w:type="dxa"/>
@@ -3671,17 +3204,12 @@
         <w:tc>
           <w:tcPr>
             <w:tcW w:w="1320" w:type="dxa"/>
-            <w:tcBorders>
-              <w:top w:val="single" w:sz="6" w:space="0" w:color="D3DCE3"/>
-              <w:right w:val="single" w:sz="6" w:space="0" w:color="D3DCE3"/>
-              <w:bottom w:val="single" w:sz="6" w:space="0" w:color="D3DCE3"/>
-              <w:left w:val="single" w:sz="6" w:space="0" w:color="D3DCE3"/>
-            </w:tcBorders>
-            <w:tcMar>
-              <w:top w:w="90" w:type="dxa"/>
-              <w:right w:w="80" w:type="dxa"/>
-              <w:bottom w:w="90" w:type="dxa"/>
-              <w:left w:w="80" w:type="dxa"/>
+            <w:shd w:val="clear" w:color="auto" w:fill="FAFAFA"/>
+            <w:tcMar>
+              <w:top w:w="90" w:type="dxa"/>
+              <w:right w:w="120" w:type="dxa"/>
+              <w:bottom w:w="90" w:type="dxa"/>
+              <w:left w:w="120" w:type="dxa"/>
             </w:tcMar>
             <w:vAlign w:val="center"/>
           </w:tcPr>
@@ -3693,6 +3221,7 @@
             </w:pPr>
             <w:r>
               <w:rPr>
+                <w:rFonts w:ascii="Assistant" w:hAnsi="Assistant" w:cs="Assistant" w:eastAsia="Assistant"/>
                 <w:sz w:val="20"/>
                 <w:szCs w:val="20"/>
                 <w:rtl/>
@@ -3704,18 +3233,12 @@
         <w:tc>
           <w:tcPr>
             <w:tcW w:w="1200" w:type="dxa"/>
-            <w:shd w:val="clear" w:color="auto" w:fill="EAF1F5"/>
-            <w:tcBorders>
-              <w:top w:val="single" w:sz="6" w:space="0" w:color="D3DCE3"/>
-              <w:right w:val="single" w:sz="6" w:space="0" w:color="D3DCE3"/>
-              <w:bottom w:val="single" w:sz="6" w:space="0" w:color="D3DCE3"/>
-              <w:left w:val="single" w:sz="6" w:space="0" w:color="D3DCE3"/>
-            </w:tcBorders>
-            <w:tcMar>
-              <w:top w:w="90" w:type="dxa"/>
-              <w:right w:w="80" w:type="dxa"/>
-              <w:bottom w:w="90" w:type="dxa"/>
-              <w:left w:w="80" w:type="dxa"/>
+            <w:shd w:val="clear" w:color="auto" w:fill="F4F4F5"/>
+            <w:tcMar>
+              <w:top w:w="90" w:type="dxa"/>
+              <w:right w:w="120" w:type="dxa"/>
+              <w:bottom w:w="90" w:type="dxa"/>
+              <w:left w:w="120" w:type="dxa"/>
             </w:tcMar>
             <w:vAlign w:val="center"/>
           </w:tcPr>
@@ -3727,11 +3250,13 @@
             </w:pPr>
             <w:r>
               <w:rPr>
-                <w:sz w:val="20"/>
-                <w:szCs w:val="20"/>
+                <w:rFonts w:ascii="Assistant" w:hAnsi="Assistant" w:cs="Assistant" w:eastAsia="Assistant"/>
+                <w:sz w:val="18"/>
+                <w:szCs w:val="18"/>
                 <w:rtl/>
                 <w:b/>
                 <w:bCs/>
+                <w:color w:val="52525B"/>
               </w:rPr>
               <w:t xml:space="preserve">יתרה</w:t>
             </w:r>
@@ -3740,17 +3265,12 @@
         <w:tc>
           <w:tcPr>
             <w:tcW w:w="1320" w:type="dxa"/>
-            <w:tcBorders>
-              <w:top w:val="single" w:sz="6" w:space="0" w:color="D3DCE3"/>
-              <w:right w:val="single" w:sz="6" w:space="0" w:color="D3DCE3"/>
-              <w:bottom w:val="single" w:sz="6" w:space="0" w:color="D3DCE3"/>
-              <w:left w:val="single" w:sz="6" w:space="0" w:color="D3DCE3"/>
-            </w:tcBorders>
-            <w:tcMar>
-              <w:top w:w="90" w:type="dxa"/>
-              <w:right w:w="80" w:type="dxa"/>
-              <w:bottom w:w="90" w:type="dxa"/>
-              <w:left w:w="80" w:type="dxa"/>
+            <w:shd w:val="clear" w:color="auto" w:fill="FAFAFA"/>
+            <w:tcMar>
+              <w:top w:w="90" w:type="dxa"/>
+              <w:right w:w="120" w:type="dxa"/>
+              <w:bottom w:w="90" w:type="dxa"/>
+              <w:left w:w="120" w:type="dxa"/>
             </w:tcMar>
             <w:vAlign w:val="center"/>
           </w:tcPr>
@@ -3762,6 +3282,7 @@
             </w:pPr>
             <w:r>
               <w:rPr>
+                <w:rFonts w:ascii="Assistant" w:hAnsi="Assistant" w:cs="Assistant" w:eastAsia="Assistant"/>
                 <w:sz w:val="20"/>
                 <w:szCs w:val="20"/>
                 <w:rtl/>
@@ -3773,18 +3294,12 @@
         <w:tc>
           <w:tcPr>
             <w:tcW w:w="1200" w:type="dxa"/>
-            <w:shd w:val="clear" w:color="auto" w:fill="EAF1F5"/>
-            <w:tcBorders>
-              <w:top w:val="single" w:sz="6" w:space="0" w:color="D3DCE3"/>
-              <w:right w:val="single" w:sz="6" w:space="0" w:color="D3DCE3"/>
-              <w:bottom w:val="single" w:sz="6" w:space="0" w:color="D3DCE3"/>
-              <w:left w:val="single" w:sz="6" w:space="0" w:color="D3DCE3"/>
-            </w:tcBorders>
-            <w:tcMar>
-              <w:top w:w="90" w:type="dxa"/>
-              <w:right w:w="80" w:type="dxa"/>
-              <w:bottom w:w="90" w:type="dxa"/>
-              <w:left w:w="80" w:type="dxa"/>
+            <w:shd w:val="clear" w:color="auto" w:fill="F4F4F5"/>
+            <w:tcMar>
+              <w:top w:w="90" w:type="dxa"/>
+              <w:right w:w="120" w:type="dxa"/>
+              <w:bottom w:w="90" w:type="dxa"/>
+              <w:left w:w="120" w:type="dxa"/>
             </w:tcMar>
             <w:vAlign w:val="center"/>
           </w:tcPr>
@@ -3796,11 +3311,13 @@
             </w:pPr>
             <w:r>
               <w:rPr>
-                <w:sz w:val="20"/>
-                <w:szCs w:val="20"/>
+                <w:rFonts w:ascii="Assistant" w:hAnsi="Assistant" w:cs="Assistant" w:eastAsia="Assistant"/>
+                <w:sz w:val="18"/>
+                <w:szCs w:val="18"/>
                 <w:rtl/>
                 <w:b/>
                 <w:bCs/>
+                <w:color w:val="52525B"/>
               </w:rPr>
               <w:t xml:space="preserve">שולם</w:t>
             </w:r>
@@ -3809,17 +3326,12 @@
         <w:tc>
           <w:tcPr>
             <w:tcW w:w="1320" w:type="dxa"/>
-            <w:tcBorders>
-              <w:top w:val="single" w:sz="6" w:space="0" w:color="D3DCE3"/>
-              <w:right w:val="single" w:sz="6" w:space="0" w:color="D3DCE3"/>
-              <w:bottom w:val="single" w:sz="6" w:space="0" w:color="D3DCE3"/>
-              <w:left w:val="single" w:sz="6" w:space="0" w:color="D3DCE3"/>
-            </w:tcBorders>
-            <w:tcMar>
-              <w:top w:w="90" w:type="dxa"/>
-              <w:right w:w="80" w:type="dxa"/>
-              <w:bottom w:w="90" w:type="dxa"/>
-              <w:left w:w="80" w:type="dxa"/>
+            <w:shd w:val="clear" w:color="auto" w:fill="FAFAFA"/>
+            <w:tcMar>
+              <w:top w:w="90" w:type="dxa"/>
+              <w:right w:w="120" w:type="dxa"/>
+              <w:bottom w:w="90" w:type="dxa"/>
+              <w:left w:w="120" w:type="dxa"/>
             </w:tcMar>
             <w:vAlign w:val="center"/>
           </w:tcPr>
@@ -3831,6 +3343,7 @@
             </w:pPr>
             <w:r>
               <w:rPr>
+                <w:rFonts w:ascii="Assistant" w:hAnsi="Assistant" w:cs="Assistant" w:eastAsia="Assistant"/>
                 <w:sz w:val="20"/>
                 <w:szCs w:val="20"/>
                 <w:rtl/>
@@ -3842,18 +3355,12 @@
         <w:tc>
           <w:tcPr>
             <w:tcW w:w="1200" w:type="dxa"/>
-            <w:shd w:val="clear" w:color="auto" w:fill="EAF1F5"/>
-            <w:tcBorders>
-              <w:top w:val="single" w:sz="6" w:space="0" w:color="D3DCE3"/>
-              <w:right w:val="single" w:sz="6" w:space="0" w:color="D3DCE3"/>
-              <w:bottom w:val="single" w:sz="6" w:space="0" w:color="D3DCE3"/>
-              <w:left w:val="single" w:sz="6" w:space="0" w:color="D3DCE3"/>
-            </w:tcBorders>
-            <w:tcMar>
-              <w:top w:w="90" w:type="dxa"/>
-              <w:right w:w="80" w:type="dxa"/>
-              <w:bottom w:w="90" w:type="dxa"/>
-              <w:left w:w="80" w:type="dxa"/>
+            <w:shd w:val="clear" w:color="auto" w:fill="F4F4F5"/>
+            <w:tcMar>
+              <w:top w:w="90" w:type="dxa"/>
+              <w:right w:w="120" w:type="dxa"/>
+              <w:bottom w:w="90" w:type="dxa"/>
+              <w:left w:w="120" w:type="dxa"/>
             </w:tcMar>
             <w:vAlign w:val="center"/>
           </w:tcPr>
@@ -3865,11 +3372,13 @@
             </w:pPr>
             <w:r>
               <w:rPr>
-                <w:sz w:val="20"/>
-                <w:szCs w:val="20"/>
+                <w:rFonts w:ascii="Assistant" w:hAnsi="Assistant" w:cs="Assistant" w:eastAsia="Assistant"/>
+                <w:sz w:val="18"/>
+                <w:szCs w:val="18"/>
                 <w:rtl/>
                 <w:b/>
                 <w:bCs/>
+                <w:color w:val="52525B"/>
               </w:rPr>
               <w:t xml:space="preserve">סה"כ</w:t>
             </w:r>
@@ -3878,17 +3387,12 @@
         <w:tc>
           <w:tcPr>
             <w:tcW w:w="1320" w:type="dxa"/>
-            <w:tcBorders>
-              <w:top w:val="single" w:sz="6" w:space="0" w:color="D3DCE3"/>
-              <w:right w:val="single" w:sz="6" w:space="0" w:color="D3DCE3"/>
-              <w:bottom w:val="single" w:sz="6" w:space="0" w:color="D3DCE3"/>
-              <w:left w:val="single" w:sz="6" w:space="0" w:color="D3DCE3"/>
-            </w:tcBorders>
-            <w:tcMar>
-              <w:top w:w="90" w:type="dxa"/>
-              <w:right w:w="80" w:type="dxa"/>
-              <w:bottom w:w="90" w:type="dxa"/>
-              <w:left w:w="80" w:type="dxa"/>
+            <w:shd w:val="clear" w:color="auto" w:fill="FAFAFA"/>
+            <w:tcMar>
+              <w:top w:w="90" w:type="dxa"/>
+              <w:right w:w="120" w:type="dxa"/>
+              <w:bottom w:w="90" w:type="dxa"/>
+              <w:left w:w="120" w:type="dxa"/>
             </w:tcMar>
             <w:vAlign w:val="center"/>
           </w:tcPr>
@@ -3903,18 +3407,12 @@
         <w:tc>
           <w:tcPr>
             <w:tcW w:w="1200" w:type="dxa"/>
-            <w:shd w:val="clear" w:color="auto" w:fill="EAF1F5"/>
-            <w:tcBorders>
-              <w:top w:val="single" w:sz="6" w:space="0" w:color="D3DCE3"/>
-              <w:right w:val="single" w:sz="6" w:space="0" w:color="D3DCE3"/>
-              <w:bottom w:val="single" w:sz="6" w:space="0" w:color="D3DCE3"/>
-              <w:left w:val="single" w:sz="6" w:space="0" w:color="D3DCE3"/>
-            </w:tcBorders>
-            <w:tcMar>
-              <w:top w:w="90" w:type="dxa"/>
-              <w:right w:w="80" w:type="dxa"/>
-              <w:bottom w:w="90" w:type="dxa"/>
-              <w:left w:w="80" w:type="dxa"/>
+            <w:shd w:val="clear" w:color="auto" w:fill="F4F4F5"/>
+            <w:tcMar>
+              <w:top w:w="90" w:type="dxa"/>
+              <w:right w:w="120" w:type="dxa"/>
+              <w:bottom w:w="90" w:type="dxa"/>
+              <w:left w:w="120" w:type="dxa"/>
             </w:tcMar>
             <w:vAlign w:val="center"/>
           </w:tcPr>
@@ -3931,70 +3429,42 @@
     <w:p>
       <w:pPr>
         <w:bidi/>
-        <w:spacing w:after="80"/>
+        <w:spacing w:after="180"/>
       </w:pPr>
+    </w:p>
+    <w:p>
+      <w:pPr>
+        <w:jc w:val="center"/>
+        <w:bidi/>
+        <w:spacing w:before="240" w:after="80"/>
+        <w:keepNext/>
+      </w:pPr>
+      <w:r>
+        <w:rPr>
+          <w:rFonts w:ascii="Assistant" w:hAnsi="Assistant" w:cs="Assistant" w:eastAsia="Assistant"/>
+          <w:sz w:val="28"/>
+          <w:szCs w:val="28"/>
+          <w:rtl/>
+          <w:b/>
+          <w:bCs/>
+          <w:color w:val="18181B"/>
+        </w:rPr>
+        <w:t xml:space="preserve">הערות</w:t>
+      </w:r>
     </w:p>
     <w:tbl>
       <w:tblPr>
         <w:tblW w:w="10080" w:type="dxa"/>
         <w:tblLayout w:type="fixed"/>
         <w:jc w:val="right"/>
-        <w:tblCellMar>
-          <w:top w:w="0" w:type="dxa"/>
-          <w:right w:w="0" w:type="dxa"/>
-          <w:bottom w:w="0" w:type="dxa"/>
-          <w:left w:w="0" w:type="dxa"/>
-        </w:tblCellMar>
-      </w:tblPr>
-      <w:tblGrid>
-        <w:gridCol w:w="10080"/>
-      </w:tblGrid>
-      <w:tr>
-        <w:tc>
-          <w:tcPr>
-            <w:tcW w:w="10080" w:type="dxa"/>
-            <w:shd w:val="clear" w:color="auto" w:fill="D7E4EA"/>
-            <w:tcBorders>
-              <w:top w:val="single" w:sz="6" w:space="0" w:color="D3DCE3"/>
-              <w:right w:val="single" w:sz="6" w:space="0" w:color="D3DCE3"/>
-              <w:bottom w:val="single" w:sz="6" w:space="0" w:color="D3DCE3"/>
-              <w:left w:val="single" w:sz="6" w:space="0" w:color="D3DCE3"/>
-            </w:tcBorders>
-            <w:tcMar>
-              <w:top w:w="110" w:type="dxa"/>
-              <w:right w:w="180" w:type="dxa"/>
-              <w:bottom w:w="110" w:type="dxa"/>
-              <w:left w:w="180" w:type="dxa"/>
-            </w:tcMar>
-            <w:vAlign w:val="center"/>
-          </w:tcPr>
-          <w:p>
-            <w:pPr>
-              <w:jc w:val="right"/>
-              <w:bidi/>
-              <w:spacing w:before="0" w:after="0"/>
-              <w:keepNext/>
-            </w:pPr>
-            <w:r>
-              <w:rPr>
-                <w:sz w:val="24"/>
-                <w:szCs w:val="24"/>
-                <w:rtl/>
-                <w:b/>
-                <w:bCs/>
-                <w:color w:val="244550"/>
-              </w:rPr>
-              <w:t xml:space="preserve">הערות</w:t>
-            </w:r>
-          </w:p>
-        </w:tc>
-      </w:tr>
-    </w:tbl>
-    <w:tbl>
-      <w:tblPr>
-        <w:tblW w:w="10080" w:type="dxa"/>
-        <w:tblLayout w:type="fixed"/>
-        <w:jc w:val="right"/>
+        <w:tblBorders>
+          <w:top w:val="single" w:sz="4" w:space="0" w:color="E4E4E7"/>
+          <w:left w:val="single" w:sz="4" w:space="0" w:color="E4E4E7"/>
+          <w:bottom w:val="single" w:sz="4" w:space="0" w:color="E4E4E7"/>
+          <w:right w:val="single" w:sz="4" w:space="0" w:color="E4E4E7"/>
+          <w:insideH w:val="single" w:sz="4" w:space="0" w:color="E4E4E7"/>
+          <w:insideV w:val="single" w:sz="4" w:space="0" w:color="E4E4E7"/>
+        </w:tblBorders>
         <w:tblCellMar>
           <w:top w:w="0" w:type="dxa"/>
           <w:right w:w="0" w:type="dxa"/>
@@ -4013,13 +3483,7 @@
         <w:tc>
           <w:tcPr>
             <w:tcW w:w="5040" w:type="dxa"/>
-            <w:shd w:val="clear" w:color="auto" w:fill="F7F9FA"/>
-            <w:tcBorders>
-              <w:top w:val="single" w:sz="6" w:space="0" w:color="D3DCE3"/>
-              <w:right w:val="single" w:sz="6" w:space="0" w:color="D3DCE3"/>
-              <w:bottom w:val="single" w:sz="6" w:space="0" w:color="D3DCE3"/>
-              <w:left w:val="single" w:sz="6" w:space="0" w:color="D3DCE3"/>
-            </w:tcBorders>
+            <w:shd w:val="clear" w:color="auto" w:fill="FAFAFA"/>
             <w:tcMar>
               <w:top w:w="120" w:type="dxa"/>
               <w:right w:w="120" w:type="dxa"/>
@@ -4037,12 +3501,13 @@
             </w:pPr>
             <w:r>
               <w:rPr>
+                <w:rFonts w:ascii="Assistant" w:hAnsi="Assistant" w:cs="Assistant" w:eastAsia="Assistant"/>
                 <w:sz w:val="20"/>
                 <w:szCs w:val="20"/>
                 <w:rtl/>
                 <w:b/>
                 <w:bCs/>
-                <w:color w:val="244550"/>
+                <w:color w:val="18181B"/>
               </w:rPr>
               <w:t xml:space="preserve">הערות לספק</w:t>
             </w:r>
@@ -4055,6 +3520,7 @@
             </w:pPr>
             <w:r>
               <w:rPr>
+                <w:rFonts w:ascii="Assistant" w:hAnsi="Assistant" w:cs="Assistant" w:eastAsia="Assistant"/>
                 <w:sz w:val="20"/>
                 <w:szCs w:val="20"/>
                 <w:rtl/>
@@ -4066,13 +3532,7 @@
         <w:tc>
           <w:tcPr>
             <w:tcW w:w="5040" w:type="dxa"/>
-            <w:shd w:val="clear" w:color="auto" w:fill="F7F9FA"/>
-            <w:tcBorders>
-              <w:top w:val="single" w:sz="6" w:space="0" w:color="D3DCE3"/>
-              <w:right w:val="single" w:sz="6" w:space="0" w:color="D3DCE3"/>
-              <w:bottom w:val="single" w:sz="6" w:space="0" w:color="D3DCE3"/>
-              <w:left w:val="single" w:sz="6" w:space="0" w:color="D3DCE3"/>
-            </w:tcBorders>
+            <w:shd w:val="clear" w:color="auto" w:fill="FAFAFA"/>
             <w:tcMar>
               <w:top w:w="120" w:type="dxa"/>
               <w:right w:w="120" w:type="dxa"/>
@@ -4090,12 +3550,13 @@
             </w:pPr>
             <w:r>
               <w:rPr>
+                <w:rFonts w:ascii="Assistant" w:hAnsi="Assistant" w:cs="Assistant" w:eastAsia="Assistant"/>
                 <w:sz w:val="20"/>
                 <w:szCs w:val="20"/>
                 <w:rtl/>
                 <w:b/>
                 <w:bCs/>
-                <w:color w:val="244550"/>
+                <w:color w:val="18181B"/>
               </w:rPr>
               <w:t xml:space="preserve">הערות קליניות</w:t>
             </w:r>
@@ -4108,6 +3569,7 @@
             </w:pPr>
             <w:r>
               <w:rPr>
+                <w:rFonts w:ascii="Assistant" w:hAnsi="Assistant" w:cs="Assistant" w:eastAsia="Assistant"/>
                 <w:sz w:val="20"/>
                 <w:szCs w:val="20"/>
                 <w:rtl/>

</xml_diff>

<commit_message>
Normalize legacy OPC keys and support older source schemas
</commit_message>
<xml_diff>
--- a/public/templates/contact-order.docx
+++ b/public/templates/contact-order.docx
@@ -7,6 +7,7 @@
         <w:tblW w:w="5000" w:type="pct"/>
         <w:tblLayout w:type="fixed"/>
         <w:jc w:val="right"/>
+        <w:bidiVisual w:val="0"/>
         <w:tblCellMar>
           <w:top w:w="0" w:type="dxa"/>
           <w:right w:w="0" w:type="dxa"/>
@@ -106,7 +107,7 @@
           </w:tcPr>
           <w:p>
             <w:pPr>
-              <w:jc w:val="right"/>
+              <w:jc w:val="left"/>
               <w:bidi/>
               <w:spacing w:before="0" w:after="40"/>
             </w:pPr>
@@ -125,7 +126,7 @@
           </w:p>
           <w:p>
             <w:pPr>
-              <w:jc w:val="right"/>
+              <w:jc w:val="left"/>
               <w:bidi/>
               <w:spacing w:before="0" w:after="0"/>
             </w:pPr>
@@ -158,7 +159,7 @@
     <w:p>
       <w:pPr>
         <w:bidi/>
-        <w:spacing w:after="120"/>
+        <w:spacing w:after="20"/>
       </w:pPr>
     </w:p>
     <w:tbl>
@@ -182,148 +183,92 @@
         </w:tblCellMar>
       </w:tblPr>
       <w:tblGrid>
-        <w:gridCol w:w="1320"/>
-        <w:gridCol w:w="1200"/>
-        <w:gridCol w:w="1320"/>
-        <w:gridCol w:w="1200"/>
-        <w:gridCol w:w="1320"/>
-        <w:gridCol w:w="1200"/>
-        <w:gridCol w:w="1320"/>
-        <w:gridCol w:w="1200"/>
+        <w:gridCol w:w="2520"/>
+        <w:gridCol w:w="2520"/>
+        <w:gridCol w:w="2520"/>
+        <w:gridCol w:w="2520"/>
       </w:tblGrid>
       <w:tr>
         <w:tc>
           <w:tcPr>
-            <w:tcW w:w="1320" w:type="dxa"/>
-            <w:tcMar>
-              <w:top w:w="40" w:type="dxa"/>
-              <w:right w:w="120" w:type="dxa"/>
-              <w:bottom w:w="40" w:type="dxa"/>
-              <w:left w:w="120" w:type="dxa"/>
-            </w:tcMar>
-            <w:vAlign w:val="center"/>
-          </w:tcPr>
-          <w:p>
-            <w:pPr>
-              <w:jc w:val="right"/>
-              <w:bidi/>
-              <w:spacing w:before="0" w:after="0"/>
-            </w:pPr>
-            <w:r>
-              <w:rPr>
-                <w:rFonts w:ascii="Assistant" w:hAnsi="Assistant" w:cs="Assistant" w:eastAsia="Assistant"/>
-                <w:sz w:val="20"/>
-                <w:szCs w:val="20"/>
-                <w:rtl/>
-              </w:rPr>
-              <w:t>{priority}</w:t>
-            </w:r>
-          </w:p>
-        </w:tc>
-        <w:tc>
-          <w:tcPr>
-            <w:tcW w:w="1200" w:type="dxa"/>
-            <w:tcMar>
-              <w:top w:w="40" w:type="dxa"/>
-              <w:right w:w="120" w:type="dxa"/>
-              <w:bottom w:w="40" w:type="dxa"/>
-              <w:left w:w="120" w:type="dxa"/>
-            </w:tcMar>
-            <w:vAlign w:val="center"/>
-          </w:tcPr>
-          <w:p>
-            <w:pPr>
-              <w:jc w:val="right"/>
-              <w:bidi/>
-              <w:spacing w:before="0" w:after="0"/>
-            </w:pPr>
-            <w:r>
-              <w:rPr>
-                <w:rFonts w:ascii="Assistant" w:hAnsi="Assistant" w:cs="Assistant" w:eastAsia="Assistant"/>
-                <w:sz w:val="18"/>
-                <w:szCs w:val="18"/>
+            <w:tcW w:w="2520" w:type="dxa"/>
+            <w:tcMar>
+              <w:top w:w="20" w:type="dxa"/>
+              <w:right w:w="95" w:type="dxa"/>
+              <w:bottom w:w="20" w:type="dxa"/>
+              <w:left w:w="95" w:type="dxa"/>
+            </w:tcMar>
+            <w:vAlign w:val="center"/>
+          </w:tcPr>
+          <w:p>
+            <w:pPr>
+              <w:jc w:val="left"/>
+              <w:bidi/>
+              <w:spacing w:before="0" w:after="3"/>
+            </w:pPr>
+            <w:r>
+              <w:rPr>
+                <w:rFonts w:ascii="Assistant" w:hAnsi="Assistant" w:cs="Assistant" w:eastAsia="Assistant"/>
+                <w:sz w:val="14"/>
+                <w:szCs w:val="14"/>
                 <w:rtl/>
                 <w:b/>
                 <w:bCs/>
                 <w:color w:val="52525B"/>
               </w:rPr>
-              <w:t xml:space="preserve">עדיפות</w:t>
-            </w:r>
-          </w:p>
-        </w:tc>
-        <w:tc>
-          <w:tcPr>
-            <w:tcW w:w="1320" w:type="dxa"/>
-            <w:tcMar>
-              <w:top w:w="40" w:type="dxa"/>
-              <w:right w:w="120" w:type="dxa"/>
-              <w:bottom w:w="40" w:type="dxa"/>
-              <w:left w:w="120" w:type="dxa"/>
-            </w:tcMar>
-            <w:vAlign w:val="center"/>
-          </w:tcPr>
-          <w:p>
-            <w:pPr>
-              <w:jc w:val="right"/>
-              <w:bidi/>
-              <w:spacing w:before="0" w:after="0"/>
-            </w:pPr>
-            <w:r>
-              <w:rPr>
-                <w:rFonts w:ascii="Assistant" w:hAnsi="Assistant" w:cs="Assistant" w:eastAsia="Assistant"/>
-                <w:sz w:val="20"/>
-                <w:szCs w:val="20"/>
-                <w:rtl/>
-              </w:rPr>
-              <w:t>{order_status}</w:t>
-            </w:r>
-          </w:p>
-        </w:tc>
-        <w:tc>
-          <w:tcPr>
-            <w:tcW w:w="1200" w:type="dxa"/>
-            <w:tcMar>
-              <w:top w:w="40" w:type="dxa"/>
-              <w:right w:w="120" w:type="dxa"/>
-              <w:bottom w:w="40" w:type="dxa"/>
-              <w:left w:w="120" w:type="dxa"/>
-            </w:tcMar>
-            <w:vAlign w:val="center"/>
-          </w:tcPr>
-          <w:p>
-            <w:pPr>
-              <w:jc w:val="right"/>
-              <w:bidi/>
-              <w:spacing w:before="0" w:after="0"/>
-            </w:pPr>
-            <w:r>
-              <w:rPr>
-                <w:rFonts w:ascii="Assistant" w:hAnsi="Assistant" w:cs="Assistant" w:eastAsia="Assistant"/>
-                <w:sz w:val="18"/>
-                <w:szCs w:val="18"/>
+              <w:t xml:space="preserve">מס' הזמנה</w:t>
+            </w:r>
+          </w:p>
+          <w:p>
+            <w:pPr>
+              <w:jc w:val="left"/>
+              <w:bidi/>
+              <w:spacing w:before="0" w:after="0"/>
+            </w:pPr>
+            <w:r>
+              <w:rPr>
+                <w:rFonts w:ascii="Assistant" w:hAnsi="Assistant" w:cs="Assistant" w:eastAsia="Assistant"/>
+                <w:sz w:val="20"/>
+                <w:szCs w:val="20"/>
+                <w:rtl/>
+              </w:rPr>
+              <w:t>{order_number}</w:t>
+            </w:r>
+          </w:p>
+        </w:tc>
+        <w:tc>
+          <w:tcPr>
+            <w:tcW w:w="2520" w:type="dxa"/>
+            <w:tcMar>
+              <w:top w:w="20" w:type="dxa"/>
+              <w:right w:w="95" w:type="dxa"/>
+              <w:bottom w:w="20" w:type="dxa"/>
+              <w:left w:w="95" w:type="dxa"/>
+            </w:tcMar>
+            <w:vAlign w:val="center"/>
+          </w:tcPr>
+          <w:p>
+            <w:pPr>
+              <w:jc w:val="left"/>
+              <w:bidi/>
+              <w:spacing w:before="0" w:after="3"/>
+            </w:pPr>
+            <w:r>
+              <w:rPr>
+                <w:rFonts w:ascii="Assistant" w:hAnsi="Assistant" w:cs="Assistant" w:eastAsia="Assistant"/>
+                <w:sz w:val="14"/>
+                <w:szCs w:val="14"/>
                 <w:rtl/>
                 <w:b/>
                 <w:bCs/>
                 <w:color w:val="52525B"/>
               </w:rPr>
-              <w:t xml:space="preserve">סטטוס</w:t>
-            </w:r>
-          </w:p>
-        </w:tc>
-        <w:tc>
-          <w:tcPr>
-            <w:tcW w:w="1320" w:type="dxa"/>
-            <w:tcMar>
-              <w:top w:w="40" w:type="dxa"/>
-              <w:right w:w="120" w:type="dxa"/>
-              <w:bottom w:w="40" w:type="dxa"/>
-              <w:left w:w="120" w:type="dxa"/>
-            </w:tcMar>
-            <w:vAlign w:val="center"/>
-          </w:tcPr>
-          <w:p>
-            <w:pPr>
-              <w:jc w:val="right"/>
+              <w:t xml:space="preserve">תאריך הזמנה</w:t>
+            </w:r>
+          </w:p>
+          <w:p>
+            <w:pPr>
+              <w:jc w:val="left"/>
               <w:bidi/>
               <w:spacing w:before="0" w:after="0"/>
             </w:pPr>
@@ -340,91 +285,95 @@
         </w:tc>
         <w:tc>
           <w:tcPr>
-            <w:tcW w:w="1200" w:type="dxa"/>
-            <w:tcMar>
-              <w:top w:w="40" w:type="dxa"/>
-              <w:right w:w="120" w:type="dxa"/>
-              <w:bottom w:w="40" w:type="dxa"/>
-              <w:left w:w="120" w:type="dxa"/>
-            </w:tcMar>
-            <w:vAlign w:val="center"/>
-          </w:tcPr>
-          <w:p>
-            <w:pPr>
-              <w:jc w:val="right"/>
-              <w:bidi/>
-              <w:spacing w:before="0" w:after="0"/>
-            </w:pPr>
-            <w:r>
-              <w:rPr>
-                <w:rFonts w:ascii="Assistant" w:hAnsi="Assistant" w:cs="Assistant" w:eastAsia="Assistant"/>
-                <w:sz w:val="18"/>
-                <w:szCs w:val="18"/>
+            <w:tcW w:w="2520" w:type="dxa"/>
+            <w:tcMar>
+              <w:top w:w="20" w:type="dxa"/>
+              <w:right w:w="95" w:type="dxa"/>
+              <w:bottom w:w="20" w:type="dxa"/>
+              <w:left w:w="95" w:type="dxa"/>
+            </w:tcMar>
+            <w:vAlign w:val="center"/>
+          </w:tcPr>
+          <w:p>
+            <w:pPr>
+              <w:jc w:val="left"/>
+              <w:bidi/>
+              <w:spacing w:before="0" w:after="3"/>
+            </w:pPr>
+            <w:r>
+              <w:rPr>
+                <w:rFonts w:ascii="Assistant" w:hAnsi="Assistant" w:cs="Assistant" w:eastAsia="Assistant"/>
+                <w:sz w:val="14"/>
+                <w:szCs w:val="14"/>
                 <w:rtl/>
                 <w:b/>
                 <w:bCs/>
                 <w:color w:val="52525B"/>
               </w:rPr>
-              <w:t xml:space="preserve">תאריך הזמנה</w:t>
-            </w:r>
-          </w:p>
-        </w:tc>
-        <w:tc>
-          <w:tcPr>
-            <w:tcW w:w="1320" w:type="dxa"/>
-            <w:tcMar>
-              <w:top w:w="40" w:type="dxa"/>
-              <w:right w:w="120" w:type="dxa"/>
-              <w:bottom w:w="40" w:type="dxa"/>
-              <w:left w:w="120" w:type="dxa"/>
-            </w:tcMar>
-            <w:vAlign w:val="center"/>
-          </w:tcPr>
-          <w:p>
-            <w:pPr>
-              <w:jc w:val="right"/>
-              <w:bidi/>
-              <w:spacing w:before="0" w:after="0"/>
-            </w:pPr>
-            <w:r>
-              <w:rPr>
-                <w:rFonts w:ascii="Assistant" w:hAnsi="Assistant" w:cs="Assistant" w:eastAsia="Assistant"/>
-                <w:sz w:val="20"/>
-                <w:szCs w:val="20"/>
-                <w:rtl/>
-              </w:rPr>
-              <w:t>{order_number}</w:t>
-            </w:r>
-          </w:p>
-        </w:tc>
-        <w:tc>
-          <w:tcPr>
-            <w:tcW w:w="1200" w:type="dxa"/>
-            <w:tcMar>
-              <w:top w:w="40" w:type="dxa"/>
-              <w:right w:w="120" w:type="dxa"/>
-              <w:bottom w:w="40" w:type="dxa"/>
-              <w:left w:w="120" w:type="dxa"/>
-            </w:tcMar>
-            <w:vAlign w:val="center"/>
-          </w:tcPr>
-          <w:p>
-            <w:pPr>
-              <w:jc w:val="right"/>
-              <w:bidi/>
-              <w:spacing w:before="0" w:after="0"/>
-            </w:pPr>
-            <w:r>
-              <w:rPr>
-                <w:rFonts w:ascii="Assistant" w:hAnsi="Assistant" w:cs="Assistant" w:eastAsia="Assistant"/>
-                <w:sz w:val="18"/>
-                <w:szCs w:val="18"/>
+              <w:t xml:space="preserve">סטטוס</w:t>
+            </w:r>
+          </w:p>
+          <w:p>
+            <w:pPr>
+              <w:jc w:val="left"/>
+              <w:bidi/>
+              <w:spacing w:before="0" w:after="0"/>
+            </w:pPr>
+            <w:r>
+              <w:rPr>
+                <w:rFonts w:ascii="Assistant" w:hAnsi="Assistant" w:cs="Assistant" w:eastAsia="Assistant"/>
+                <w:sz w:val="20"/>
+                <w:szCs w:val="20"/>
+                <w:rtl/>
+              </w:rPr>
+              <w:t>{order_status}</w:t>
+            </w:r>
+          </w:p>
+        </w:tc>
+        <w:tc>
+          <w:tcPr>
+            <w:tcW w:w="2520" w:type="dxa"/>
+            <w:tcMar>
+              <w:top w:w="20" w:type="dxa"/>
+              <w:right w:w="95" w:type="dxa"/>
+              <w:bottom w:w="20" w:type="dxa"/>
+              <w:left w:w="95" w:type="dxa"/>
+            </w:tcMar>
+            <w:vAlign w:val="center"/>
+          </w:tcPr>
+          <w:p>
+            <w:pPr>
+              <w:jc w:val="left"/>
+              <w:bidi/>
+              <w:spacing w:before="0" w:after="3"/>
+            </w:pPr>
+            <w:r>
+              <w:rPr>
+                <w:rFonts w:ascii="Assistant" w:hAnsi="Assistant" w:cs="Assistant" w:eastAsia="Assistant"/>
+                <w:sz w:val="14"/>
+                <w:szCs w:val="14"/>
                 <w:rtl/>
                 <w:b/>
                 <w:bCs/>
                 <w:color w:val="52525B"/>
               </w:rPr>
-              <w:t xml:space="preserve">מס' הזמנה</w:t>
+              <w:t xml:space="preserve">עדיפות</w:t>
+            </w:r>
+          </w:p>
+          <w:p>
+            <w:pPr>
+              <w:jc w:val="left"/>
+              <w:bidi/>
+              <w:spacing w:before="0" w:after="0"/>
+            </w:pPr>
+            <w:r>
+              <w:rPr>
+                <w:rFonts w:ascii="Assistant" w:hAnsi="Assistant" w:cs="Assistant" w:eastAsia="Assistant"/>
+                <w:sz w:val="20"/>
+                <w:szCs w:val="20"/>
+                <w:rtl/>
+              </w:rPr>
+              <w:t>{priority}</w:t>
             </w:r>
           </w:p>
         </w:tc>
@@ -432,136 +381,84 @@
       <w:tr>
         <w:tc>
           <w:tcPr>
-            <w:tcW w:w="1320" w:type="dxa"/>
-            <w:tcMar>
-              <w:top w:w="40" w:type="dxa"/>
-              <w:right w:w="120" w:type="dxa"/>
-              <w:bottom w:w="40" w:type="dxa"/>
-              <w:left w:w="120" w:type="dxa"/>
-            </w:tcMar>
-            <w:vAlign w:val="center"/>
-          </w:tcPr>
-          <w:p>
-            <w:pPr>
-              <w:jc w:val="right"/>
-              <w:bidi/>
-              <w:spacing w:before="0" w:after="0"/>
-            </w:pPr>
-            <w:r>
-              <w:rPr>
-                <w:rFonts w:ascii="Assistant" w:hAnsi="Assistant" w:cs="Assistant" w:eastAsia="Assistant"/>
-                <w:sz w:val="20"/>
-                <w:szCs w:val="20"/>
-                <w:rtl/>
-              </w:rPr>
-              <w:t>{delivery_date}</w:t>
-            </w:r>
-          </w:p>
-        </w:tc>
-        <w:tc>
-          <w:tcPr>
-            <w:tcW w:w="1200" w:type="dxa"/>
-            <w:tcMar>
-              <w:top w:w="40" w:type="dxa"/>
-              <w:right w:w="120" w:type="dxa"/>
-              <w:bottom w:w="40" w:type="dxa"/>
-              <w:left w:w="120" w:type="dxa"/>
-            </w:tcMar>
-            <w:vAlign w:val="center"/>
-          </w:tcPr>
-          <w:p>
-            <w:pPr>
-              <w:jc w:val="right"/>
-              <w:bidi/>
-              <w:spacing w:before="0" w:after="0"/>
-            </w:pPr>
-            <w:r>
-              <w:rPr>
-                <w:rFonts w:ascii="Assistant" w:hAnsi="Assistant" w:cs="Assistant" w:eastAsia="Assistant"/>
-                <w:sz w:val="18"/>
-                <w:szCs w:val="18"/>
+            <w:tcW w:w="2520" w:type="dxa"/>
+            <w:tcMar>
+              <w:top w:w="20" w:type="dxa"/>
+              <w:right w:w="95" w:type="dxa"/>
+              <w:bottom w:w="20" w:type="dxa"/>
+              <w:left w:w="95" w:type="dxa"/>
+            </w:tcMar>
+            <w:vAlign w:val="center"/>
+          </w:tcPr>
+          <w:p>
+            <w:pPr>
+              <w:jc w:val="left"/>
+              <w:bidi/>
+              <w:spacing w:before="0" w:after="3"/>
+            </w:pPr>
+            <w:r>
+              <w:rPr>
+                <w:rFonts w:ascii="Assistant" w:hAnsi="Assistant" w:cs="Assistant" w:eastAsia="Assistant"/>
+                <w:sz w:val="14"/>
+                <w:szCs w:val="14"/>
                 <w:rtl/>
                 <w:b/>
                 <w:bCs/>
                 <w:color w:val="52525B"/>
               </w:rPr>
-              <w:t xml:space="preserve">נמסר</w:t>
-            </w:r>
-          </w:p>
-        </w:tc>
-        <w:tc>
-          <w:tcPr>
-            <w:tcW w:w="1320" w:type="dxa"/>
-            <w:tcMar>
-              <w:top w:w="40" w:type="dxa"/>
-              <w:right w:w="120" w:type="dxa"/>
-              <w:bottom w:w="40" w:type="dxa"/>
-              <w:left w:w="120" w:type="dxa"/>
-            </w:tcMar>
-            <w:vAlign w:val="center"/>
-          </w:tcPr>
-          <w:p>
-            <w:pPr>
-              <w:jc w:val="right"/>
-              <w:bidi/>
-              <w:spacing w:before="0" w:after="0"/>
-            </w:pPr>
-            <w:r>
-              <w:rPr>
-                <w:rFonts w:ascii="Assistant" w:hAnsi="Assistant" w:cs="Assistant" w:eastAsia="Assistant"/>
-                <w:sz w:val="20"/>
-                <w:szCs w:val="20"/>
-                <w:rtl/>
-              </w:rPr>
-              <w:t>{approval_date}</w:t>
-            </w:r>
-          </w:p>
-        </w:tc>
-        <w:tc>
-          <w:tcPr>
-            <w:tcW w:w="1200" w:type="dxa"/>
-            <w:tcMar>
-              <w:top w:w="40" w:type="dxa"/>
-              <w:right w:w="120" w:type="dxa"/>
-              <w:bottom w:w="40" w:type="dxa"/>
-              <w:left w:w="120" w:type="dxa"/>
-            </w:tcMar>
-            <w:vAlign w:val="center"/>
-          </w:tcPr>
-          <w:p>
-            <w:pPr>
-              <w:jc w:val="right"/>
-              <w:bidi/>
-              <w:spacing w:before="0" w:after="0"/>
-            </w:pPr>
-            <w:r>
-              <w:rPr>
-                <w:rFonts w:ascii="Assistant" w:hAnsi="Assistant" w:cs="Assistant" w:eastAsia="Assistant"/>
-                <w:sz w:val="18"/>
-                <w:szCs w:val="18"/>
+              <w:t xml:space="preserve">אספקה</w:t>
+            </w:r>
+          </w:p>
+          <w:p>
+            <w:pPr>
+              <w:jc w:val="left"/>
+              <w:bidi/>
+              <w:spacing w:before="0" w:after="0"/>
+            </w:pPr>
+            <w:r>
+              <w:rPr>
+                <w:rFonts w:ascii="Assistant" w:hAnsi="Assistant" w:cs="Assistant" w:eastAsia="Assistant"/>
+                <w:sz w:val="20"/>
+                <w:szCs w:val="20"/>
+                <w:rtl/>
+              </w:rPr>
+              <w:t>{supply_clinic_name}</w:t>
+            </w:r>
+          </w:p>
+        </w:tc>
+        <w:tc>
+          <w:tcPr>
+            <w:tcW w:w="2520" w:type="dxa"/>
+            <w:tcMar>
+              <w:top w:w="20" w:type="dxa"/>
+              <w:right w:w="95" w:type="dxa"/>
+              <w:bottom w:w="20" w:type="dxa"/>
+              <w:left w:w="95" w:type="dxa"/>
+            </w:tcMar>
+            <w:vAlign w:val="center"/>
+          </w:tcPr>
+          <w:p>
+            <w:pPr>
+              <w:jc w:val="left"/>
+              <w:bidi/>
+              <w:spacing w:before="0" w:after="3"/>
+            </w:pPr>
+            <w:r>
+              <w:rPr>
+                <w:rFonts w:ascii="Assistant" w:hAnsi="Assistant" w:cs="Assistant" w:eastAsia="Assistant"/>
+                <w:sz w:val="14"/>
+                <w:szCs w:val="14"/>
                 <w:rtl/>
                 <w:b/>
                 <w:bCs/>
                 <w:color w:val="52525B"/>
               </w:rPr>
-              <w:t xml:space="preserve">אושר</w:t>
-            </w:r>
-          </w:p>
-        </w:tc>
-        <w:tc>
-          <w:tcPr>
-            <w:tcW w:w="1320" w:type="dxa"/>
-            <w:tcMar>
-              <w:top w:w="40" w:type="dxa"/>
-              <w:right w:w="120" w:type="dxa"/>
-              <w:bottom w:w="40" w:type="dxa"/>
-              <w:left w:w="120" w:type="dxa"/>
-            </w:tcMar>
-            <w:vAlign w:val="center"/>
-          </w:tcPr>
-          <w:p>
-            <w:pPr>
-              <w:jc w:val="right"/>
+              <w:t xml:space="preserve">הובטח</w:t>
+            </w:r>
+          </w:p>
+          <w:p>
+            <w:pPr>
+              <w:jc w:val="left"/>
               <w:bidi/>
               <w:spacing w:before="0" w:after="0"/>
             </w:pPr>
@@ -578,91 +475,95 @@
         </w:tc>
         <w:tc>
           <w:tcPr>
-            <w:tcW w:w="1200" w:type="dxa"/>
-            <w:tcMar>
-              <w:top w:w="40" w:type="dxa"/>
-              <w:right w:w="120" w:type="dxa"/>
-              <w:bottom w:w="40" w:type="dxa"/>
-              <w:left w:w="120" w:type="dxa"/>
-            </w:tcMar>
-            <w:vAlign w:val="center"/>
-          </w:tcPr>
-          <w:p>
-            <w:pPr>
-              <w:jc w:val="right"/>
-              <w:bidi/>
-              <w:spacing w:before="0" w:after="0"/>
-            </w:pPr>
-            <w:r>
-              <w:rPr>
-                <w:rFonts w:ascii="Assistant" w:hAnsi="Assistant" w:cs="Assistant" w:eastAsia="Assistant"/>
-                <w:sz w:val="18"/>
-                <w:szCs w:val="18"/>
+            <w:tcW w:w="2520" w:type="dxa"/>
+            <w:tcMar>
+              <w:top w:w="20" w:type="dxa"/>
+              <w:right w:w="95" w:type="dxa"/>
+              <w:bottom w:w="20" w:type="dxa"/>
+              <w:left w:w="95" w:type="dxa"/>
+            </w:tcMar>
+            <w:vAlign w:val="center"/>
+          </w:tcPr>
+          <w:p>
+            <w:pPr>
+              <w:jc w:val="left"/>
+              <w:bidi/>
+              <w:spacing w:before="0" w:after="3"/>
+            </w:pPr>
+            <w:r>
+              <w:rPr>
+                <w:rFonts w:ascii="Assistant" w:hAnsi="Assistant" w:cs="Assistant" w:eastAsia="Assistant"/>
+                <w:sz w:val="14"/>
+                <w:szCs w:val="14"/>
                 <w:rtl/>
                 <w:b/>
                 <w:bCs/>
                 <w:color w:val="52525B"/>
               </w:rPr>
-              <w:t xml:space="preserve">הובטח</w:t>
-            </w:r>
-          </w:p>
-        </w:tc>
-        <w:tc>
-          <w:tcPr>
-            <w:tcW w:w="1320" w:type="dxa"/>
-            <w:tcMar>
-              <w:top w:w="40" w:type="dxa"/>
-              <w:right w:w="120" w:type="dxa"/>
-              <w:bottom w:w="40" w:type="dxa"/>
-              <w:left w:w="120" w:type="dxa"/>
-            </w:tcMar>
-            <w:vAlign w:val="center"/>
-          </w:tcPr>
-          <w:p>
-            <w:pPr>
-              <w:jc w:val="right"/>
-              <w:bidi/>
-              <w:spacing w:before="0" w:after="0"/>
-            </w:pPr>
-            <w:r>
-              <w:rPr>
-                <w:rFonts w:ascii="Assistant" w:hAnsi="Assistant" w:cs="Assistant" w:eastAsia="Assistant"/>
-                <w:sz w:val="20"/>
-                <w:szCs w:val="20"/>
-                <w:rtl/>
-              </w:rPr>
-              <w:t>{supply_clinic_name}</w:t>
-            </w:r>
-          </w:p>
-        </w:tc>
-        <w:tc>
-          <w:tcPr>
-            <w:tcW w:w="1200" w:type="dxa"/>
-            <w:tcMar>
-              <w:top w:w="40" w:type="dxa"/>
-              <w:right w:w="120" w:type="dxa"/>
-              <w:bottom w:w="40" w:type="dxa"/>
-              <w:left w:w="120" w:type="dxa"/>
-            </w:tcMar>
-            <w:vAlign w:val="center"/>
-          </w:tcPr>
-          <w:p>
-            <w:pPr>
-              <w:jc w:val="right"/>
-              <w:bidi/>
-              <w:spacing w:before="0" w:after="0"/>
-            </w:pPr>
-            <w:r>
-              <w:rPr>
-                <w:rFonts w:ascii="Assistant" w:hAnsi="Assistant" w:cs="Assistant" w:eastAsia="Assistant"/>
-                <w:sz w:val="18"/>
-                <w:szCs w:val="18"/>
+              <w:t xml:space="preserve">אושר</w:t>
+            </w:r>
+          </w:p>
+          <w:p>
+            <w:pPr>
+              <w:jc w:val="left"/>
+              <w:bidi/>
+              <w:spacing w:before="0" w:after="0"/>
+            </w:pPr>
+            <w:r>
+              <w:rPr>
+                <w:rFonts w:ascii="Assistant" w:hAnsi="Assistant" w:cs="Assistant" w:eastAsia="Assistant"/>
+                <w:sz w:val="20"/>
+                <w:szCs w:val="20"/>
+                <w:rtl/>
+              </w:rPr>
+              <w:t>{approval_date}</w:t>
+            </w:r>
+          </w:p>
+        </w:tc>
+        <w:tc>
+          <w:tcPr>
+            <w:tcW w:w="2520" w:type="dxa"/>
+            <w:tcMar>
+              <w:top w:w="20" w:type="dxa"/>
+              <w:right w:w="95" w:type="dxa"/>
+              <w:bottom w:w="20" w:type="dxa"/>
+              <w:left w:w="95" w:type="dxa"/>
+            </w:tcMar>
+            <w:vAlign w:val="center"/>
+          </w:tcPr>
+          <w:p>
+            <w:pPr>
+              <w:jc w:val="left"/>
+              <w:bidi/>
+              <w:spacing w:before="0" w:after="3"/>
+            </w:pPr>
+            <w:r>
+              <w:rPr>
+                <w:rFonts w:ascii="Assistant" w:hAnsi="Assistant" w:cs="Assistant" w:eastAsia="Assistant"/>
+                <w:sz w:val="14"/>
+                <w:szCs w:val="14"/>
                 <w:rtl/>
                 <w:b/>
                 <w:bCs/>
                 <w:color w:val="52525B"/>
               </w:rPr>
-              <w:t xml:space="preserve">אספקה</w:t>
+              <w:t xml:space="preserve">נמסר</w:t>
+            </w:r>
+          </w:p>
+          <w:p>
+            <w:pPr>
+              <w:jc w:val="left"/>
+              <w:bidi/>
+              <w:spacing w:before="0" w:after="0"/>
+            </w:pPr>
+            <w:r>
+              <w:rPr>
+                <w:rFonts w:ascii="Assistant" w:hAnsi="Assistant" w:cs="Assistant" w:eastAsia="Assistant"/>
+                <w:sz w:val="20"/>
+                <w:szCs w:val="20"/>
+                <w:rtl/>
+              </w:rPr>
+              <w:t>{delivery_date}</w:t>
             </w:r>
           </w:p>
         </w:tc>
@@ -671,21 +572,21 @@
     <w:p>
       <w:pPr>
         <w:bidi/>
-        <w:spacing w:after="60"/>
+        <w:spacing w:after="20"/>
       </w:pPr>
     </w:p>
     <w:p>
       <w:pPr>
-        <w:jc w:val="center"/>
+        <w:jc w:val="left"/>
         <w:bidi/>
-        <w:spacing w:before="120" w:after="40"/>
+        <w:spacing w:before="40" w:after="12"/>
         <w:keepNext/>
       </w:pPr>
       <w:r>
         <w:rPr>
           <w:rFonts w:ascii="Assistant" w:hAnsi="Assistant" w:cs="Assistant" w:eastAsia="Assistant"/>
-          <w:sz w:val="20"/>
-          <w:szCs w:val="20"/>
+          <w:sz w:val="22"/>
+          <w:szCs w:val="22"/>
           <w:rtl/>
           <w:b/>
           <w:bCs/>
@@ -715,123 +616,80 @@
         </w:tblCellMar>
       </w:tblPr>
       <w:tblGrid>
-        <w:gridCol w:w="2160"/>
-        <w:gridCol w:w="1200"/>
-        <w:gridCol w:w="2160"/>
-        <w:gridCol w:w="1200"/>
-        <w:gridCol w:w="2160"/>
-        <w:gridCol w:w="1200"/>
+        <w:gridCol w:w="3360"/>
+        <w:gridCol w:w="3360"/>
+        <w:gridCol w:w="3360"/>
       </w:tblGrid>
       <w:tr>
         <w:tc>
           <w:tcPr>
-            <w:tcW w:w="2160" w:type="dxa"/>
-            <w:tcMar>
-              <w:top w:w="40" w:type="dxa"/>
-              <w:right w:w="120" w:type="dxa"/>
-              <w:bottom w:w="40" w:type="dxa"/>
-              <w:left w:w="120" w:type="dxa"/>
-            </w:tcMar>
-            <w:vAlign w:val="center"/>
-          </w:tcPr>
-          <w:p>
-            <w:pPr>
-              <w:jc w:val="right"/>
-              <w:bidi/>
-              <w:spacing w:before="0" w:after="0"/>
-            </w:pPr>
-            <w:r>
-              <w:rPr>
-                <w:rFonts w:ascii="Assistant" w:hAnsi="Assistant" w:cs="Assistant" w:eastAsia="Assistant"/>
-                <w:sz w:val="20"/>
-                <w:szCs w:val="20"/>
-                <w:rtl/>
-              </w:rPr>
-              <w:t>{phone_mobile}</w:t>
-            </w:r>
-          </w:p>
-        </w:tc>
-        <w:tc>
-          <w:tcPr>
-            <w:tcW w:w="1200" w:type="dxa"/>
-            <w:tcMar>
-              <w:top w:w="40" w:type="dxa"/>
-              <w:right w:w="120" w:type="dxa"/>
-              <w:bottom w:w="40" w:type="dxa"/>
-              <w:left w:w="120" w:type="dxa"/>
-            </w:tcMar>
-            <w:vAlign w:val="center"/>
-          </w:tcPr>
-          <w:p>
-            <w:pPr>
-              <w:jc w:val="right"/>
-              <w:bidi/>
-              <w:spacing w:before="0" w:after="0"/>
-            </w:pPr>
-            <w:r>
-              <w:rPr>
-                <w:rFonts w:ascii="Assistant" w:hAnsi="Assistant" w:cs="Assistant" w:eastAsia="Assistant"/>
-                <w:sz w:val="18"/>
-                <w:szCs w:val="18"/>
+            <w:tcW w:w="3360" w:type="dxa"/>
+            <w:tcMar>
+              <w:top w:w="20" w:type="dxa"/>
+              <w:right w:w="95" w:type="dxa"/>
+              <w:bottom w:w="20" w:type="dxa"/>
+              <w:left w:w="95" w:type="dxa"/>
+            </w:tcMar>
+            <w:vAlign w:val="center"/>
+          </w:tcPr>
+          <w:p>
+            <w:pPr>
+              <w:jc w:val="left"/>
+              <w:bidi/>
+              <w:spacing w:before="0" w:after="3"/>
+            </w:pPr>
+            <w:r>
+              <w:rPr>
+                <w:rFonts w:ascii="Assistant" w:hAnsi="Assistant" w:cs="Assistant" w:eastAsia="Assistant"/>
+                <w:sz w:val="14"/>
+                <w:szCs w:val="14"/>
                 <w:rtl/>
                 <w:b/>
                 <w:bCs/>
                 <w:color w:val="52525B"/>
               </w:rPr>
-              <w:t xml:space="preserve">נייד</w:t>
-            </w:r>
-          </w:p>
-        </w:tc>
-        <w:tc>
-          <w:tcPr>
-            <w:tcW w:w="2160" w:type="dxa"/>
-            <w:tcMar>
-              <w:top w:w="40" w:type="dxa"/>
-              <w:right w:w="120" w:type="dxa"/>
-              <w:bottom w:w="40" w:type="dxa"/>
-              <w:left w:w="120" w:type="dxa"/>
-            </w:tcMar>
-            <w:vAlign w:val="center"/>
-          </w:tcPr>
-          <w:p>
-            <w:pPr>
-              <w:jc w:val="right"/>
-              <w:bidi/>
-              <w:spacing w:before="0" w:after="0"/>
-            </w:pPr>
-            <w:r>
-              <w:rPr>
-                <w:rFonts w:ascii="Assistant" w:hAnsi="Assistant" w:cs="Assistant" w:eastAsia="Assistant"/>
-                <w:sz w:val="20"/>
-                <w:szCs w:val="20"/>
-                <w:rtl/>
-              </w:rPr>
-              <w:t>{client_id}</w:t>
-            </w:r>
-          </w:p>
-        </w:tc>
-        <w:tc>
-          <w:tcPr>
-            <w:tcW w:w="1200" w:type="dxa"/>
-            <w:tcMar>
-              <w:top w:w="40" w:type="dxa"/>
-              <w:right w:w="120" w:type="dxa"/>
-              <w:bottom w:w="40" w:type="dxa"/>
-              <w:left w:w="120" w:type="dxa"/>
-            </w:tcMar>
-            <w:vAlign w:val="center"/>
-          </w:tcPr>
-          <w:p>
-            <w:pPr>
-              <w:jc w:val="right"/>
-              <w:bidi/>
-              <w:spacing w:before="0" w:after="0"/>
-            </w:pPr>
-            <w:r>
-              <w:rPr>
-                <w:rFonts w:ascii="Assistant" w:hAnsi="Assistant" w:cs="Assistant" w:eastAsia="Assistant"/>
-                <w:sz w:val="18"/>
-                <w:szCs w:val="18"/>
+              <w:t xml:space="preserve">שם לקוח</w:t>
+            </w:r>
+          </w:p>
+          <w:p>
+            <w:pPr>
+              <w:jc w:val="left"/>
+              <w:bidi/>
+              <w:spacing w:before="0" w:after="0"/>
+            </w:pPr>
+            <w:r>
+              <w:rPr>
+                <w:rFonts w:ascii="Assistant" w:hAnsi="Assistant" w:cs="Assistant" w:eastAsia="Assistant"/>
+                <w:sz w:val="20"/>
+                <w:szCs w:val="20"/>
+                <w:rtl/>
+              </w:rPr>
+              <w:t>{client_name}</w:t>
+            </w:r>
+          </w:p>
+        </w:tc>
+        <w:tc>
+          <w:tcPr>
+            <w:tcW w:w="3360" w:type="dxa"/>
+            <w:tcMar>
+              <w:top w:w="20" w:type="dxa"/>
+              <w:right w:w="95" w:type="dxa"/>
+              <w:bottom w:w="20" w:type="dxa"/>
+              <w:left w:w="95" w:type="dxa"/>
+            </w:tcMar>
+            <w:vAlign w:val="center"/>
+          </w:tcPr>
+          <w:p>
+            <w:pPr>
+              <w:jc w:val="left"/>
+              <w:bidi/>
+              <w:spacing w:before="0" w:after="3"/>
+            </w:pPr>
+            <w:r>
+              <w:rPr>
+                <w:rFonts w:ascii="Assistant" w:hAnsi="Assistant" w:cs="Assistant" w:eastAsia="Assistant"/>
+                <w:sz w:val="14"/>
+                <w:szCs w:val="14"/>
                 <w:rtl/>
                 <w:b/>
                 <w:bCs/>
@@ -840,63 +698,67 @@
               <w:t xml:space="preserve">ת.ז</w:t>
             </w:r>
           </w:p>
-        </w:tc>
-        <w:tc>
-          <w:tcPr>
-            <w:tcW w:w="2160" w:type="dxa"/>
-            <w:tcMar>
-              <w:top w:w="40" w:type="dxa"/>
-              <w:right w:w="120" w:type="dxa"/>
-              <w:bottom w:w="40" w:type="dxa"/>
-              <w:left w:w="120" w:type="dxa"/>
-            </w:tcMar>
-            <w:vAlign w:val="center"/>
-          </w:tcPr>
-          <w:p>
-            <w:pPr>
-              <w:jc w:val="right"/>
-              <w:bidi/>
-              <w:spacing w:before="0" w:after="0"/>
-            </w:pPr>
-            <w:r>
-              <w:rPr>
-                <w:rFonts w:ascii="Assistant" w:hAnsi="Assistant" w:cs="Assistant" w:eastAsia="Assistant"/>
-                <w:sz w:val="20"/>
-                <w:szCs w:val="20"/>
-                <w:rtl/>
-              </w:rPr>
-              <w:t>{client_name}</w:t>
-            </w:r>
-          </w:p>
-        </w:tc>
-        <w:tc>
-          <w:tcPr>
-            <w:tcW w:w="1200" w:type="dxa"/>
-            <w:tcMar>
-              <w:top w:w="40" w:type="dxa"/>
-              <w:right w:w="120" w:type="dxa"/>
-              <w:bottom w:w="40" w:type="dxa"/>
-              <w:left w:w="120" w:type="dxa"/>
-            </w:tcMar>
-            <w:vAlign w:val="center"/>
-          </w:tcPr>
-          <w:p>
-            <w:pPr>
-              <w:jc w:val="right"/>
-              <w:bidi/>
-              <w:spacing w:before="0" w:after="0"/>
-            </w:pPr>
-            <w:r>
-              <w:rPr>
-                <w:rFonts w:ascii="Assistant" w:hAnsi="Assistant" w:cs="Assistant" w:eastAsia="Assistant"/>
-                <w:sz w:val="18"/>
-                <w:szCs w:val="18"/>
+          <w:p>
+            <w:pPr>
+              <w:jc w:val="left"/>
+              <w:bidi/>
+              <w:spacing w:before="0" w:after="0"/>
+            </w:pPr>
+            <w:r>
+              <w:rPr>
+                <w:rFonts w:ascii="Assistant" w:hAnsi="Assistant" w:cs="Assistant" w:eastAsia="Assistant"/>
+                <w:sz w:val="20"/>
+                <w:szCs w:val="20"/>
+                <w:rtl/>
+              </w:rPr>
+              <w:t>{client_id}</w:t>
+            </w:r>
+          </w:p>
+        </w:tc>
+        <w:tc>
+          <w:tcPr>
+            <w:tcW w:w="3360" w:type="dxa"/>
+            <w:tcMar>
+              <w:top w:w="20" w:type="dxa"/>
+              <w:right w:w="95" w:type="dxa"/>
+              <w:bottom w:w="20" w:type="dxa"/>
+              <w:left w:w="95" w:type="dxa"/>
+            </w:tcMar>
+            <w:vAlign w:val="center"/>
+          </w:tcPr>
+          <w:p>
+            <w:pPr>
+              <w:jc w:val="left"/>
+              <w:bidi/>
+              <w:spacing w:before="0" w:after="3"/>
+            </w:pPr>
+            <w:r>
+              <w:rPr>
+                <w:rFonts w:ascii="Assistant" w:hAnsi="Assistant" w:cs="Assistant" w:eastAsia="Assistant"/>
+                <w:sz w:val="14"/>
+                <w:szCs w:val="14"/>
                 <w:rtl/>
                 <w:b/>
                 <w:bCs/>
                 <w:color w:val="52525B"/>
               </w:rPr>
-              <w:t xml:space="preserve">שם לקוח</w:t>
+              <w:t xml:space="preserve">נייד</w:t>
+            </w:r>
+          </w:p>
+          <w:p>
+            <w:pPr>
+              <w:jc w:val="left"/>
+              <w:bidi/>
+              <w:spacing w:before="0" w:after="0"/>
+            </w:pPr>
+            <w:r>
+              <w:rPr>
+                <w:rFonts w:ascii="Assistant" w:hAnsi="Assistant" w:cs="Assistant" w:eastAsia="Assistant"/>
+                <w:sz w:val="20"/>
+                <w:szCs w:val="20"/>
+                <w:rtl/>
+              </w:rPr>
+              <w:t>{phone_mobile}</w:t>
             </w:r>
           </w:p>
         </w:tc>
@@ -904,113 +766,73 @@
       <w:tr>
         <w:tc>
           <w:tcPr>
-            <w:tcW w:w="2160" w:type="dxa"/>
-            <w:tcMar>
-              <w:top w:w="40" w:type="dxa"/>
-              <w:right w:w="120" w:type="dxa"/>
-              <w:bottom w:w="40" w:type="dxa"/>
-              <w:left w:w="120" w:type="dxa"/>
-            </w:tcMar>
-            <w:vAlign w:val="center"/>
-          </w:tcPr>
-          <w:p>
-            <w:pPr>
-              <w:jc w:val="right"/>
-              <w:bidi/>
-              <w:spacing w:before="0" w:after="0"/>
-            </w:pPr>
-            <w:r>
-              <w:rPr>
-                <w:rFonts w:ascii="Assistant" w:hAnsi="Assistant" w:cs="Assistant" w:eastAsia="Assistant"/>
-                <w:sz w:val="20"/>
-                <w:szCs w:val="20"/>
-                <w:rtl/>
-              </w:rPr>
-              <w:t>{client_address}</w:t>
-            </w:r>
-          </w:p>
-        </w:tc>
-        <w:tc>
-          <w:tcPr>
-            <w:tcW w:w="1200" w:type="dxa"/>
-            <w:tcMar>
-              <w:top w:w="40" w:type="dxa"/>
-              <w:right w:w="120" w:type="dxa"/>
-              <w:bottom w:w="40" w:type="dxa"/>
-              <w:left w:w="120" w:type="dxa"/>
-            </w:tcMar>
-            <w:vAlign w:val="center"/>
-          </w:tcPr>
-          <w:p>
-            <w:pPr>
-              <w:jc w:val="right"/>
-              <w:bidi/>
-              <w:spacing w:before="0" w:after="0"/>
-            </w:pPr>
-            <w:r>
-              <w:rPr>
-                <w:rFonts w:ascii="Assistant" w:hAnsi="Assistant" w:cs="Assistant" w:eastAsia="Assistant"/>
-                <w:sz w:val="18"/>
-                <w:szCs w:val="18"/>
+            <w:tcW w:w="3360" w:type="dxa"/>
+            <w:tcMar>
+              <w:top w:w="20" w:type="dxa"/>
+              <w:right w:w="95" w:type="dxa"/>
+              <w:bottom w:w="20" w:type="dxa"/>
+              <w:left w:w="95" w:type="dxa"/>
+            </w:tcMar>
+            <w:vAlign w:val="center"/>
+          </w:tcPr>
+          <w:p>
+            <w:pPr>
+              <w:jc w:val="left"/>
+              <w:bidi/>
+              <w:spacing w:before="0" w:after="3"/>
+            </w:pPr>
+            <w:r>
+              <w:rPr>
+                <w:rFonts w:ascii="Assistant" w:hAnsi="Assistant" w:cs="Assistant" w:eastAsia="Assistant"/>
+                <w:sz w:val="14"/>
+                <w:szCs w:val="14"/>
                 <w:rtl/>
                 <w:b/>
                 <w:bCs/>
                 <w:color w:val="52525B"/>
               </w:rPr>
-              <w:t xml:space="preserve">כתובת</w:t>
-            </w:r>
-          </w:p>
-        </w:tc>
-        <w:tc>
-          <w:tcPr>
-            <w:tcW w:w="2160" w:type="dxa"/>
-            <w:tcMar>
-              <w:top w:w="40" w:type="dxa"/>
-              <w:right w:w="120" w:type="dxa"/>
-              <w:bottom w:w="40" w:type="dxa"/>
-              <w:left w:w="120" w:type="dxa"/>
-            </w:tcMar>
-            <w:vAlign w:val="center"/>
-          </w:tcPr>
-          <w:p>
-            <w:pPr>
-              <w:jc w:val="right"/>
-              <w:bidi/>
-              <w:spacing w:before="0" w:after="0"/>
-            </w:pPr>
-            <w:r>
-              <w:rPr>
-                <w:rFonts w:ascii="Assistant" w:hAnsi="Assistant" w:cs="Assistant" w:eastAsia="Assistant"/>
-                <w:sz w:val="20"/>
-                <w:szCs w:val="20"/>
-                <w:rtl/>
-              </w:rPr>
-              <w:t>{phone_work}</w:t>
-            </w:r>
-          </w:p>
-        </w:tc>
-        <w:tc>
-          <w:tcPr>
-            <w:tcW w:w="1200" w:type="dxa"/>
-            <w:tcMar>
-              <w:top w:w="40" w:type="dxa"/>
-              <w:right w:w="120" w:type="dxa"/>
-              <w:bottom w:w="40" w:type="dxa"/>
-              <w:left w:w="120" w:type="dxa"/>
-            </w:tcMar>
-            <w:vAlign w:val="center"/>
-          </w:tcPr>
-          <w:p>
-            <w:pPr>
-              <w:jc w:val="right"/>
-              <w:bidi/>
-              <w:spacing w:before="0" w:after="0"/>
-            </w:pPr>
-            <w:r>
-              <w:rPr>
-                <w:rFonts w:ascii="Assistant" w:hAnsi="Assistant" w:cs="Assistant" w:eastAsia="Assistant"/>
-                <w:sz w:val="18"/>
-                <w:szCs w:val="18"/>
+              <w:t xml:space="preserve">טלפון בית</w:t>
+            </w:r>
+          </w:p>
+          <w:p>
+            <w:pPr>
+              <w:jc w:val="left"/>
+              <w:bidi/>
+              <w:spacing w:before="0" w:after="0"/>
+            </w:pPr>
+            <w:r>
+              <w:rPr>
+                <w:rFonts w:ascii="Assistant" w:hAnsi="Assistant" w:cs="Assistant" w:eastAsia="Assistant"/>
+                <w:sz w:val="20"/>
+                <w:szCs w:val="20"/>
+                <w:rtl/>
+              </w:rPr>
+              <w:t>{phone_home}</w:t>
+            </w:r>
+          </w:p>
+        </w:tc>
+        <w:tc>
+          <w:tcPr>
+            <w:tcW w:w="3360" w:type="dxa"/>
+            <w:tcMar>
+              <w:top w:w="20" w:type="dxa"/>
+              <w:right w:w="95" w:type="dxa"/>
+              <w:bottom w:w="20" w:type="dxa"/>
+              <w:left w:w="95" w:type="dxa"/>
+            </w:tcMar>
+            <w:vAlign w:val="center"/>
+          </w:tcPr>
+          <w:p>
+            <w:pPr>
+              <w:jc w:val="left"/>
+              <w:bidi/>
+              <w:spacing w:before="0" w:after="3"/>
+            </w:pPr>
+            <w:r>
+              <w:rPr>
+                <w:rFonts w:ascii="Assistant" w:hAnsi="Assistant" w:cs="Assistant" w:eastAsia="Assistant"/>
+                <w:sz w:val="14"/>
+                <w:szCs w:val="14"/>
                 <w:rtl/>
                 <w:b/>
                 <w:bCs/>
@@ -1019,63 +841,67 @@
               <w:t xml:space="preserve">טלפון עבודה</w:t>
             </w:r>
           </w:p>
-        </w:tc>
-        <w:tc>
-          <w:tcPr>
-            <w:tcW w:w="2160" w:type="dxa"/>
-            <w:tcMar>
-              <w:top w:w="40" w:type="dxa"/>
-              <w:right w:w="120" w:type="dxa"/>
-              <w:bottom w:w="40" w:type="dxa"/>
-              <w:left w:w="120" w:type="dxa"/>
-            </w:tcMar>
-            <w:vAlign w:val="center"/>
-          </w:tcPr>
-          <w:p>
-            <w:pPr>
-              <w:jc w:val="right"/>
-              <w:bidi/>
-              <w:spacing w:before="0" w:after="0"/>
-            </w:pPr>
-            <w:r>
-              <w:rPr>
-                <w:rFonts w:ascii="Assistant" w:hAnsi="Assistant" w:cs="Assistant" w:eastAsia="Assistant"/>
-                <w:sz w:val="20"/>
-                <w:szCs w:val="20"/>
-                <w:rtl/>
-              </w:rPr>
-              <w:t>{phone_home}</w:t>
-            </w:r>
-          </w:p>
-        </w:tc>
-        <w:tc>
-          <w:tcPr>
-            <w:tcW w:w="1200" w:type="dxa"/>
-            <w:tcMar>
-              <w:top w:w="40" w:type="dxa"/>
-              <w:right w:w="120" w:type="dxa"/>
-              <w:bottom w:w="40" w:type="dxa"/>
-              <w:left w:w="120" w:type="dxa"/>
-            </w:tcMar>
-            <w:vAlign w:val="center"/>
-          </w:tcPr>
-          <w:p>
-            <w:pPr>
-              <w:jc w:val="right"/>
-              <w:bidi/>
-              <w:spacing w:before="0" w:after="0"/>
-            </w:pPr>
-            <w:r>
-              <w:rPr>
-                <w:rFonts w:ascii="Assistant" w:hAnsi="Assistant" w:cs="Assistant" w:eastAsia="Assistant"/>
-                <w:sz w:val="18"/>
-                <w:szCs w:val="18"/>
+          <w:p>
+            <w:pPr>
+              <w:jc w:val="left"/>
+              <w:bidi/>
+              <w:spacing w:before="0" w:after="0"/>
+            </w:pPr>
+            <w:r>
+              <w:rPr>
+                <w:rFonts w:ascii="Assistant" w:hAnsi="Assistant" w:cs="Assistant" w:eastAsia="Assistant"/>
+                <w:sz w:val="20"/>
+                <w:szCs w:val="20"/>
+                <w:rtl/>
+              </w:rPr>
+              <w:t>{phone_work}</w:t>
+            </w:r>
+          </w:p>
+        </w:tc>
+        <w:tc>
+          <w:tcPr>
+            <w:tcW w:w="3360" w:type="dxa"/>
+            <w:tcMar>
+              <w:top w:w="20" w:type="dxa"/>
+              <w:right w:w="95" w:type="dxa"/>
+              <w:bottom w:w="20" w:type="dxa"/>
+              <w:left w:w="95" w:type="dxa"/>
+            </w:tcMar>
+            <w:vAlign w:val="center"/>
+          </w:tcPr>
+          <w:p>
+            <w:pPr>
+              <w:jc w:val="left"/>
+              <w:bidi/>
+              <w:spacing w:before="0" w:after="3"/>
+            </w:pPr>
+            <w:r>
+              <w:rPr>
+                <w:rFonts w:ascii="Assistant" w:hAnsi="Assistant" w:cs="Assistant" w:eastAsia="Assistant"/>
+                <w:sz w:val="14"/>
+                <w:szCs w:val="14"/>
                 <w:rtl/>
                 <w:b/>
                 <w:bCs/>
                 <w:color w:val="52525B"/>
               </w:rPr>
-              <w:t xml:space="preserve">טלפון בית</w:t>
+              <w:t xml:space="preserve">כתובת</w:t>
+            </w:r>
+          </w:p>
+          <w:p>
+            <w:pPr>
+              <w:jc w:val="left"/>
+              <w:bidi/>
+              <w:spacing w:before="0" w:after="0"/>
+            </w:pPr>
+            <w:r>
+              <w:rPr>
+                <w:rFonts w:ascii="Assistant" w:hAnsi="Assistant" w:cs="Assistant" w:eastAsia="Assistant"/>
+                <w:sz w:val="20"/>
+                <w:szCs w:val="20"/>
+                <w:rtl/>
+              </w:rPr>
+              <w:t>{client_address}</w:t>
             </w:r>
           </w:p>
         </w:tc>
@@ -1084,21 +910,21 @@
     <w:p>
       <w:pPr>
         <w:bidi/>
-        <w:spacing w:after="60"/>
+        <w:spacing w:after="20"/>
       </w:pPr>
     </w:p>
     <w:p>
       <w:pPr>
-        <w:jc w:val="center"/>
+        <w:jc w:val="left"/>
         <w:bidi/>
-        <w:spacing w:before="120" w:after="40"/>
+        <w:spacing w:before="40" w:after="12"/>
         <w:keepNext/>
       </w:pPr>
       <w:r>
         <w:rPr>
           <w:rFonts w:ascii="Assistant" w:hAnsi="Assistant" w:cs="Assistant" w:eastAsia="Assistant"/>
-          <w:sz w:val="20"/>
-          <w:szCs w:val="20"/>
+          <w:sz w:val="22"/>
+          <w:szCs w:val="22"/>
           <w:rtl/>
           <w:b/>
           <w:bCs/>
@@ -1128,123 +954,80 @@
         </w:tblCellMar>
       </w:tblPr>
       <w:tblGrid>
-        <w:gridCol w:w="2160"/>
-        <w:gridCol w:w="1200"/>
-        <w:gridCol w:w="2160"/>
-        <w:gridCol w:w="1200"/>
-        <w:gridCol w:w="2160"/>
-        <w:gridCol w:w="1200"/>
+        <w:gridCol w:w="3360"/>
+        <w:gridCol w:w="3360"/>
+        <w:gridCol w:w="3360"/>
       </w:tblGrid>
       <w:tr>
         <w:tc>
           <w:tcPr>
-            <w:tcW w:w="2160" w:type="dxa"/>
-            <w:tcMar>
-              <w:top w:w="40" w:type="dxa"/>
-              <w:right w:w="120" w:type="dxa"/>
-              <w:bottom w:w="40" w:type="dxa"/>
-              <w:left w:w="120" w:type="dxa"/>
-            </w:tcMar>
-            <w:vAlign w:val="center"/>
-          </w:tcPr>
-          <w:p>
-            <w:pPr>
-              <w:jc w:val="right"/>
-              <w:bidi/>
-              <w:spacing w:before="0" w:after="0"/>
-            </w:pPr>
-            <w:r>
-              <w:rPr>
-                <w:rFonts w:ascii="Assistant" w:hAnsi="Assistant" w:cs="Assistant" w:eastAsia="Assistant"/>
-                <w:sz w:val="20"/>
-                <w:szCs w:val="20"/>
-                <w:rtl/>
-              </w:rPr>
-              <w:t>{deliverer_name}</w:t>
-            </w:r>
-          </w:p>
-        </w:tc>
-        <w:tc>
-          <w:tcPr>
-            <w:tcW w:w="1200" w:type="dxa"/>
-            <w:tcMar>
-              <w:top w:w="40" w:type="dxa"/>
-              <w:right w:w="120" w:type="dxa"/>
-              <w:bottom w:w="40" w:type="dxa"/>
-              <w:left w:w="120" w:type="dxa"/>
-            </w:tcMar>
-            <w:vAlign w:val="center"/>
-          </w:tcPr>
-          <w:p>
-            <w:pPr>
-              <w:jc w:val="right"/>
-              <w:bidi/>
-              <w:spacing w:before="0" w:after="0"/>
-            </w:pPr>
-            <w:r>
-              <w:rPr>
-                <w:rFonts w:ascii="Assistant" w:hAnsi="Assistant" w:cs="Assistant" w:eastAsia="Assistant"/>
-                <w:sz w:val="18"/>
-                <w:szCs w:val="18"/>
+            <w:tcW w:w="3360" w:type="dxa"/>
+            <w:tcMar>
+              <w:top w:w="20" w:type="dxa"/>
+              <w:right w:w="95" w:type="dxa"/>
+              <w:bottom w:w="20" w:type="dxa"/>
+              <w:left w:w="95" w:type="dxa"/>
+            </w:tcMar>
+            <w:vAlign w:val="center"/>
+          </w:tcPr>
+          <w:p>
+            <w:pPr>
+              <w:jc w:val="left"/>
+              <w:bidi/>
+              <w:spacing w:before="0" w:after="3"/>
+            </w:pPr>
+            <w:r>
+              <w:rPr>
+                <w:rFonts w:ascii="Assistant" w:hAnsi="Assistant" w:cs="Assistant" w:eastAsia="Assistant"/>
+                <w:sz w:val="14"/>
+                <w:szCs w:val="14"/>
                 <w:rtl/>
                 <w:b/>
                 <w:bCs/>
                 <w:color w:val="52525B"/>
               </w:rPr>
-              <w:t xml:space="preserve">מוסר עבודה</w:t>
-            </w:r>
-          </w:p>
-        </w:tc>
-        <w:tc>
-          <w:tcPr>
-            <w:tcW w:w="2160" w:type="dxa"/>
-            <w:tcMar>
-              <w:top w:w="40" w:type="dxa"/>
-              <w:right w:w="120" w:type="dxa"/>
-              <w:bottom w:w="40" w:type="dxa"/>
-              <w:left w:w="120" w:type="dxa"/>
-            </w:tcMar>
-            <w:vAlign w:val="center"/>
-          </w:tcPr>
-          <w:p>
-            <w:pPr>
-              <w:jc w:val="right"/>
-              <w:bidi/>
-              <w:spacing w:before="0" w:after="0"/>
-            </w:pPr>
-            <w:r>
-              <w:rPr>
-                <w:rFonts w:ascii="Assistant" w:hAnsi="Assistant" w:cs="Assistant" w:eastAsia="Assistant"/>
-                <w:sz w:val="20"/>
-                <w:szCs w:val="20"/>
-                <w:rtl/>
-              </w:rPr>
-              <w:t>{advisor_name}</w:t>
-            </w:r>
-          </w:p>
-        </w:tc>
-        <w:tc>
-          <w:tcPr>
-            <w:tcW w:w="1200" w:type="dxa"/>
-            <w:tcMar>
-              <w:top w:w="40" w:type="dxa"/>
-              <w:right w:w="120" w:type="dxa"/>
-              <w:bottom w:w="40" w:type="dxa"/>
-              <w:left w:w="120" w:type="dxa"/>
-            </w:tcMar>
-            <w:vAlign w:val="center"/>
-          </w:tcPr>
-          <w:p>
-            <w:pPr>
-              <w:jc w:val="right"/>
-              <w:bidi/>
-              <w:spacing w:before="0" w:after="0"/>
-            </w:pPr>
-            <w:r>
-              <w:rPr>
-                <w:rFonts w:ascii="Assistant" w:hAnsi="Assistant" w:cs="Assistant" w:eastAsia="Assistant"/>
-                <w:sz w:val="18"/>
-                <w:szCs w:val="18"/>
+              <w:t xml:space="preserve">אופטומטריסט</w:t>
+            </w:r>
+          </w:p>
+          <w:p>
+            <w:pPr>
+              <w:jc w:val="left"/>
+              <w:bidi/>
+              <w:spacing w:before="0" w:after="0"/>
+            </w:pPr>
+            <w:r>
+              <w:rPr>
+                <w:rFonts w:ascii="Assistant" w:hAnsi="Assistant" w:cs="Assistant" w:eastAsia="Assistant"/>
+                <w:sz w:val="20"/>
+                <w:szCs w:val="20"/>
+                <w:rtl/>
+              </w:rPr>
+              <w:t>{optician_name}</w:t>
+            </w:r>
+          </w:p>
+        </w:tc>
+        <w:tc>
+          <w:tcPr>
+            <w:tcW w:w="3360" w:type="dxa"/>
+            <w:tcMar>
+              <w:top w:w="20" w:type="dxa"/>
+              <w:right w:w="95" w:type="dxa"/>
+              <w:bottom w:w="20" w:type="dxa"/>
+              <w:left w:w="95" w:type="dxa"/>
+            </w:tcMar>
+            <w:vAlign w:val="center"/>
+          </w:tcPr>
+          <w:p>
+            <w:pPr>
+              <w:jc w:val="left"/>
+              <w:bidi/>
+              <w:spacing w:before="0" w:after="3"/>
+            </w:pPr>
+            <w:r>
+              <w:rPr>
+                <w:rFonts w:ascii="Assistant" w:hAnsi="Assistant" w:cs="Assistant" w:eastAsia="Assistant"/>
+                <w:sz w:val="14"/>
+                <w:szCs w:val="14"/>
                 <w:rtl/>
                 <w:b/>
                 <w:bCs/>
@@ -1253,63 +1036,67 @@
               <w:t xml:space="preserve">יועץ</w:t>
             </w:r>
           </w:p>
-        </w:tc>
-        <w:tc>
-          <w:tcPr>
-            <w:tcW w:w="2160" w:type="dxa"/>
-            <w:tcMar>
-              <w:top w:w="40" w:type="dxa"/>
-              <w:right w:w="120" w:type="dxa"/>
-              <w:bottom w:w="40" w:type="dxa"/>
-              <w:left w:w="120" w:type="dxa"/>
-            </w:tcMar>
-            <w:vAlign w:val="center"/>
-          </w:tcPr>
-          <w:p>
-            <w:pPr>
-              <w:jc w:val="right"/>
-              <w:bidi/>
-              <w:spacing w:before="0" w:after="0"/>
-            </w:pPr>
-            <w:r>
-              <w:rPr>
-                <w:rFonts w:ascii="Assistant" w:hAnsi="Assistant" w:cs="Assistant" w:eastAsia="Assistant"/>
-                <w:sz w:val="20"/>
-                <w:szCs w:val="20"/>
-                <w:rtl/>
-              </w:rPr>
-              <w:t>{optician_name}</w:t>
-            </w:r>
-          </w:p>
-        </w:tc>
-        <w:tc>
-          <w:tcPr>
-            <w:tcW w:w="1200" w:type="dxa"/>
-            <w:tcMar>
-              <w:top w:w="40" w:type="dxa"/>
-              <w:right w:w="120" w:type="dxa"/>
-              <w:bottom w:w="40" w:type="dxa"/>
-              <w:left w:w="120" w:type="dxa"/>
-            </w:tcMar>
-            <w:vAlign w:val="center"/>
-          </w:tcPr>
-          <w:p>
-            <w:pPr>
-              <w:jc w:val="right"/>
-              <w:bidi/>
-              <w:spacing w:before="0" w:after="0"/>
-            </w:pPr>
-            <w:r>
-              <w:rPr>
-                <w:rFonts w:ascii="Assistant" w:hAnsi="Assistant" w:cs="Assistant" w:eastAsia="Assistant"/>
-                <w:sz w:val="18"/>
-                <w:szCs w:val="18"/>
+          <w:p>
+            <w:pPr>
+              <w:jc w:val="left"/>
+              <w:bidi/>
+              <w:spacing w:before="0" w:after="0"/>
+            </w:pPr>
+            <w:r>
+              <w:rPr>
+                <w:rFonts w:ascii="Assistant" w:hAnsi="Assistant" w:cs="Assistant" w:eastAsia="Assistant"/>
+                <w:sz w:val="20"/>
+                <w:szCs w:val="20"/>
+                <w:rtl/>
+              </w:rPr>
+              <w:t>{advisor_name}</w:t>
+            </w:r>
+          </w:p>
+        </w:tc>
+        <w:tc>
+          <w:tcPr>
+            <w:tcW w:w="3360" w:type="dxa"/>
+            <w:tcMar>
+              <w:top w:w="20" w:type="dxa"/>
+              <w:right w:w="95" w:type="dxa"/>
+              <w:bottom w:w="20" w:type="dxa"/>
+              <w:left w:w="95" w:type="dxa"/>
+            </w:tcMar>
+            <w:vAlign w:val="center"/>
+          </w:tcPr>
+          <w:p>
+            <w:pPr>
+              <w:jc w:val="left"/>
+              <w:bidi/>
+              <w:spacing w:before="0" w:after="3"/>
+            </w:pPr>
+            <w:r>
+              <w:rPr>
+                <w:rFonts w:ascii="Assistant" w:hAnsi="Assistant" w:cs="Assistant" w:eastAsia="Assistant"/>
+                <w:sz w:val="14"/>
+                <w:szCs w:val="14"/>
                 <w:rtl/>
                 <w:b/>
                 <w:bCs/>
                 <w:color w:val="52525B"/>
               </w:rPr>
-              <w:t xml:space="preserve">אופטומטריסט</w:t>
+              <w:t xml:space="preserve">מוסר עבודה</w:t>
+            </w:r>
+          </w:p>
+          <w:p>
+            <w:pPr>
+              <w:jc w:val="left"/>
+              <w:bidi/>
+              <w:spacing w:before="0" w:after="0"/>
+            </w:pPr>
+            <w:r>
+              <w:rPr>
+                <w:rFonts w:ascii="Assistant" w:hAnsi="Assistant" w:cs="Assistant" w:eastAsia="Assistant"/>
+                <w:sz w:val="20"/>
+                <w:szCs w:val="20"/>
+                <w:rtl/>
+              </w:rPr>
+              <w:t>{deliverer_name}</w:t>
             </w:r>
           </w:p>
         </w:tc>
@@ -1318,21 +1105,21 @@
     <w:p>
       <w:pPr>
         <w:bidi/>
-        <w:spacing w:after="60"/>
+        <w:spacing w:after="20"/>
       </w:pPr>
     </w:p>
     <w:p>
       <w:pPr>
-        <w:jc w:val="center"/>
+        <w:jc w:val="left"/>
         <w:bidi/>
-        <w:spacing w:before="120" w:after="40"/>
+        <w:spacing w:before="40" w:after="12"/>
         <w:keepNext/>
       </w:pPr>
       <w:r>
         <w:rPr>
           <w:rFonts w:ascii="Assistant" w:hAnsi="Assistant" w:cs="Assistant" w:eastAsia="Assistant"/>
-          <w:sz w:val="20"/>
-          <w:szCs w:val="20"/>
+          <w:sz w:val="22"/>
+          <w:szCs w:val="22"/>
           <w:rtl/>
           <w:b/>
           <w:bCs/>
@@ -1346,6 +1133,7 @@
         <w:tblW w:w="5000" w:type="pct"/>
         <w:tblLayout w:type="fixed"/>
         <w:jc w:val="right"/>
+        <w:bidiVisual w:val="1"/>
         <w:tblBorders>
           <w:top w:val="single" w:sz="4" w:space="0" w:color="E4E4E7"/>
           <w:left w:val="single" w:sz="4" w:space="0" w:color="E4E4E7"/>
@@ -1362,18 +1150,19 @@
         </w:tblCellMar>
       </w:tblPr>
       <w:tblGrid>
+        <w:gridCol w:w="1100"/>
         <w:gridCol w:w="1496"/>
         <w:gridCol w:w="1496"/>
         <w:gridCol w:w="1496"/>
         <w:gridCol w:w="1496"/>
         <w:gridCol w:w="1496"/>
         <w:gridCol w:w="1496"/>
-        <w:gridCol w:w="1100"/>
       </w:tblGrid>
       <w:tr>
         <w:tc>
           <w:tcPr>
-            <w:tcW w:w="1496" w:type="dxa"/>
+            <w:tcW w:w="1100" w:type="dxa"/>
+            <w:shd w:val="clear" w:color="auto" w:fill="F4F4F5"/>
             <w:tcMar>
               <w:top w:w="40" w:type="dxa"/>
               <w:right w:w="120" w:type="dxa"/>
@@ -1396,15 +1185,16 @@
                 <w:rtl/>
                 <w:b/>
                 <w:bCs/>
-                <w:color w:val="52525B"/>
-              </w:rPr>
-              <w:t xml:space="preserve">כמות</w:t>
+                <w:color w:val="18181B"/>
+              </w:rPr>
+              <w:t xml:space="preserve">עין</w:t>
             </w:r>
           </w:p>
         </w:tc>
         <w:tc>
           <w:tcPr>
             <w:tcW w:w="1496" w:type="dxa"/>
+            <w:shd w:val="clear" w:color="auto" w:fill="F4F4F5"/>
             <w:tcMar>
               <w:top w:w="40" w:type="dxa"/>
               <w:right w:w="120" w:type="dxa"/>
@@ -1429,13 +1219,14 @@
                 <w:bCs/>
                 <w:color w:val="52525B"/>
               </w:rPr>
-              <w:t xml:space="preserve">צבע</w:t>
+              <w:t xml:space="preserve">סוג</w:t>
             </w:r>
           </w:p>
         </w:tc>
         <w:tc>
           <w:tcPr>
             <w:tcW w:w="1496" w:type="dxa"/>
+            <w:shd w:val="clear" w:color="auto" w:fill="F4F4F5"/>
             <w:tcMar>
               <w:top w:w="40" w:type="dxa"/>
               <w:right w:w="120" w:type="dxa"/>
@@ -1460,13 +1251,14 @@
                 <w:bCs/>
                 <w:color w:val="52525B"/>
               </w:rPr>
-              <w:t xml:space="preserve">חומר</w:t>
+              <w:t xml:space="preserve">דגם</w:t>
             </w:r>
           </w:p>
         </w:tc>
         <w:tc>
           <w:tcPr>
             <w:tcW w:w="1496" w:type="dxa"/>
+            <w:shd w:val="clear" w:color="auto" w:fill="F4F4F5"/>
             <w:tcMar>
               <w:top w:w="40" w:type="dxa"/>
               <w:right w:w="120" w:type="dxa"/>
@@ -1498,6 +1290,7 @@
         <w:tc>
           <w:tcPr>
             <w:tcW w:w="1496" w:type="dxa"/>
+            <w:shd w:val="clear" w:color="auto" w:fill="F4F4F5"/>
             <w:tcMar>
               <w:top w:w="40" w:type="dxa"/>
               <w:right w:w="120" w:type="dxa"/>
@@ -1522,13 +1315,14 @@
                 <w:bCs/>
                 <w:color w:val="52525B"/>
               </w:rPr>
-              <w:t xml:space="preserve">דגם</w:t>
+              <w:t xml:space="preserve">חומר</w:t>
             </w:r>
           </w:p>
         </w:tc>
         <w:tc>
           <w:tcPr>
             <w:tcW w:w="1496" w:type="dxa"/>
+            <w:shd w:val="clear" w:color="auto" w:fill="F4F4F5"/>
             <w:tcMar>
               <w:top w:w="40" w:type="dxa"/>
               <w:right w:w="120" w:type="dxa"/>
@@ -1553,13 +1347,14 @@
                 <w:bCs/>
                 <w:color w:val="52525B"/>
               </w:rPr>
-              <w:t xml:space="preserve">סוג</w:t>
-            </w:r>
-          </w:p>
-        </w:tc>
-        <w:tc>
-          <w:tcPr>
-            <w:tcW w:w="1100" w:type="dxa"/>
+              <w:t xml:space="preserve">צבע</w:t>
+            </w:r>
+          </w:p>
+        </w:tc>
+        <w:tc>
+          <w:tcPr>
+            <w:tcW w:w="1496" w:type="dxa"/>
+            <w:shd w:val="clear" w:color="auto" w:fill="F4F4F5"/>
             <w:tcMar>
               <w:top w:w="40" w:type="dxa"/>
               <w:right w:w="120" w:type="dxa"/>
@@ -1582,9 +1377,9 @@
                 <w:rtl/>
                 <w:b/>
                 <w:bCs/>
-                <w:color w:val="18181B"/>
-              </w:rPr>
-              <w:t xml:space="preserve">עין</w:t>
+                <w:color w:val="52525B"/>
+              </w:rPr>
+              <w:t xml:space="preserve">כמות</w:t>
             </w:r>
           </w:p>
         </w:tc>
@@ -1592,7 +1387,8 @@
       <w:tr>
         <w:tc>
           <w:tcPr>
-            <w:tcW w:w="1496" w:type="dxa"/>
+            <w:tcW w:w="1100" w:type="dxa"/>
+            <w:shd w:val="clear" w:color="auto" w:fill="F4F4F5"/>
             <w:tcMar>
               <w:top w:w="40" w:type="dxa"/>
               <w:right w:w="120" w:type="dxa"/>
@@ -1613,8 +1409,10 @@
                 <w:sz w:val="20"/>
                 <w:szCs w:val="20"/>
                 <w:rtl/>
-              </w:rPr>
-              <w:t>{r_quantity}</w:t>
+                <w:b/>
+                <w:bCs/>
+              </w:rPr>
+              <w:t xml:space="preserve">ימין</w:t>
             </w:r>
           </w:p>
         </w:tc>
@@ -1642,7 +1440,7 @@
                 <w:szCs w:val="20"/>
                 <w:rtl/>
               </w:rPr>
-              <w:t>{r_color}</w:t>
+              <w:t>{r_lens_type}</w:t>
             </w:r>
           </w:p>
         </w:tc>
@@ -1670,7 +1468,7 @@
                 <w:szCs w:val="20"/>
                 <w:rtl/>
               </w:rPr>
-              <w:t>{r_material}</w:t>
+              <w:t>{r_model}</w:t>
             </w:r>
           </w:p>
         </w:tc>
@@ -1726,7 +1524,7 @@
                 <w:szCs w:val="20"/>
                 <w:rtl/>
               </w:rPr>
-              <w:t>{r_model}</w:t>
+              <w:t>{r_material}</w:t>
             </w:r>
           </w:p>
         </w:tc>
@@ -1754,13 +1552,13 @@
                 <w:szCs w:val="20"/>
                 <w:rtl/>
               </w:rPr>
-              <w:t>{r_lens_type}</w:t>
-            </w:r>
-          </w:p>
-        </w:tc>
-        <w:tc>
-          <w:tcPr>
-            <w:tcW w:w="1100" w:type="dxa"/>
+              <w:t>{r_color}</w:t>
+            </w:r>
+          </w:p>
+        </w:tc>
+        <w:tc>
+          <w:tcPr>
+            <w:tcW w:w="1496" w:type="dxa"/>
             <w:tcMar>
               <w:top w:w="40" w:type="dxa"/>
               <w:right w:w="120" w:type="dxa"/>
@@ -1781,10 +1579,8 @@
                 <w:sz w:val="20"/>
                 <w:szCs w:val="20"/>
                 <w:rtl/>
-                <w:b/>
-                <w:bCs/>
-              </w:rPr>
-              <w:t xml:space="preserve">ימין</w:t>
+              </w:rPr>
+              <w:t>{r_quantity}</w:t>
             </w:r>
           </w:p>
         </w:tc>
@@ -1792,7 +1588,8 @@
       <w:tr>
         <w:tc>
           <w:tcPr>
-            <w:tcW w:w="1496" w:type="dxa"/>
+            <w:tcW w:w="1100" w:type="dxa"/>
+            <w:shd w:val="clear" w:color="auto" w:fill="F4F4F5"/>
             <w:tcMar>
               <w:top w:w="40" w:type="dxa"/>
               <w:right w:w="120" w:type="dxa"/>
@@ -1813,8 +1610,10 @@
                 <w:sz w:val="20"/>
                 <w:szCs w:val="20"/>
                 <w:rtl/>
-              </w:rPr>
-              <w:t>{l_quantity}</w:t>
+                <w:b/>
+                <w:bCs/>
+              </w:rPr>
+              <w:t xml:space="preserve">שמאל</w:t>
             </w:r>
           </w:p>
         </w:tc>
@@ -1842,7 +1641,7 @@
                 <w:szCs w:val="20"/>
                 <w:rtl/>
               </w:rPr>
-              <w:t>{l_color}</w:t>
+              <w:t>{l_lens_type}</w:t>
             </w:r>
           </w:p>
         </w:tc>
@@ -1870,7 +1669,7 @@
                 <w:szCs w:val="20"/>
                 <w:rtl/>
               </w:rPr>
-              <w:t>{l_material}</w:t>
+              <w:t>{l_model}</w:t>
             </w:r>
           </w:p>
         </w:tc>
@@ -1926,7 +1725,7 @@
                 <w:szCs w:val="20"/>
                 <w:rtl/>
               </w:rPr>
-              <w:t>{l_model}</w:t>
+              <w:t>{l_material}</w:t>
             </w:r>
           </w:p>
         </w:tc>
@@ -1954,13 +1753,13 @@
                 <w:szCs w:val="20"/>
                 <w:rtl/>
               </w:rPr>
-              <w:t>{l_lens_type}</w:t>
-            </w:r>
-          </w:p>
-        </w:tc>
-        <w:tc>
-          <w:tcPr>
-            <w:tcW w:w="1100" w:type="dxa"/>
+              <w:t>{l_color}</w:t>
+            </w:r>
+          </w:p>
+        </w:tc>
+        <w:tc>
+          <w:tcPr>
+            <w:tcW w:w="1496" w:type="dxa"/>
             <w:tcMar>
               <w:top w:w="40" w:type="dxa"/>
               <w:right w:w="120" w:type="dxa"/>
@@ -1981,10 +1780,8 @@
                 <w:sz w:val="20"/>
                 <w:szCs w:val="20"/>
                 <w:rtl/>
-                <w:b/>
-                <w:bCs/>
-              </w:rPr>
-              <w:t xml:space="preserve">שמאל</w:t>
+              </w:rPr>
+              <w:t>{l_quantity}</w:t>
             </w:r>
           </w:p>
         </w:tc>
@@ -1993,21 +1790,21 @@
     <w:p>
       <w:pPr>
         <w:bidi/>
-        <w:spacing w:after="60"/>
+        <w:spacing w:after="20"/>
       </w:pPr>
     </w:p>
     <w:p>
       <w:pPr>
-        <w:jc w:val="center"/>
+        <w:jc w:val="left"/>
         <w:bidi/>
-        <w:spacing w:before="120" w:after="40"/>
+        <w:spacing w:before="40" w:after="12"/>
         <w:keepNext/>
       </w:pPr>
       <w:r>
         <w:rPr>
           <w:rFonts w:ascii="Assistant" w:hAnsi="Assistant" w:cs="Assistant" w:eastAsia="Assistant"/>
-          <w:sz w:val="20"/>
-          <w:szCs w:val="20"/>
+          <w:sz w:val="22"/>
+          <w:szCs w:val="22"/>
           <w:rtl/>
           <w:b/>
           <w:bCs/>
@@ -2021,6 +1818,7 @@
         <w:tblW w:w="5000" w:type="pct"/>
         <w:tblLayout w:type="fixed"/>
         <w:jc w:val="right"/>
+        <w:bidiVisual w:val="1"/>
         <w:tblBorders>
           <w:top w:val="single" w:sz="4" w:space="0" w:color="E4E4E7"/>
           <w:left w:val="single" w:sz="4" w:space="0" w:color="E4E4E7"/>
@@ -2037,6 +1835,7 @@
         </w:tblCellMar>
       </w:tblPr>
       <w:tblGrid>
+        <w:gridCol w:w="1100"/>
         <w:gridCol w:w="1282"/>
         <w:gridCol w:w="1282"/>
         <w:gridCol w:w="1282"/>
@@ -2044,12 +1843,12 @@
         <w:gridCol w:w="1282"/>
         <w:gridCol w:w="1282"/>
         <w:gridCol w:w="1282"/>
-        <w:gridCol w:w="1100"/>
       </w:tblGrid>
       <w:tr>
         <w:tc>
           <w:tcPr>
-            <w:tcW w:w="1282" w:type="dxa"/>
+            <w:tcW w:w="1100" w:type="dxa"/>
+            <w:shd w:val="clear" w:color="auto" w:fill="F4F4F5"/>
             <w:tcMar>
               <w:top w:w="40" w:type="dxa"/>
               <w:right w:w="120" w:type="dxa"/>
@@ -2072,15 +1871,16 @@
                 <w:rtl/>
                 <w:b/>
                 <w:bCs/>
-                <w:color w:val="52525B"/>
-              </w:rPr>
-              <w:t xml:space="preserve">READ/ADD</w:t>
+                <w:color w:val="18181B"/>
+              </w:rPr>
+              <w:t xml:space="preserve">עין</w:t>
             </w:r>
           </w:p>
         </w:tc>
         <w:tc>
           <w:tcPr>
             <w:tcW w:w="1282" w:type="dxa"/>
+            <w:shd w:val="clear" w:color="auto" w:fill="F4F4F5"/>
             <w:tcMar>
               <w:top w:w="40" w:type="dxa"/>
               <w:right w:w="120" w:type="dxa"/>
@@ -2105,13 +1905,14 @@
                 <w:bCs/>
                 <w:color w:val="52525B"/>
               </w:rPr>
-              <w:t xml:space="preserve">AX</w:t>
+              <w:t xml:space="preserve">BC</w:t>
             </w:r>
           </w:p>
         </w:tc>
         <w:tc>
           <w:tcPr>
             <w:tcW w:w="1282" w:type="dxa"/>
+            <w:shd w:val="clear" w:color="auto" w:fill="F4F4F5"/>
             <w:tcMar>
               <w:top w:w="40" w:type="dxa"/>
               <w:right w:w="120" w:type="dxa"/>
@@ -2136,13 +1937,14 @@
                 <w:bCs/>
                 <w:color w:val="52525B"/>
               </w:rPr>
-              <w:t xml:space="preserve">CYL</w:t>
+              <w:t xml:space="preserve">OZ</w:t>
             </w:r>
           </w:p>
         </w:tc>
         <w:tc>
           <w:tcPr>
             <w:tcW w:w="1282" w:type="dxa"/>
+            <w:shd w:val="clear" w:color="auto" w:fill="F4F4F5"/>
             <w:tcMar>
               <w:top w:w="40" w:type="dxa"/>
               <w:right w:w="120" w:type="dxa"/>
@@ -2167,13 +1969,14 @@
                 <w:bCs/>
                 <w:color w:val="52525B"/>
               </w:rPr>
-              <w:t xml:space="preserve">SPH</w:t>
+              <w:t xml:space="preserve">DIAM</w:t>
             </w:r>
           </w:p>
         </w:tc>
         <w:tc>
           <w:tcPr>
             <w:tcW w:w="1282" w:type="dxa"/>
+            <w:shd w:val="clear" w:color="auto" w:fill="F4F4F5"/>
             <w:tcMar>
               <w:top w:w="40" w:type="dxa"/>
               <w:right w:w="120" w:type="dxa"/>
@@ -2198,13 +2001,14 @@
                 <w:bCs/>
                 <w:color w:val="52525B"/>
               </w:rPr>
-              <w:t xml:space="preserve">DIAM</w:t>
+              <w:t xml:space="preserve">SPH</w:t>
             </w:r>
           </w:p>
         </w:tc>
         <w:tc>
           <w:tcPr>
             <w:tcW w:w="1282" w:type="dxa"/>
+            <w:shd w:val="clear" w:color="auto" w:fill="F4F4F5"/>
             <w:tcMar>
               <w:top w:w="40" w:type="dxa"/>
               <w:right w:w="120" w:type="dxa"/>
@@ -2229,13 +2033,14 @@
                 <w:bCs/>
                 <w:color w:val="52525B"/>
               </w:rPr>
-              <w:t xml:space="preserve">OZ</w:t>
+              <w:t xml:space="preserve">CYL</w:t>
             </w:r>
           </w:p>
         </w:tc>
         <w:tc>
           <w:tcPr>
             <w:tcW w:w="1282" w:type="dxa"/>
+            <w:shd w:val="clear" w:color="auto" w:fill="F4F4F5"/>
             <w:tcMar>
               <w:top w:w="40" w:type="dxa"/>
               <w:right w:w="120" w:type="dxa"/>
@@ -2260,13 +2065,14 @@
                 <w:bCs/>
                 <w:color w:val="52525B"/>
               </w:rPr>
-              <w:t xml:space="preserve">BC</w:t>
-            </w:r>
-          </w:p>
-        </w:tc>
-        <w:tc>
-          <w:tcPr>
-            <w:tcW w:w="1100" w:type="dxa"/>
+              <w:t xml:space="preserve">AX</w:t>
+            </w:r>
+          </w:p>
+        </w:tc>
+        <w:tc>
+          <w:tcPr>
+            <w:tcW w:w="1282" w:type="dxa"/>
+            <w:shd w:val="clear" w:color="auto" w:fill="F4F4F5"/>
             <w:tcMar>
               <w:top w:w="40" w:type="dxa"/>
               <w:right w:w="120" w:type="dxa"/>
@@ -2289,9 +2095,9 @@
                 <w:rtl/>
                 <w:b/>
                 <w:bCs/>
-                <w:color w:val="18181B"/>
-              </w:rPr>
-              <w:t xml:space="preserve">עין</w:t>
+                <w:color w:val="52525B"/>
+              </w:rPr>
+              <w:t xml:space="preserve">READ/ADD</w:t>
             </w:r>
           </w:p>
         </w:tc>
@@ -2299,7 +2105,8 @@
       <w:tr>
         <w:tc>
           <w:tcPr>
-            <w:tcW w:w="1282" w:type="dxa"/>
+            <w:tcW w:w="1100" w:type="dxa"/>
+            <w:shd w:val="clear" w:color="auto" w:fill="F4F4F5"/>
             <w:tcMar>
               <w:top w:w="40" w:type="dxa"/>
               <w:right w:w="120" w:type="dxa"/>
@@ -2320,8 +2127,10 @@
                 <w:sz w:val="20"/>
                 <w:szCs w:val="20"/>
                 <w:rtl/>
-              </w:rPr>
-              <w:t>{r_read_add}</w:t>
+                <w:b/>
+                <w:bCs/>
+              </w:rPr>
+              <w:t xml:space="preserve">ימין</w:t>
             </w:r>
           </w:p>
         </w:tc>
@@ -2349,7 +2158,7 @@
                 <w:szCs w:val="20"/>
                 <w:rtl/>
               </w:rPr>
-              <w:t>{r_ax}</w:t>
+              <w:t>{r_bc}</w:t>
             </w:r>
           </w:p>
         </w:tc>
@@ -2377,7 +2186,7 @@
                 <w:szCs w:val="20"/>
                 <w:rtl/>
               </w:rPr>
-              <w:t>{r_cyl}</w:t>
+              <w:t>{r_oz}</w:t>
             </w:r>
           </w:p>
         </w:tc>
@@ -2405,7 +2214,7 @@
                 <w:szCs w:val="20"/>
                 <w:rtl/>
               </w:rPr>
-              <w:t>{r_sph}</w:t>
+              <w:t>{r_diam}</w:t>
             </w:r>
           </w:p>
         </w:tc>
@@ -2433,7 +2242,7 @@
                 <w:szCs w:val="20"/>
                 <w:rtl/>
               </w:rPr>
-              <w:t>{r_diam}</w:t>
+              <w:t>{r_sph}</w:t>
             </w:r>
           </w:p>
         </w:tc>
@@ -2461,7 +2270,7 @@
                 <w:szCs w:val="20"/>
                 <w:rtl/>
               </w:rPr>
-              <w:t>{r_oz}</w:t>
+              <w:t>{r_cyl}</w:t>
             </w:r>
           </w:p>
         </w:tc>
@@ -2489,13 +2298,13 @@
                 <w:szCs w:val="20"/>
                 <w:rtl/>
               </w:rPr>
-              <w:t>{r_bc}</w:t>
-            </w:r>
-          </w:p>
-        </w:tc>
-        <w:tc>
-          <w:tcPr>
-            <w:tcW w:w="1100" w:type="dxa"/>
+              <w:t>{r_ax}</w:t>
+            </w:r>
+          </w:p>
+        </w:tc>
+        <w:tc>
+          <w:tcPr>
+            <w:tcW w:w="1282" w:type="dxa"/>
             <w:tcMar>
               <w:top w:w="40" w:type="dxa"/>
               <w:right w:w="120" w:type="dxa"/>
@@ -2516,10 +2325,8 @@
                 <w:sz w:val="20"/>
                 <w:szCs w:val="20"/>
                 <w:rtl/>
-                <w:b/>
-                <w:bCs/>
-              </w:rPr>
-              <w:t xml:space="preserve">ימין</w:t>
+              </w:rPr>
+              <w:t>{r_read_add}</w:t>
             </w:r>
           </w:p>
         </w:tc>
@@ -2527,7 +2334,8 @@
       <w:tr>
         <w:tc>
           <w:tcPr>
-            <w:tcW w:w="1282" w:type="dxa"/>
+            <w:tcW w:w="1100" w:type="dxa"/>
+            <w:shd w:val="clear" w:color="auto" w:fill="F4F4F5"/>
             <w:tcMar>
               <w:top w:w="40" w:type="dxa"/>
               <w:right w:w="120" w:type="dxa"/>
@@ -2548,8 +2356,10 @@
                 <w:sz w:val="20"/>
                 <w:szCs w:val="20"/>
                 <w:rtl/>
-              </w:rPr>
-              <w:t>{l_read_add}</w:t>
+                <w:b/>
+                <w:bCs/>
+              </w:rPr>
+              <w:t xml:space="preserve">שמאל</w:t>
             </w:r>
           </w:p>
         </w:tc>
@@ -2577,7 +2387,7 @@
                 <w:szCs w:val="20"/>
                 <w:rtl/>
               </w:rPr>
-              <w:t>{l_ax}</w:t>
+              <w:t>{l_bc}</w:t>
             </w:r>
           </w:p>
         </w:tc>
@@ -2605,7 +2415,7 @@
                 <w:szCs w:val="20"/>
                 <w:rtl/>
               </w:rPr>
-              <w:t>{l_cyl}</w:t>
+              <w:t>{l_oz}</w:t>
             </w:r>
           </w:p>
         </w:tc>
@@ -2633,7 +2443,7 @@
                 <w:szCs w:val="20"/>
                 <w:rtl/>
               </w:rPr>
-              <w:t>{l_sph}</w:t>
+              <w:t>{l_diam}</w:t>
             </w:r>
           </w:p>
         </w:tc>
@@ -2661,7 +2471,7 @@
                 <w:szCs w:val="20"/>
                 <w:rtl/>
               </w:rPr>
-              <w:t>{l_diam}</w:t>
+              <w:t>{l_sph}</w:t>
             </w:r>
           </w:p>
         </w:tc>
@@ -2689,7 +2499,7 @@
                 <w:szCs w:val="20"/>
                 <w:rtl/>
               </w:rPr>
-              <w:t>{l_oz}</w:t>
+              <w:t>{l_cyl}</w:t>
             </w:r>
           </w:p>
         </w:tc>
@@ -2717,13 +2527,13 @@
                 <w:szCs w:val="20"/>
                 <w:rtl/>
               </w:rPr>
-              <w:t>{l_bc}</w:t>
-            </w:r>
-          </w:p>
-        </w:tc>
-        <w:tc>
-          <w:tcPr>
-            <w:tcW w:w="1100" w:type="dxa"/>
+              <w:t>{l_ax}</w:t>
+            </w:r>
+          </w:p>
+        </w:tc>
+        <w:tc>
+          <w:tcPr>
+            <w:tcW w:w="1282" w:type="dxa"/>
             <w:tcMar>
               <w:top w:w="40" w:type="dxa"/>
               <w:right w:w="120" w:type="dxa"/>
@@ -2744,10 +2554,8 @@
                 <w:sz w:val="20"/>
                 <w:szCs w:val="20"/>
                 <w:rtl/>
-                <w:b/>
-                <w:bCs/>
-              </w:rPr>
-              <w:t xml:space="preserve">שמאל</w:t>
+              </w:rPr>
+              <w:t>{l_read_add}</w:t>
             </w:r>
           </w:p>
         </w:tc>
@@ -2756,21 +2564,21 @@
     <w:p>
       <w:pPr>
         <w:bidi/>
-        <w:spacing w:after="60"/>
+        <w:spacing w:after="20"/>
       </w:pPr>
     </w:p>
     <w:p>
       <w:pPr>
-        <w:jc w:val="center"/>
+        <w:jc w:val="left"/>
         <w:bidi/>
-        <w:spacing w:before="120" w:after="40"/>
+        <w:spacing w:before="40" w:after="12"/>
         <w:keepNext/>
       </w:pPr>
       <w:r>
         <w:rPr>
           <w:rFonts w:ascii="Assistant" w:hAnsi="Assistant" w:cs="Assistant" w:eastAsia="Assistant"/>
-          <w:sz w:val="20"/>
-          <w:szCs w:val="20"/>
+          <w:sz w:val="22"/>
+          <w:szCs w:val="22"/>
           <w:rtl/>
           <w:b/>
           <w:bCs/>
@@ -2800,123 +2608,80 @@
         </w:tblCellMar>
       </w:tblPr>
       <w:tblGrid>
-        <w:gridCol w:w="2160"/>
-        <w:gridCol w:w="1200"/>
-        <w:gridCol w:w="2160"/>
-        <w:gridCol w:w="1200"/>
-        <w:gridCol w:w="2160"/>
-        <w:gridCol w:w="1200"/>
+        <w:gridCol w:w="3360"/>
+        <w:gridCol w:w="3360"/>
+        <w:gridCol w:w="3360"/>
       </w:tblGrid>
       <w:tr>
         <w:tc>
           <w:tcPr>
-            <w:tcW w:w="2160" w:type="dxa"/>
-            <w:tcMar>
-              <w:top w:w="40" w:type="dxa"/>
-              <w:right w:w="120" w:type="dxa"/>
-              <w:bottom w:w="40" w:type="dxa"/>
-              <w:left w:w="120" w:type="dxa"/>
-            </w:tcMar>
-            <w:vAlign w:val="center"/>
-          </w:tcPr>
-          <w:p>
-            <w:pPr>
-              <w:jc w:val="right"/>
-              <w:bidi/>
-              <w:spacing w:before="0" w:after="0"/>
-            </w:pPr>
-            <w:r>
-              <w:rPr>
-                <w:rFonts w:ascii="Assistant" w:hAnsi="Assistant" w:cs="Assistant" w:eastAsia="Assistant"/>
-                <w:sz w:val="20"/>
-                <w:szCs w:val="20"/>
-                <w:rtl/>
-              </w:rPr>
-              <w:t>{rinsing_solution}</w:t>
-            </w:r>
-          </w:p>
-        </w:tc>
-        <w:tc>
-          <w:tcPr>
-            <w:tcW w:w="1200" w:type="dxa"/>
-            <w:tcMar>
-              <w:top w:w="40" w:type="dxa"/>
-              <w:right w:w="120" w:type="dxa"/>
-              <w:bottom w:w="40" w:type="dxa"/>
-              <w:left w:w="120" w:type="dxa"/>
-            </w:tcMar>
-            <w:vAlign w:val="center"/>
-          </w:tcPr>
-          <w:p>
-            <w:pPr>
-              <w:jc w:val="right"/>
-              <w:bidi/>
-              <w:spacing w:before="0" w:after="0"/>
-            </w:pPr>
-            <w:r>
-              <w:rPr>
-                <w:rFonts w:ascii="Assistant" w:hAnsi="Assistant" w:cs="Assistant" w:eastAsia="Assistant"/>
-                <w:sz w:val="18"/>
-                <w:szCs w:val="18"/>
+            <w:tcW w:w="3360" w:type="dxa"/>
+            <w:tcMar>
+              <w:top w:w="20" w:type="dxa"/>
+              <w:right w:w="95" w:type="dxa"/>
+              <w:bottom w:w="20" w:type="dxa"/>
+              <w:left w:w="95" w:type="dxa"/>
+            </w:tcMar>
+            <w:vAlign w:val="center"/>
+          </w:tcPr>
+          <w:p>
+            <w:pPr>
+              <w:jc w:val="left"/>
+              <w:bidi/>
+              <w:spacing w:before="0" w:after="3"/>
+            </w:pPr>
+            <w:r>
+              <w:rPr>
+                <w:rFonts w:ascii="Assistant" w:hAnsi="Assistant" w:cs="Assistant" w:eastAsia="Assistant"/>
+                <w:sz w:val="14"/>
+                <w:szCs w:val="14"/>
                 <w:rtl/>
                 <w:b/>
                 <w:bCs/>
                 <w:color w:val="52525B"/>
               </w:rPr>
-              <w:t xml:space="preserve">שטיפה</w:t>
-            </w:r>
-          </w:p>
-        </w:tc>
-        <w:tc>
-          <w:tcPr>
-            <w:tcW w:w="2160" w:type="dxa"/>
-            <w:tcMar>
-              <w:top w:w="40" w:type="dxa"/>
-              <w:right w:w="120" w:type="dxa"/>
-              <w:bottom w:w="40" w:type="dxa"/>
-              <w:left w:w="120" w:type="dxa"/>
-            </w:tcMar>
-            <w:vAlign w:val="center"/>
-          </w:tcPr>
-          <w:p>
-            <w:pPr>
-              <w:jc w:val="right"/>
-              <w:bidi/>
-              <w:spacing w:before="0" w:after="0"/>
-            </w:pPr>
-            <w:r>
-              <w:rPr>
-                <w:rFonts w:ascii="Assistant" w:hAnsi="Assistant" w:cs="Assistant" w:eastAsia="Assistant"/>
-                <w:sz w:val="20"/>
-                <w:szCs w:val="20"/>
-                <w:rtl/>
-              </w:rPr>
-              <w:t>{disinfection_solution}</w:t>
-            </w:r>
-          </w:p>
-        </w:tc>
-        <w:tc>
-          <w:tcPr>
-            <w:tcW w:w="1200" w:type="dxa"/>
-            <w:tcMar>
-              <w:top w:w="40" w:type="dxa"/>
-              <w:right w:w="120" w:type="dxa"/>
-              <w:bottom w:w="40" w:type="dxa"/>
-              <w:left w:w="120" w:type="dxa"/>
-            </w:tcMar>
-            <w:vAlign w:val="center"/>
-          </w:tcPr>
-          <w:p>
-            <w:pPr>
-              <w:jc w:val="right"/>
-              <w:bidi/>
-              <w:spacing w:before="0" w:after="0"/>
-            </w:pPr>
-            <w:r>
-              <w:rPr>
-                <w:rFonts w:ascii="Assistant" w:hAnsi="Assistant" w:cs="Assistant" w:eastAsia="Assistant"/>
-                <w:sz w:val="18"/>
-                <w:szCs w:val="18"/>
+              <w:t xml:space="preserve">ניקוי</w:t>
+            </w:r>
+          </w:p>
+          <w:p>
+            <w:pPr>
+              <w:jc w:val="left"/>
+              <w:bidi/>
+              <w:spacing w:before="0" w:after="0"/>
+            </w:pPr>
+            <w:r>
+              <w:rPr>
+                <w:rFonts w:ascii="Assistant" w:hAnsi="Assistant" w:cs="Assistant" w:eastAsia="Assistant"/>
+                <w:sz w:val="20"/>
+                <w:szCs w:val="20"/>
+                <w:rtl/>
+              </w:rPr>
+              <w:t>{cleaning_solution}</w:t>
+            </w:r>
+          </w:p>
+        </w:tc>
+        <w:tc>
+          <w:tcPr>
+            <w:tcW w:w="3360" w:type="dxa"/>
+            <w:tcMar>
+              <w:top w:w="20" w:type="dxa"/>
+              <w:right w:w="95" w:type="dxa"/>
+              <w:bottom w:w="20" w:type="dxa"/>
+              <w:left w:w="95" w:type="dxa"/>
+            </w:tcMar>
+            <w:vAlign w:val="center"/>
+          </w:tcPr>
+          <w:p>
+            <w:pPr>
+              <w:jc w:val="left"/>
+              <w:bidi/>
+              <w:spacing w:before="0" w:after="3"/>
+            </w:pPr>
+            <w:r>
+              <w:rPr>
+                <w:rFonts w:ascii="Assistant" w:hAnsi="Assistant" w:cs="Assistant" w:eastAsia="Assistant"/>
+                <w:sz w:val="14"/>
+                <w:szCs w:val="14"/>
                 <w:rtl/>
                 <w:b/>
                 <w:bCs/>
@@ -2925,63 +2690,67 @@
               <w:t xml:space="preserve">חיטוי</w:t>
             </w:r>
           </w:p>
-        </w:tc>
-        <w:tc>
-          <w:tcPr>
-            <w:tcW w:w="2160" w:type="dxa"/>
-            <w:tcMar>
-              <w:top w:w="40" w:type="dxa"/>
-              <w:right w:w="120" w:type="dxa"/>
-              <w:bottom w:w="40" w:type="dxa"/>
-              <w:left w:w="120" w:type="dxa"/>
-            </w:tcMar>
-            <w:vAlign w:val="center"/>
-          </w:tcPr>
-          <w:p>
-            <w:pPr>
-              <w:jc w:val="right"/>
-              <w:bidi/>
-              <w:spacing w:before="0" w:after="0"/>
-            </w:pPr>
-            <w:r>
-              <w:rPr>
-                <w:rFonts w:ascii="Assistant" w:hAnsi="Assistant" w:cs="Assistant" w:eastAsia="Assistant"/>
-                <w:sz w:val="20"/>
-                <w:szCs w:val="20"/>
-                <w:rtl/>
-              </w:rPr>
-              <w:t>{cleaning_solution}</w:t>
-            </w:r>
-          </w:p>
-        </w:tc>
-        <w:tc>
-          <w:tcPr>
-            <w:tcW w:w="1200" w:type="dxa"/>
-            <w:tcMar>
-              <w:top w:w="40" w:type="dxa"/>
-              <w:right w:w="120" w:type="dxa"/>
-              <w:bottom w:w="40" w:type="dxa"/>
-              <w:left w:w="120" w:type="dxa"/>
-            </w:tcMar>
-            <w:vAlign w:val="center"/>
-          </w:tcPr>
-          <w:p>
-            <w:pPr>
-              <w:jc w:val="right"/>
-              <w:bidi/>
-              <w:spacing w:before="0" w:after="0"/>
-            </w:pPr>
-            <w:r>
-              <w:rPr>
-                <w:rFonts w:ascii="Assistant" w:hAnsi="Assistant" w:cs="Assistant" w:eastAsia="Assistant"/>
-                <w:sz w:val="18"/>
-                <w:szCs w:val="18"/>
+          <w:p>
+            <w:pPr>
+              <w:jc w:val="left"/>
+              <w:bidi/>
+              <w:spacing w:before="0" w:after="0"/>
+            </w:pPr>
+            <w:r>
+              <w:rPr>
+                <w:rFonts w:ascii="Assistant" w:hAnsi="Assistant" w:cs="Assistant" w:eastAsia="Assistant"/>
+                <w:sz w:val="20"/>
+                <w:szCs w:val="20"/>
+                <w:rtl/>
+              </w:rPr>
+              <w:t>{disinfection_solution}</w:t>
+            </w:r>
+          </w:p>
+        </w:tc>
+        <w:tc>
+          <w:tcPr>
+            <w:tcW w:w="3360" w:type="dxa"/>
+            <w:tcMar>
+              <w:top w:w="20" w:type="dxa"/>
+              <w:right w:w="95" w:type="dxa"/>
+              <w:bottom w:w="20" w:type="dxa"/>
+              <w:left w:w="95" w:type="dxa"/>
+            </w:tcMar>
+            <w:vAlign w:val="center"/>
+          </w:tcPr>
+          <w:p>
+            <w:pPr>
+              <w:jc w:val="left"/>
+              <w:bidi/>
+              <w:spacing w:before="0" w:after="3"/>
+            </w:pPr>
+            <w:r>
+              <w:rPr>
+                <w:rFonts w:ascii="Assistant" w:hAnsi="Assistant" w:cs="Assistant" w:eastAsia="Assistant"/>
+                <w:sz w:val="14"/>
+                <w:szCs w:val="14"/>
                 <w:rtl/>
                 <w:b/>
                 <w:bCs/>
                 <w:color w:val="52525B"/>
               </w:rPr>
-              <w:t xml:space="preserve">ניקוי</w:t>
+              <w:t xml:space="preserve">שטיפה</w:t>
+            </w:r>
+          </w:p>
+          <w:p>
+            <w:pPr>
+              <w:jc w:val="left"/>
+              <w:bidi/>
+              <w:spacing w:before="0" w:after="0"/>
+            </w:pPr>
+            <w:r>
+              <w:rPr>
+                <w:rFonts w:ascii="Assistant" w:hAnsi="Assistant" w:cs="Assistant" w:eastAsia="Assistant"/>
+                <w:sz w:val="20"/>
+                <w:szCs w:val="20"/>
+                <w:rtl/>
+              </w:rPr>
+              <w:t>{rinsing_solution}</w:t>
             </w:r>
           </w:p>
         </w:tc>
@@ -2990,21 +2759,21 @@
     <w:p>
       <w:pPr>
         <w:bidi/>
-        <w:spacing w:after="60"/>
+        <w:spacing w:after="20"/>
       </w:pPr>
     </w:p>
     <w:p>
       <w:pPr>
-        <w:jc w:val="center"/>
+        <w:jc w:val="left"/>
         <w:bidi/>
-        <w:spacing w:before="120" w:after="40"/>
+        <w:spacing w:before="40" w:after="12"/>
         <w:keepNext/>
       </w:pPr>
       <w:r>
         <w:rPr>
           <w:rFonts w:ascii="Assistant" w:hAnsi="Assistant" w:cs="Assistant" w:eastAsia="Assistant"/>
-          <w:sz w:val="20"/>
-          <w:szCs w:val="20"/>
+          <w:sz w:val="22"/>
+          <w:szCs w:val="22"/>
           <w:rtl/>
           <w:b/>
           <w:bCs/>
@@ -3034,148 +2803,92 @@
         </w:tblCellMar>
       </w:tblPr>
       <w:tblGrid>
-        <w:gridCol w:w="1320"/>
-        <w:gridCol w:w="1200"/>
-        <w:gridCol w:w="1320"/>
-        <w:gridCol w:w="1200"/>
-        <w:gridCol w:w="1320"/>
-        <w:gridCol w:w="1200"/>
-        <w:gridCol w:w="1320"/>
-        <w:gridCol w:w="1200"/>
+        <w:gridCol w:w="2520"/>
+        <w:gridCol w:w="2520"/>
+        <w:gridCol w:w="2520"/>
+        <w:gridCol w:w="2520"/>
       </w:tblGrid>
       <w:tr>
         <w:tc>
           <w:tcPr>
-            <w:tcW w:w="1320" w:type="dxa"/>
-            <w:tcMar>
-              <w:top w:w="40" w:type="dxa"/>
-              <w:right w:w="120" w:type="dxa"/>
-              <w:bottom w:w="40" w:type="dxa"/>
-              <w:left w:w="120" w:type="dxa"/>
-            </w:tcMar>
-            <w:vAlign w:val="center"/>
-          </w:tcPr>
-          <w:p>
-            <w:pPr>
-              <w:jc w:val="right"/>
-              <w:bidi/>
-              <w:spacing w:before="0" w:after="0"/>
-            </w:pPr>
-            <w:r>
-              <w:rPr>
-                <w:rFonts w:ascii="Assistant" w:hAnsi="Assistant" w:cs="Assistant" w:eastAsia="Assistant"/>
-                <w:sz w:val="20"/>
-                <w:szCs w:val="20"/>
-                <w:rtl/>
-              </w:rPr>
-              <w:t>{payment_status}</w:t>
-            </w:r>
-          </w:p>
-        </w:tc>
-        <w:tc>
-          <w:tcPr>
-            <w:tcW w:w="1200" w:type="dxa"/>
-            <w:tcMar>
-              <w:top w:w="40" w:type="dxa"/>
-              <w:right w:w="120" w:type="dxa"/>
-              <w:bottom w:w="40" w:type="dxa"/>
-              <w:left w:w="120" w:type="dxa"/>
-            </w:tcMar>
-            <w:vAlign w:val="center"/>
-          </w:tcPr>
-          <w:p>
-            <w:pPr>
-              <w:jc w:val="right"/>
-              <w:bidi/>
-              <w:spacing w:before="0" w:after="0"/>
-            </w:pPr>
-            <w:r>
-              <w:rPr>
-                <w:rFonts w:ascii="Assistant" w:hAnsi="Assistant" w:cs="Assistant" w:eastAsia="Assistant"/>
-                <w:sz w:val="18"/>
-                <w:szCs w:val="18"/>
+            <w:tcW w:w="2520" w:type="dxa"/>
+            <w:tcMar>
+              <w:top w:w="20" w:type="dxa"/>
+              <w:right w:w="95" w:type="dxa"/>
+              <w:bottom w:w="20" w:type="dxa"/>
+              <w:left w:w="95" w:type="dxa"/>
+            </w:tcMar>
+            <w:vAlign w:val="center"/>
+          </w:tcPr>
+          <w:p>
+            <w:pPr>
+              <w:jc w:val="left"/>
+              <w:bidi/>
+              <w:spacing w:before="0" w:after="3"/>
+            </w:pPr>
+            <w:r>
+              <w:rPr>
+                <w:rFonts w:ascii="Assistant" w:hAnsi="Assistant" w:cs="Assistant" w:eastAsia="Assistant"/>
+                <w:sz w:val="14"/>
+                <w:szCs w:val="14"/>
                 <w:rtl/>
                 <w:b/>
                 <w:bCs/>
                 <w:color w:val="52525B"/>
               </w:rPr>
-              <w:t xml:space="preserve">סטטוס תשלום</w:t>
-            </w:r>
-          </w:p>
-        </w:tc>
-        <w:tc>
-          <w:tcPr>
-            <w:tcW w:w="1320" w:type="dxa"/>
-            <w:tcMar>
-              <w:top w:w="40" w:type="dxa"/>
-              <w:right w:w="120" w:type="dxa"/>
-              <w:bottom w:w="40" w:type="dxa"/>
-              <w:left w:w="120" w:type="dxa"/>
-            </w:tcMar>
-            <w:vAlign w:val="center"/>
-          </w:tcPr>
-          <w:p>
-            <w:pPr>
-              <w:jc w:val="right"/>
-              <w:bidi/>
-              <w:spacing w:before="0" w:after="0"/>
-            </w:pPr>
-            <w:r>
-              <w:rPr>
-                <w:rFonts w:ascii="Assistant" w:hAnsi="Assistant" w:cs="Assistant" w:eastAsia="Assistant"/>
-                <w:sz w:val="20"/>
-                <w:szCs w:val="20"/>
-                <w:rtl/>
-              </w:rPr>
-              <w:t>{balance_due}</w:t>
-            </w:r>
-          </w:p>
-        </w:tc>
-        <w:tc>
-          <w:tcPr>
-            <w:tcW w:w="1200" w:type="dxa"/>
-            <w:tcMar>
-              <w:top w:w="40" w:type="dxa"/>
-              <w:right w:w="120" w:type="dxa"/>
-              <w:bottom w:w="40" w:type="dxa"/>
-              <w:left w:w="120" w:type="dxa"/>
-            </w:tcMar>
-            <w:vAlign w:val="center"/>
-          </w:tcPr>
-          <w:p>
-            <w:pPr>
-              <w:jc w:val="right"/>
-              <w:bidi/>
-              <w:spacing w:before="0" w:after="0"/>
-            </w:pPr>
-            <w:r>
-              <w:rPr>
-                <w:rFonts w:ascii="Assistant" w:hAnsi="Assistant" w:cs="Assistant" w:eastAsia="Assistant"/>
-                <w:sz w:val="18"/>
-                <w:szCs w:val="18"/>
+              <w:t xml:space="preserve">סה"כ</w:t>
+            </w:r>
+          </w:p>
+          <w:p>
+            <w:pPr>
+              <w:jc w:val="left"/>
+              <w:bidi/>
+              <w:spacing w:before="0" w:after="0"/>
+            </w:pPr>
+            <w:r>
+              <w:rPr>
+                <w:rFonts w:ascii="Assistant" w:hAnsi="Assistant" w:cs="Assistant" w:eastAsia="Assistant"/>
+                <w:sz w:val="20"/>
+                <w:szCs w:val="20"/>
+                <w:rtl/>
+              </w:rPr>
+              <w:t>{total_price}</w:t>
+            </w:r>
+          </w:p>
+        </w:tc>
+        <w:tc>
+          <w:tcPr>
+            <w:tcW w:w="2520" w:type="dxa"/>
+            <w:tcMar>
+              <w:top w:w="20" w:type="dxa"/>
+              <w:right w:w="95" w:type="dxa"/>
+              <w:bottom w:w="20" w:type="dxa"/>
+              <w:left w:w="95" w:type="dxa"/>
+            </w:tcMar>
+            <w:vAlign w:val="center"/>
+          </w:tcPr>
+          <w:p>
+            <w:pPr>
+              <w:jc w:val="left"/>
+              <w:bidi/>
+              <w:spacing w:before="0" w:after="3"/>
+            </w:pPr>
+            <w:r>
+              <w:rPr>
+                <w:rFonts w:ascii="Assistant" w:hAnsi="Assistant" w:cs="Assistant" w:eastAsia="Assistant"/>
+                <w:sz w:val="14"/>
+                <w:szCs w:val="14"/>
                 <w:rtl/>
                 <w:b/>
                 <w:bCs/>
                 <w:color w:val="52525B"/>
               </w:rPr>
-              <w:t xml:space="preserve">יתרה</w:t>
-            </w:r>
-          </w:p>
-        </w:tc>
-        <w:tc>
-          <w:tcPr>
-            <w:tcW w:w="1320" w:type="dxa"/>
-            <w:tcMar>
-              <w:top w:w="40" w:type="dxa"/>
-              <w:right w:w="120" w:type="dxa"/>
-              <w:bottom w:w="40" w:type="dxa"/>
-              <w:left w:w="120" w:type="dxa"/>
-            </w:tcMar>
-            <w:vAlign w:val="center"/>
-          </w:tcPr>
-          <w:p>
-            <w:pPr>
-              <w:jc w:val="right"/>
+              <w:t xml:space="preserve">שולם</w:t>
+            </w:r>
+          </w:p>
+          <w:p>
+            <w:pPr>
+              <w:jc w:val="left"/>
               <w:bidi/>
               <w:spacing w:before="0" w:after="0"/>
             </w:pPr>
@@ -3192,91 +2905,95 @@
         </w:tc>
         <w:tc>
           <w:tcPr>
-            <w:tcW w:w="1200" w:type="dxa"/>
-            <w:tcMar>
-              <w:top w:w="40" w:type="dxa"/>
-              <w:right w:w="120" w:type="dxa"/>
-              <w:bottom w:w="40" w:type="dxa"/>
-              <w:left w:w="120" w:type="dxa"/>
-            </w:tcMar>
-            <w:vAlign w:val="center"/>
-          </w:tcPr>
-          <w:p>
-            <w:pPr>
-              <w:jc w:val="right"/>
-              <w:bidi/>
-              <w:spacing w:before="0" w:after="0"/>
-            </w:pPr>
-            <w:r>
-              <w:rPr>
-                <w:rFonts w:ascii="Assistant" w:hAnsi="Assistant" w:cs="Assistant" w:eastAsia="Assistant"/>
-                <w:sz w:val="18"/>
-                <w:szCs w:val="18"/>
+            <w:tcW w:w="2520" w:type="dxa"/>
+            <w:tcMar>
+              <w:top w:w="20" w:type="dxa"/>
+              <w:right w:w="95" w:type="dxa"/>
+              <w:bottom w:w="20" w:type="dxa"/>
+              <w:left w:w="95" w:type="dxa"/>
+            </w:tcMar>
+            <w:vAlign w:val="center"/>
+          </w:tcPr>
+          <w:p>
+            <w:pPr>
+              <w:jc w:val="left"/>
+              <w:bidi/>
+              <w:spacing w:before="0" w:after="3"/>
+            </w:pPr>
+            <w:r>
+              <w:rPr>
+                <w:rFonts w:ascii="Assistant" w:hAnsi="Assistant" w:cs="Assistant" w:eastAsia="Assistant"/>
+                <w:sz w:val="14"/>
+                <w:szCs w:val="14"/>
                 <w:rtl/>
                 <w:b/>
                 <w:bCs/>
                 <w:color w:val="52525B"/>
               </w:rPr>
-              <w:t xml:space="preserve">שולם</w:t>
-            </w:r>
-          </w:p>
-        </w:tc>
-        <w:tc>
-          <w:tcPr>
-            <w:tcW w:w="1320" w:type="dxa"/>
-            <w:tcMar>
-              <w:top w:w="40" w:type="dxa"/>
-              <w:right w:w="120" w:type="dxa"/>
-              <w:bottom w:w="40" w:type="dxa"/>
-              <w:left w:w="120" w:type="dxa"/>
-            </w:tcMar>
-            <w:vAlign w:val="center"/>
-          </w:tcPr>
-          <w:p>
-            <w:pPr>
-              <w:jc w:val="right"/>
-              <w:bidi/>
-              <w:spacing w:before="0" w:after="0"/>
-            </w:pPr>
-            <w:r>
-              <w:rPr>
-                <w:rFonts w:ascii="Assistant" w:hAnsi="Assistant" w:cs="Assistant" w:eastAsia="Assistant"/>
-                <w:sz w:val="20"/>
-                <w:szCs w:val="20"/>
-                <w:rtl/>
-              </w:rPr>
-              <w:t>{total_price}</w:t>
-            </w:r>
-          </w:p>
-        </w:tc>
-        <w:tc>
-          <w:tcPr>
-            <w:tcW w:w="1200" w:type="dxa"/>
-            <w:tcMar>
-              <w:top w:w="40" w:type="dxa"/>
-              <w:right w:w="120" w:type="dxa"/>
-              <w:bottom w:w="40" w:type="dxa"/>
-              <w:left w:w="120" w:type="dxa"/>
-            </w:tcMar>
-            <w:vAlign w:val="center"/>
-          </w:tcPr>
-          <w:p>
-            <w:pPr>
-              <w:jc w:val="right"/>
-              <w:bidi/>
-              <w:spacing w:before="0" w:after="0"/>
-            </w:pPr>
-            <w:r>
-              <w:rPr>
-                <w:rFonts w:ascii="Assistant" w:hAnsi="Assistant" w:cs="Assistant" w:eastAsia="Assistant"/>
-                <w:sz w:val="18"/>
-                <w:szCs w:val="18"/>
+              <w:t xml:space="preserve">יתרה</w:t>
+            </w:r>
+          </w:p>
+          <w:p>
+            <w:pPr>
+              <w:jc w:val="left"/>
+              <w:bidi/>
+              <w:spacing w:before="0" w:after="0"/>
+            </w:pPr>
+            <w:r>
+              <w:rPr>
+                <w:rFonts w:ascii="Assistant" w:hAnsi="Assistant" w:cs="Assistant" w:eastAsia="Assistant"/>
+                <w:sz w:val="20"/>
+                <w:szCs w:val="20"/>
+                <w:rtl/>
+              </w:rPr>
+              <w:t>{balance_due}</w:t>
+            </w:r>
+          </w:p>
+        </w:tc>
+        <w:tc>
+          <w:tcPr>
+            <w:tcW w:w="2520" w:type="dxa"/>
+            <w:tcMar>
+              <w:top w:w="20" w:type="dxa"/>
+              <w:right w:w="95" w:type="dxa"/>
+              <w:bottom w:w="20" w:type="dxa"/>
+              <w:left w:w="95" w:type="dxa"/>
+            </w:tcMar>
+            <w:vAlign w:val="center"/>
+          </w:tcPr>
+          <w:p>
+            <w:pPr>
+              <w:jc w:val="left"/>
+              <w:bidi/>
+              <w:spacing w:before="0" w:after="3"/>
+            </w:pPr>
+            <w:r>
+              <w:rPr>
+                <w:rFonts w:ascii="Assistant" w:hAnsi="Assistant" w:cs="Assistant" w:eastAsia="Assistant"/>
+                <w:sz w:val="14"/>
+                <w:szCs w:val="14"/>
                 <w:rtl/>
                 <w:b/>
                 <w:bCs/>
                 <w:color w:val="52525B"/>
               </w:rPr>
-              <w:t xml:space="preserve">סה"כ</w:t>
+              <w:t xml:space="preserve">סטטוס תשלום</w:t>
+            </w:r>
+          </w:p>
+          <w:p>
+            <w:pPr>
+              <w:jc w:val="left"/>
+              <w:bidi/>
+              <w:spacing w:before="0" w:after="0"/>
+            </w:pPr>
+            <w:r>
+              <w:rPr>
+                <w:rFonts w:ascii="Assistant" w:hAnsi="Assistant" w:cs="Assistant" w:eastAsia="Assistant"/>
+                <w:sz w:val="20"/>
+                <w:szCs w:val="20"/>
+                <w:rtl/>
+              </w:rPr>
+              <w:t>{payment_status}</w:t>
             </w:r>
           </w:p>
         </w:tc>
@@ -3285,28 +3002,8 @@
     <w:p>
       <w:pPr>
         <w:bidi/>
-        <w:spacing w:after="60"/>
+        <w:spacing w:after="20"/>
       </w:pPr>
-    </w:p>
-    <w:p>
-      <w:pPr>
-        <w:jc w:val="center"/>
-        <w:bidi/>
-        <w:spacing w:before="120" w:after="40"/>
-        <w:keepNext/>
-      </w:pPr>
-      <w:r>
-        <w:rPr>
-          <w:rFonts w:ascii="Assistant" w:hAnsi="Assistant" w:cs="Assistant" w:eastAsia="Assistant"/>
-          <w:sz w:val="20"/>
-          <w:szCs w:val="20"/>
-          <w:rtl/>
-          <w:b/>
-          <w:bCs/>
-          <w:color w:val="18181B"/>
-        </w:rPr>
-        <w:t xml:space="preserve">הערות</w:t>
-      </w:r>
     </w:p>
     <w:tbl>
       <w:tblPr>
@@ -3346,7 +3043,7 @@
           </w:tcPr>
           <w:p>
             <w:pPr>
-              <w:jc w:val="right"/>
+              <w:jc w:val="left"/>
               <w:bidi/>
               <w:spacing w:before="0" w:after="40"/>
               <w:keepNext/>
@@ -3366,7 +3063,7 @@
           </w:p>
           <w:p>
             <w:pPr>
-              <w:jc w:val="right"/>
+              <w:jc w:val="left"/>
               <w:bidi/>
               <w:spacing w:before="0" w:after="20"/>
             </w:pPr>
@@ -3394,7 +3091,7 @@
           </w:tcPr>
           <w:p>
             <w:pPr>
-              <w:jc w:val="right"/>
+              <w:jc w:val="left"/>
               <w:bidi/>
               <w:spacing w:before="0" w:after="40"/>
               <w:keepNext/>
@@ -3414,7 +3111,7 @@
           </w:p>
           <w:p>
             <w:pPr>
-              <w:jc w:val="right"/>
+              <w:jc w:val="left"/>
               <w:bidi/>
               <w:spacing w:before="0" w:after="20"/>
             </w:pPr>
@@ -3444,9 +3141,6 @@
 <w:endnotes xmlns:wpc="http://schemas.microsoft.com/office/word/2010/wordprocessingCanvas" xmlns:cx="http://schemas.microsoft.com/office/drawing/2014/chartex" xmlns:cx1="http://schemas.microsoft.com/office/drawing/2015/9/8/chartex" xmlns:cx2="http://schemas.microsoft.com/office/drawing/2015/10/21/chartex" xmlns:cx3="http://schemas.microsoft.com/office/drawing/2016/5/9/chartex" xmlns:cx4="http://schemas.microsoft.com/office/drawing/2016/5/10/chartex" xmlns:cx5="http://schemas.microsoft.com/office/drawing/2016/5/11/chartex" xmlns:cx6="http://schemas.microsoft.com/office/drawing/2016/5/12/chartex" xmlns:cx7="http://schemas.microsoft.com/office/drawing/2016/5/13/chartex" xmlns:cx8="http://schemas.microsoft.com/office/drawing/2016/5/14/chartex" xmlns:mc="http://schemas.openxmlformats.org/markup-compatibility/2006" xmlns:aink="http://schemas.microsoft.com/office/drawing/2016/ink" xmlns:am3d="http://schemas.microsoft.com/office/drawing/2017/model3d" xmlns:o="urn:schemas-microsoft-com:office:office" xmlns:oel="http://schemas.microsoft.com/office/2019/extlst" xmlns:r="http://schemas.openxmlformats.org/officeDocument/2006/relationships" xmlns:m="http://schemas.openxmlformats.org/officeDocument/2006/math" xmlns:v="urn:schemas-microsoft-com:vml" xmlns:wp14="http://schemas.microsoft.com/office/word/2010/wordprocessingDrawing" xmlns:wp="http://schemas.openxmlformats.org/drawingml/2006/wordprocessingDrawing" xmlns:w10="urn:schemas-microsoft-com:office:word" xmlns:w="http://schemas.openxmlformats.org/wordprocessingml/2006/main" xmlns:w14="http://schemas.microsoft.com/office/word/2010/wordml" xmlns:w15="http://schemas.microsoft.com/office/word/2012/wordml" xmlns:w16cex="http://schemas.microsoft.com/office/word/2018/wordml/cex" xmlns:w16cid="http://schemas.microsoft.com/office/word/2016/wordml/cid" xmlns:w16="http://schemas.microsoft.com/office/word/2018/wordml" xmlns:w16du="http://schemas.microsoft.com/office/word/2023/wordml/word16du" xmlns:w16sdtdh="http://schemas.microsoft.com/office/word/2020/wordml/sdtdatahash" xmlns:w16sdtfl="http://schemas.microsoft.com/office/word/2024/wordml/sdtformatlock" xmlns:w16se="http://schemas.microsoft.com/office/word/2015/wordml/symex" xmlns:wpg="http://schemas.microsoft.com/office/word/2010/wordprocessingGroup" xmlns:wpi="http://schemas.microsoft.com/office/word/2010/wordprocessingInk" xmlns:wne="http://schemas.microsoft.com/office/word/2006/wordml" xmlns:wps="http://schemas.microsoft.com/office/word/2010/wordprocessingShape" mc:Ignorable="w14 w15 w16se w16cid w16 w16cex w16sdtdh w16sdtfl w16du wp14">
   <w:endnote w:type="separator" w:id="-1">
     <w:p>
-      <w:pPr>
-        <w:spacing w:after="0" w:line="240" w:lineRule="auto"/>
-      </w:pPr>
       <w:r>
         <w:separator/>
       </w:r>
@@ -3454,9 +3148,6 @@
   </w:endnote>
   <w:endnote w:type="continuationSeparator" w:id="0">
     <w:p>
-      <w:pPr>
-        <w:spacing w:after="0" w:line="240" w:lineRule="auto"/>
-      </w:pPr>
       <w:r>
         <w:continuationSeparator/>
       </w:r>
@@ -3469,9 +3160,6 @@
 <w:footnotes xmlns:wpc="http://schemas.microsoft.com/office/word/2010/wordprocessingCanvas" xmlns:cx="http://schemas.microsoft.com/office/drawing/2014/chartex" xmlns:cx1="http://schemas.microsoft.com/office/drawing/2015/9/8/chartex" xmlns:cx2="http://schemas.microsoft.com/office/drawing/2015/10/21/chartex" xmlns:cx3="http://schemas.microsoft.com/office/drawing/2016/5/9/chartex" xmlns:cx4="http://schemas.microsoft.com/office/drawing/2016/5/10/chartex" xmlns:cx5="http://schemas.microsoft.com/office/drawing/2016/5/11/chartex" xmlns:cx6="http://schemas.microsoft.com/office/drawing/2016/5/12/chartex" xmlns:cx7="http://schemas.microsoft.com/office/drawing/2016/5/13/chartex" xmlns:cx8="http://schemas.microsoft.com/office/drawing/2016/5/14/chartex" xmlns:mc="http://schemas.openxmlformats.org/markup-compatibility/2006" xmlns:aink="http://schemas.microsoft.com/office/drawing/2016/ink" xmlns:am3d="http://schemas.microsoft.com/office/drawing/2017/model3d" xmlns:o="urn:schemas-microsoft-com:office:office" xmlns:oel="http://schemas.microsoft.com/office/2019/extlst" xmlns:r="http://schemas.openxmlformats.org/officeDocument/2006/relationships" xmlns:m="http://schemas.openxmlformats.org/officeDocument/2006/math" xmlns:v="urn:schemas-microsoft-com:vml" xmlns:wp14="http://schemas.microsoft.com/office/word/2010/wordprocessingDrawing" xmlns:wp="http://schemas.openxmlformats.org/drawingml/2006/wordprocessingDrawing" xmlns:w10="urn:schemas-microsoft-com:office:word" xmlns:w="http://schemas.openxmlformats.org/wordprocessingml/2006/main" xmlns:w14="http://schemas.microsoft.com/office/word/2010/wordml" xmlns:w15="http://schemas.microsoft.com/office/word/2012/wordml" xmlns:w16cex="http://schemas.microsoft.com/office/word/2018/wordml/cex" xmlns:w16cid="http://schemas.microsoft.com/office/word/2016/wordml/cid" xmlns:w16="http://schemas.microsoft.com/office/word/2018/wordml" xmlns:w16du="http://schemas.microsoft.com/office/word/2023/wordml/word16du" xmlns:w16sdtdh="http://schemas.microsoft.com/office/word/2020/wordml/sdtdatahash" xmlns:w16sdtfl="http://schemas.microsoft.com/office/word/2024/wordml/sdtformatlock" xmlns:w16se="http://schemas.microsoft.com/office/word/2015/wordml/symex" xmlns:wpg="http://schemas.microsoft.com/office/word/2010/wordprocessingGroup" xmlns:wpi="http://schemas.microsoft.com/office/word/2010/wordprocessingInk" xmlns:wne="http://schemas.microsoft.com/office/word/2006/wordml" xmlns:wps="http://schemas.microsoft.com/office/word/2010/wordprocessingShape" mc:Ignorable="w14 w15 w16se w16cid w16 w16cex w16sdtdh w16sdtfl w16du wp14">
   <w:footnote w:type="separator" w:id="-1">
     <w:p>
-      <w:pPr>
-        <w:spacing w:after="0" w:line="240" w:lineRule="auto"/>
-      </w:pPr>
       <w:r>
         <w:separator/>
       </w:r>
@@ -3479,9 +3167,6 @@
   </w:footnote>
   <w:footnote w:type="continuationSeparator" w:id="0">
     <w:p>
-      <w:pPr>
-        <w:spacing w:after="0" w:line="240" w:lineRule="auto"/>
-      </w:pPr>
       <w:r>
         <w:continuationSeparator/>
       </w:r>
@@ -3495,6 +3180,9 @@
   <w:p>
     <w:pPr>
       <w:pStyle w:val="af"/>
+      <w:rPr>
+        <w:u w:val="single"/>
+      </w:rPr>
     </w:pPr>
     <w:r>
       <w:rPr>
@@ -3502,26 +3190,78 @@
         <w:u w:val="single"/>
         <w:rtl/>
       </w:rPr>
-      <w:t>עדשות מגע</w:t>
+      <w:t>הזמנת</w:t>
+    </w:r>
+    <w:r>
+      <w:rPr>
+        <w:rFonts w:hint="cs"/>
+        <w:u w:val="single"/>
+        <w:rtl/>
+      </w:rPr>
+      <w:t xml:space="preserve"> משקפיים</w:t>
     </w:r>
     <w:r>
       <w:rPr>
         <w:rFonts w:hint="cs"/>
         <w:rtl/>
       </w:rPr>
-      <w:t xml:space="preserve">                                                                                          </w:t>
+      <w:t xml:space="preserve">    </w:t>
+    </w:r>
+    <w:r>
+      <w:rPr>
+        <w:rFonts w:hint="cs"/>
+        <w:rtl/>
+      </w:rPr>
+      <w:t xml:space="preserve">             </w:t>
+    </w:r>
+    <w:r>
+      <w:rPr>
+        <w:rFonts w:hint="cs"/>
+        <w:rtl/>
+      </w:rPr>
+      <w:t xml:space="preserve">  </w:t>
+    </w:r>
+    <w:r>
+      <w:rPr>
+        <w:rFonts w:hint="cs"/>
+        <w:rtl/>
+      </w:rPr>
+      <w:t xml:space="preserve">                                       </w:t>
+    </w:r>
+    <w:r>
+      <w:rPr>
+        <w:rFonts w:hint="cs"/>
+        <w:rtl/>
+      </w:rPr>
+      <w:t xml:space="preserve"> </w:t>
+    </w:r>
+    <w:r>
+      <w:rPr>
+        <w:rFonts w:hint="cs"/>
+        <w:rtl/>
+      </w:rPr>
+      <w:t xml:space="preserve">  </w:t>
+    </w:r>
+    <w:r>
+      <w:rPr>
+        <w:rFonts w:hint="cs"/>
+        <w:u w:val="single"/>
+        <w:rtl/>
+      </w:rPr>
+      <w:t>תאריך הדפסה -</w:t>
     </w:r>
     <w:sdt>
       <w:sdtPr>
         <w:rPr>
+          <w:rFonts w:hint="cs"/>
           <w:u w:val="single"/>
           <w:rtl/>
         </w:rPr>
-        <w:id w:val="1595662822"/>
+        <w:id w:val="-1352173681"/>
         <w:placeholder>
           <w:docPart w:val="DefaultPlaceholder_-1854013437"/>
         </w:placeholder>
-        <w:date w:fullDate="2025-10-15T00:00:00Z">
+        <w:date w:fullDate="2025-10-19T00:00:00Z">
           <w:dateFormat w:val="dd/MM/yyyy"/>
           <w:lid w:val="he-IL"/>
           <w:storeMappedDataAs w:val="dateTime"/>
@@ -3535,7 +3275,7 @@
             <w:u w:val="single"/>
             <w:rtl/>
           </w:rPr>
-          <w:t>‏15/10/2025</w:t>
+          <w:t>‏19/10/2025</w:t>
         </w:r>
       </w:sdtContent>
     </w:sdt>
@@ -3556,11 +3296,7 @@
         <w14:ligatures w14:val="standardContextual"/>
       </w:rPr>
     </w:rPrDefault>
-    <w:pPrDefault>
-      <w:pPr>
-        <w:spacing w:after="160" w:line="278" w:lineRule="auto"/>
-      </w:pPr>
-    </w:pPrDefault>
+    <w:pPrDefault/>
   </w:docDefaults>
   <w:latentStyles w:defLockedState="0" w:defUIPriority="99" w:defSemiHidden="0" w:defUnhideWhenUsed="0" w:defQFormat="0" w:count="376">
     <w:lsdException w:name="Normal" w:uiPriority="0" w:qFormat="1"/>
@@ -3943,7 +3679,7 @@
   <w:style w:type="paragraph" w:default="1" w:styleId="a">
     <w:name w:val="Normal"/>
     <w:qFormat/>
-    <w:rsid w:val="007818C0"/>
+    <w:rsid w:val="00170623"/>
     <w:pPr>
       <w:bidi/>
     </w:pPr>
@@ -3955,7 +3691,7 @@
     <w:link w:val="10"/>
     <w:uiPriority w:val="9"/>
     <w:qFormat/>
-    <w:rsid w:val="00692306"/>
+    <w:rsid w:val="00FD1A07"/>
     <w:pPr>
       <w:keepNext/>
       <w:keepLines/>
@@ -3978,7 +3714,7 @@
     <w:semiHidden/>
     <w:unhideWhenUsed/>
     <w:qFormat/>
-    <w:rsid w:val="00692306"/>
+    <w:rsid w:val="00FD1A07"/>
     <w:pPr>
       <w:keepNext/>
       <w:keepLines/>
@@ -4001,7 +3737,7 @@
     <w:semiHidden/>
     <w:unhideWhenUsed/>
     <w:qFormat/>
-    <w:rsid w:val="00692306"/>
+    <w:rsid w:val="00FD1A07"/>
     <w:pPr>
       <w:keepNext/>
       <w:keepLines/>
@@ -4024,7 +3760,7 @@
     <w:semiHidden/>
     <w:unhideWhenUsed/>
     <w:qFormat/>
-    <w:rsid w:val="00692306"/>
+    <w:rsid w:val="00FD1A07"/>
     <w:pPr>
       <w:keepNext/>
       <w:keepLines/>
@@ -4047,7 +3783,7 @@
     <w:semiHidden/>
     <w:unhideWhenUsed/>
     <w:qFormat/>
-    <w:rsid w:val="00692306"/>
+    <w:rsid w:val="00FD1A07"/>
     <w:pPr>
       <w:keepNext/>
       <w:keepLines/>
@@ -4068,11 +3804,11 @@
     <w:semiHidden/>
     <w:unhideWhenUsed/>
     <w:qFormat/>
-    <w:rsid w:val="00692306"/>
+    <w:rsid w:val="00FD1A07"/>
     <w:pPr>
       <w:keepNext/>
       <w:keepLines/>
-      <w:spacing w:before="40" w:after="0"/>
+      <w:spacing w:before="40"/>
       <w:outlineLvl w:val="5"/>
     </w:pPr>
     <w:rPr>
@@ -4091,11 +3827,11 @@
     <w:semiHidden/>
     <w:unhideWhenUsed/>
     <w:qFormat/>
-    <w:rsid w:val="00692306"/>
+    <w:rsid w:val="00FD1A07"/>
     <w:pPr>
       <w:keepNext/>
       <w:keepLines/>
-      <w:spacing w:before="40" w:after="0"/>
+      <w:spacing w:before="40"/>
       <w:outlineLvl w:val="6"/>
     </w:pPr>
     <w:rPr>
@@ -4112,11 +3848,10 @@
     <w:semiHidden/>
     <w:unhideWhenUsed/>
     <w:qFormat/>
-    <w:rsid w:val="00692306"/>
+    <w:rsid w:val="00FD1A07"/>
     <w:pPr>
       <w:keepNext/>
       <w:keepLines/>
-      <w:spacing w:after="0"/>
       <w:outlineLvl w:val="7"/>
     </w:pPr>
     <w:rPr>
@@ -4135,11 +3870,10 @@
     <w:semiHidden/>
     <w:unhideWhenUsed/>
     <w:qFormat/>
-    <w:rsid w:val="00692306"/>
+    <w:rsid w:val="00FD1A07"/>
     <w:pPr>
       <w:keepNext/>
       <w:keepLines/>
-      <w:spacing w:after="0"/>
       <w:outlineLvl w:val="8"/>
     </w:pPr>
     <w:rPr>
@@ -4179,7 +3913,7 @@
     <w:basedOn w:val="a0"/>
     <w:link w:val="1"/>
     <w:uiPriority w:val="9"/>
-    <w:rsid w:val="00692306"/>
+    <w:rsid w:val="00FD1A07"/>
     <w:rPr>
       <w:rFonts w:asciiTheme="majorHAnsi" w:eastAsiaTheme="majorEastAsia" w:hAnsiTheme="majorHAnsi" w:cstheme="majorBidi"/>
       <w:color w:val="2F5496" w:themeColor="accent1" w:themeShade="BF"/>
@@ -4193,7 +3927,7 @@
     <w:link w:val="2"/>
     <w:uiPriority w:val="9"/>
     <w:semiHidden/>
-    <w:rsid w:val="00692306"/>
+    <w:rsid w:val="00FD1A07"/>
     <w:rPr>
       <w:rFonts w:asciiTheme="majorHAnsi" w:eastAsiaTheme="majorEastAsia" w:hAnsiTheme="majorHAnsi" w:cstheme="majorBidi"/>
       <w:color w:val="2F5496" w:themeColor="accent1" w:themeShade="BF"/>
@@ -4207,7 +3941,7 @@
     <w:link w:val="3"/>
     <w:uiPriority w:val="9"/>
     <w:semiHidden/>
-    <w:rsid w:val="00692306"/>
+    <w:rsid w:val="00FD1A07"/>
     <w:rPr>
       <w:rFonts w:eastAsiaTheme="majorEastAsia" w:cstheme="majorBidi"/>
       <w:color w:val="2F5496" w:themeColor="accent1" w:themeShade="BF"/>
@@ -4221,7 +3955,7 @@
     <w:link w:val="4"/>
     <w:uiPriority w:val="9"/>
     <w:semiHidden/>
-    <w:rsid w:val="00692306"/>
+    <w:rsid w:val="00FD1A07"/>
     <w:rPr>
       <w:rFonts w:eastAsiaTheme="majorEastAsia" w:cstheme="majorBidi"/>
       <w:i/>
@@ -4235,7 +3969,7 @@
     <w:link w:val="5"/>
     <w:uiPriority w:val="9"/>
     <w:semiHidden/>
-    <w:rsid w:val="00692306"/>
+    <w:rsid w:val="00FD1A07"/>
     <w:rPr>
       <w:rFonts w:eastAsiaTheme="majorEastAsia" w:cstheme="majorBidi"/>
       <w:color w:val="2F5496" w:themeColor="accent1" w:themeShade="BF"/>
@@ -4247,7 +3981,7 @@
     <w:link w:val="6"/>
     <w:uiPriority w:val="9"/>
     <w:semiHidden/>
-    <w:rsid w:val="00692306"/>
+    <w:rsid w:val="00FD1A07"/>
     <w:rPr>
       <w:rFonts w:eastAsiaTheme="majorEastAsia" w:cstheme="majorBidi"/>
       <w:i/>
@@ -4261,7 +3995,7 @@
     <w:link w:val="7"/>
     <w:uiPriority w:val="9"/>
     <w:semiHidden/>
-    <w:rsid w:val="00692306"/>
+    <w:rsid w:val="00FD1A07"/>
     <w:rPr>
       <w:rFonts w:eastAsiaTheme="majorEastAsia" w:cstheme="majorBidi"/>
       <w:color w:val="595959" w:themeColor="text1" w:themeTint="A6"/>
@@ -4273,7 +4007,7 @@
     <w:link w:val="8"/>
     <w:uiPriority w:val="9"/>
     <w:semiHidden/>
-    <w:rsid w:val="00692306"/>
+    <w:rsid w:val="00FD1A07"/>
     <w:rPr>
       <w:rFonts w:eastAsiaTheme="majorEastAsia" w:cstheme="majorBidi"/>
       <w:i/>
@@ -4287,7 +4021,7 @@
     <w:link w:val="9"/>
     <w:uiPriority w:val="9"/>
     <w:semiHidden/>
-    <w:rsid w:val="00692306"/>
+    <w:rsid w:val="00FD1A07"/>
     <w:rPr>
       <w:rFonts w:eastAsiaTheme="majorEastAsia" w:cstheme="majorBidi"/>
       <w:color w:val="272727" w:themeColor="text1" w:themeTint="D8"/>
@@ -4300,9 +4034,9 @@
     <w:link w:val="a4"/>
     <w:uiPriority w:val="10"/>
     <w:qFormat/>
-    <w:rsid w:val="00692306"/>
+    <w:rsid w:val="00FD1A07"/>
     <w:pPr>
-      <w:spacing w:after="80" w:line="240" w:lineRule="auto"/>
+      <w:spacing w:after="80"/>
       <w:contextualSpacing/>
     </w:pPr>
     <w:rPr>
@@ -4318,7 +4052,7 @@
     <w:basedOn w:val="a0"/>
     <w:link w:val="a3"/>
     <w:uiPriority w:val="10"/>
-    <w:rsid w:val="00692306"/>
+    <w:rsid w:val="00FD1A07"/>
     <w:rPr>
       <w:rFonts w:asciiTheme="majorHAnsi" w:eastAsiaTheme="majorEastAsia" w:hAnsiTheme="majorHAnsi" w:cstheme="majorBidi"/>
       <w:spacing w:val="-10"/>
@@ -4334,7 +4068,7 @@
     <w:link w:val="a6"/>
     <w:uiPriority w:val="11"/>
     <w:qFormat/>
-    <w:rsid w:val="00692306"/>
+    <w:rsid w:val="00FD1A07"/>
     <w:pPr>
       <w:numPr>
         <w:ilvl w:val="1"/>
@@ -4353,7 +4087,7 @@
     <w:basedOn w:val="a0"/>
     <w:link w:val="a5"/>
     <w:uiPriority w:val="11"/>
-    <w:rsid w:val="00692306"/>
+    <w:rsid w:val="00FD1A07"/>
     <w:rPr>
       <w:rFonts w:eastAsiaTheme="majorEastAsia" w:cstheme="majorBidi"/>
       <w:color w:val="595959" w:themeColor="text1" w:themeTint="A6"/>
@@ -4369,7 +4103,7 @@
     <w:link w:val="a8"/>
     <w:uiPriority w:val="29"/>
     <w:qFormat/>
-    <w:rsid w:val="00692306"/>
+    <w:rsid w:val="00FD1A07"/>
     <w:pPr>
       <w:spacing w:before="160"/>
       <w:jc w:val="center"/>
@@ -4385,7 +4119,7 @@
     <w:basedOn w:val="a0"/>
     <w:link w:val="a7"/>
     <w:uiPriority w:val="29"/>
-    <w:rsid w:val="00692306"/>
+    <w:rsid w:val="00FD1A07"/>
     <w:rPr>
       <w:i/>
       <w:iCs/>
@@ -4397,7 +4131,7 @@
     <w:basedOn w:val="a"/>
     <w:uiPriority w:val="34"/>
     <w:qFormat/>
-    <w:rsid w:val="00692306"/>
+    <w:rsid w:val="00FD1A07"/>
     <w:pPr>
       <w:ind w:left="720"/>
       <w:contextualSpacing/>
@@ -4408,7 +4142,7 @@
     <w:basedOn w:val="a0"/>
     <w:uiPriority w:val="21"/>
     <w:qFormat/>
-    <w:rsid w:val="00692306"/>
+    <w:rsid w:val="00FD1A07"/>
     <w:rPr>
       <w:i/>
       <w:iCs/>
@@ -4422,7 +4156,7 @@
     <w:link w:val="ac"/>
     <w:uiPriority w:val="30"/>
     <w:qFormat/>
-    <w:rsid w:val="00692306"/>
+    <w:rsid w:val="00FD1A07"/>
     <w:pPr>
       <w:pBdr>
         <w:top w:val="single" w:sz="4" w:space="10" w:color="2F5496" w:themeColor="accent1" w:themeShade="BF"/>
@@ -4443,7 +4177,7 @@
     <w:basedOn w:val="a0"/>
     <w:link w:val="ab"/>
     <w:uiPriority w:val="30"/>
-    <w:rsid w:val="00692306"/>
+    <w:rsid w:val="00FD1A07"/>
     <w:rPr>
       <w:i/>
       <w:iCs/>
@@ -4455,7 +4189,7 @@
     <w:basedOn w:val="a0"/>
     <w:uiPriority w:val="32"/>
     <w:qFormat/>
-    <w:rsid w:val="00692306"/>
+    <w:rsid w:val="00FD1A07"/>
     <w:rPr>
       <w:b/>
       <w:bCs/>
@@ -4468,10 +4202,7 @@
     <w:name w:val="Table Grid"/>
     <w:basedOn w:val="a1"/>
     <w:uiPriority w:val="39"/>
-    <w:rsid w:val="00F2509A"/>
-    <w:pPr>
-      <w:spacing w:after="0" w:line="240" w:lineRule="auto"/>
-    </w:pPr>
+    <w:rsid w:val="00FD1A07"/>
     <w:tblPr>
       <w:tblBorders>
         <w:top w:val="single" w:sz="4" w:space="0" w:color="auto"/>
@@ -4489,13 +4220,12 @@
     <w:link w:val="af0"/>
     <w:uiPriority w:val="99"/>
     <w:unhideWhenUsed/>
-    <w:rsid w:val="00070E25"/>
+    <w:rsid w:val="00FD1A07"/>
     <w:pPr>
       <w:tabs>
         <w:tab w:val="center" w:pos="4153"/>
         <w:tab w:val="right" w:pos="8306"/>
       </w:tabs>
-      <w:spacing w:after="0" w:line="240" w:lineRule="auto"/>
     </w:pPr>
   </w:style>
   <w:style w:type="character" w:customStyle="1" w:styleId="af0">
@@ -4503,7 +4233,7 @@
     <w:basedOn w:val="a0"/>
     <w:link w:val="af"/>
     <w:uiPriority w:val="99"/>
-    <w:rsid w:val="00070E25"/>
+    <w:rsid w:val="00FD1A07"/>
   </w:style>
   <w:style w:type="paragraph" w:styleId="af1">
     <w:name w:val="footer"/>
@@ -4511,13 +4241,12 @@
     <w:link w:val="af2"/>
     <w:uiPriority w:val="99"/>
     <w:unhideWhenUsed/>
-    <w:rsid w:val="00070E25"/>
+    <w:rsid w:val="00FD1A07"/>
     <w:pPr>
       <w:tabs>
         <w:tab w:val="center" w:pos="4153"/>
         <w:tab w:val="right" w:pos="8306"/>
       </w:tabs>
-      <w:spacing w:after="0" w:line="240" w:lineRule="auto"/>
     </w:pPr>
   </w:style>
   <w:style w:type="character" w:customStyle="1" w:styleId="af2">
@@ -4525,14 +4254,14 @@
     <w:basedOn w:val="a0"/>
     <w:link w:val="af1"/>
     <w:uiPriority w:val="99"/>
-    <w:rsid w:val="00070E25"/>
+    <w:rsid w:val="00FD1A07"/>
   </w:style>
   <w:style w:type="character" w:styleId="af3">
     <w:name w:val="Placeholder Text"/>
     <w:basedOn w:val="a0"/>
     <w:uiPriority w:val="99"/>
     <w:semiHidden/>
-    <w:rsid w:val="00070E25"/>
+    <w:rsid w:val="00512310"/>
     <w:rPr>
       <w:color w:val="666666"/>
     </w:rPr>
@@ -4556,7 +4285,7 @@
         <w:behaviors>
           <w:behavior w:val="content"/>
         </w:behaviors>
-        <w:guid w:val="{A2289995-A9ED-4DFE-AD2A-76C80672A25B}"/>
+        <w:guid w:val="{60ADCBBA-EDBE-4D9D-89BF-72B2FDE47117}"/>
       </w:docPartPr>
       <w:docPartBody>
         <w:p>
@@ -4628,13 +4357,44 @@
     <w:compatSetting w:name="useWord2013TrackBottomHyphenation" w:uri="http://schemas.microsoft.com/office/word" w:val="0"/>
   </w:compat>
   <w:rsids>
-    <w:rsidRoot w:val="00261361"/>
-    <w:rsid w:val="00261361"/>
-    <w:rsid w:val="0056027D"/>
-    <w:rsid w:val="00A45037"/>
-    <w:rsid w:val="00CF49B6"/>
-    <w:rsid w:val="00E713B0"/>
-    <w:rsid w:val="00EF5918"/>
+    <w:rsidRoot w:val="009E25D0"/>
+    <w:rsid w:val="00052412"/>
+    <w:rsid w:val="000E4E05"/>
+    <w:rsid w:val="00125D35"/>
+    <w:rsid w:val="001A2895"/>
+    <w:rsid w:val="001B5115"/>
+    <w:rsid w:val="002109CE"/>
+    <w:rsid w:val="0024678E"/>
+    <w:rsid w:val="002B5A93"/>
+    <w:rsid w:val="00301C8B"/>
+    <w:rsid w:val="00306F88"/>
+    <w:rsid w:val="00441E13"/>
+    <w:rsid w:val="0054039A"/>
+    <w:rsid w:val="00546179"/>
+    <w:rsid w:val="005872D8"/>
+    <w:rsid w:val="005C0983"/>
+    <w:rsid w:val="006002B7"/>
+    <w:rsid w:val="00652305"/>
+    <w:rsid w:val="007C387A"/>
+    <w:rsid w:val="007F15E4"/>
+    <w:rsid w:val="008A09A8"/>
+    <w:rsid w:val="00926EA2"/>
+    <w:rsid w:val="009411F3"/>
+    <w:rsid w:val="00992ABF"/>
+    <w:rsid w:val="009950CC"/>
+    <w:rsid w:val="009E25D0"/>
+    <w:rsid w:val="009F13BC"/>
+    <w:rsid w:val="00A660DD"/>
+    <w:rsid w:val="00B3343A"/>
+    <w:rsid w:val="00CC7CC4"/>
+    <w:rsid w:val="00D02881"/>
+    <w:rsid w:val="00D06B61"/>
+    <w:rsid w:val="00D23BB8"/>
+    <w:rsid w:val="00D44751"/>
+    <w:rsid w:val="00D911FD"/>
+    <w:rsid w:val="00FD0AEE"/>
+    <w:rsid w:val="00FD62A4"/>
+    <w:rsid w:val="00FF2713"/>
   </w:rsids>
   <m:mathPr>
     <m:mathFont m:val="Cambria Math"/>
@@ -5093,7 +4853,7 @@
     <w:basedOn w:val="a0"/>
     <w:uiPriority w:val="99"/>
     <w:semiHidden/>
-    <w:rsid w:val="00261361"/>
+    <w:rsid w:val="002B5A93"/>
     <w:rPr>
       <w:color w:val="666666"/>
     </w:rPr>
@@ -5401,4 +5161,16 @@
     </a:ext>
   </a:extLst>
 </a:theme>
+</file>
+
+<file path=customXml/item1.xml><?xml version="1.0" encoding="utf-8"?>
+<b:Sources xmlns:b="http://schemas.openxmlformats.org/officeDocument/2006/bibliography" xmlns="http://schemas.openxmlformats.org/officeDocument/2006/bibliography" SelectedStyle="\APASixthEditionOfficeOnline.xsl" StyleName="APA" Version="6"/>
+</file>
+
+<file path=customXml/itemProps1.xml><?xml version="1.0" encoding="utf-8"?>
+<ds:datastoreItem xmlns:ds="http://schemas.openxmlformats.org/officeDocument/2006/customXml" ds:itemID="{8E1FA64B-79AB-4B33-90B9-D6BC249C4B03}">
+  <ds:schemaRefs>
+    <ds:schemaRef ds:uri="http://schemas.openxmlformats.org/officeDocument/2006/bibliography"/>
+  </ds:schemaRefs>
+</ds:datastoreItem>
 </file>
</xml_diff>